<commit_message>
update the reference docx with all new worldbuilding content
Append sections for Race Types, Innate Abilities, the Six Pillars of
Angels, the Demon Generals, Evolution, additional Rules & Notes, and new
characters/places (Kael von Ashen, Elyndor Academy, Carin, Wener Leger).
</commit_message>
<xml_diff>
--- a/Half_made world ideas.docx
+++ b/Half_made world ideas.docx
@@ -31793,6 +31793,709 @@
       </w:r>
       <w:r>
         <w:t xml:space="preserve"> They were expecting a child but unexpectedly the were called back by their rulers but as </w:t>
+      </w:r>
+    </w:p>
+    <w:p>
+      <w:pPr>
+        <w:pStyle w:val="Heading1"/>
+      </w:pPr>
+      <w:r>
+        <w:t>Race Types</w:t>
+      </w:r>
+    </w:p>
+    <w:p>
+      <w:r>
+        <w:t>Beyond their rank, every angel and demon belongs to a race type — a kind of being, not a position. Race type and rank are independent.</w:t>
+      </w:r>
+    </w:p>
+    <w:p>
+      <w:pPr>
+        <w:pStyle w:val="Heading2"/>
+      </w:pPr>
+      <w:r>
+        <w:t>Cherubim</w:t>
+      </w:r>
+    </w:p>
+    <w:p>
+      <w:r>
+        <w:t>The throne-guardians — the apex angels</w:t>
+      </w:r>
+    </w:p>
+    <w:p>
+      <w:r>
+        <w:t>The highest type of angel, the guardians of the throne. The Serapharch — the ruler of the Angel Realm — is of this type. They are essentially immortal and can only be killed by a Divine Weapon or a Corrupted Divine Weapon (Vireth, the Fallen Grace).</w:t>
+      </w:r>
+    </w:p>
+    <w:p>
+      <w:r>
+        <w:t>Innate Ability: Imperishable</w:t>
+      </w:r>
+    </w:p>
+    <w:p>
+      <w:pPr>
+        <w:pStyle w:val="Heading2"/>
+      </w:pPr>
+      <w:r>
+        <w:t>Malakhim</w:t>
+      </w:r>
+    </w:p>
+    <w:p>
+      <w:r>
+        <w:t>The messenger host — the common true angels</w:t>
+      </w:r>
+    </w:p>
+    <w:p>
+      <w:r>
+        <w:t>The common type of true angel, the faithful host who take the Veyn Vow. The Aetherblade Lord Angels, Virtues, and Lumen all belong to this type.</w:t>
+      </w:r>
+    </w:p>
+    <w:p>
+      <w:r>
+        <w:t>Innate Ability: Veyn-Regen</w:t>
+      </w:r>
+    </w:p>
+    <w:p>
+      <w:pPr>
+        <w:pStyle w:val="Heading2"/>
+      </w:pPr>
+      <w:r>
+        <w:t>Fallen Angels</w:t>
+      </w:r>
+    </w:p>
+    <w:p>
+      <w:r>
+        <w:t>The broken — cast out for breaking the vow</w:t>
+      </w:r>
+    </w:p>
+    <w:p>
+      <w:r>
+        <w:t>The type of angel who broke the Veyn Vow and was cast out of the Angel Realm. They keep their wings and power but can never take another vow, leaving their connection to Veyn unstable and unregulated.</w:t>
+      </w:r>
+    </w:p>
+    <w:p>
+      <w:r>
+        <w:t>Innate Ability: Rapid-Mend</w:t>
+      </w:r>
+    </w:p>
+    <w:p>
+      <w:pPr>
+        <w:pStyle w:val="Heading2"/>
+      </w:pPr>
+      <w:r>
+        <w:t>Fiends</w:t>
+      </w:r>
+    </w:p>
+    <w:p>
+      <w:r>
+        <w:t>The apex demons</w:t>
+      </w:r>
+    </w:p>
+    <w:p>
+      <w:r>
+        <w:t>The highest type of demon, the rulers of the Demon Realm. The Mordrach are of this type — they cannot be killed by regular or holy weapons, only by a Divine Weapon.</w:t>
+      </w:r>
+    </w:p>
+    <w:p>
+      <w:r>
+        <w:t>Innate Ability: Sovereign Resilience</w:t>
+      </w:r>
+    </w:p>
+    <w:p>
+      <w:pPr>
+        <w:pStyle w:val="Heading2"/>
+      </w:pPr>
+      <w:r>
+        <w:t>Dregs</w:t>
+      </w:r>
+    </w:p>
+    <w:p>
+      <w:r>
+        <w:t>The common demons</w:t>
+      </w:r>
+    </w:p>
+    <w:p>
+      <w:r>
+        <w:t>The common type of demon, the rank-and-file of the Demon Realm. The Bloodward, Scourge, and Gnash all belong to this type.</w:t>
+      </w:r>
+    </w:p>
+    <w:p>
+      <w:r>
+        <w:t>Innate Ability: Vitality-Regen</w:t>
+      </w:r>
+    </w:p>
+    <w:p>
+      <w:pPr>
+        <w:pStyle w:val="Heading2"/>
+      </w:pPr>
+      <w:r>
+        <w:t>Imps</w:t>
+      </w:r>
+    </w:p>
+    <w:p>
+      <w:r>
+        <w:t>The impish demons</w:t>
+      </w:r>
+    </w:p>
+    <w:p>
+      <w:r>
+        <w:t>A demon type set apart from the ordinary Dregs — the impish few, including Lisa and Kael Vornath the Jester demon, and the MC’s demon half.</w:t>
+      </w:r>
+    </w:p>
+    <w:p>
+      <w:r>
+        <w:t>Innate Ability: Veyn-Touch</w:t>
+      </w:r>
+    </w:p>
+    <w:p>
+      <w:pPr>
+        <w:pStyle w:val="Heading2"/>
+      </w:pPr>
+      <w:r>
+        <w:t>Vael</w:t>
+      </w:r>
+    </w:p>
+    <w:p>
+      <w:r>
+        <w:t>The extinct realm-makers</w:t>
+      </w:r>
+    </w:p>
+    <w:p>
+      <w:r>
+        <w:t>An extinct race, wiped out by the former ruler of the Human Realm, forcing the survivors to flee by tearing open the Hidden Realm as a hiding place — an act so violent it nearly destroyed the world outright. Escaping the ruler didn’t save them: once inside, the realm’s own creatures began forming almost immediately, and the Vael had no way to survive against them. Nearly the entire race died out inside the very refuge they built, save for one survivor — the Headmaster of the Academy — who alone learned to endure it and later became the only person to ever successfully brew the Ethereal Potion.</w:t>
+      </w:r>
+    </w:p>
+    <w:p>
+      <w:r>
+        <w:t>Appearance: Pale, ash-grey skin; flat, dark eyes that do not reflect light; faint markings that glow faintly with Veyn beneath the skin.</w:t>
+      </w:r>
+    </w:p>
+    <w:p>
+      <w:r>
+        <w:t>Innate Ability: Potent Blood</w:t>
+      </w:r>
+    </w:p>
+    <w:p>
+      <w:pPr>
+        <w:pStyle w:val="Heading1"/>
+      </w:pPr>
+      <w:r>
+        <w:t>Innate Abilities</w:t>
+      </w:r>
+    </w:p>
+    <w:p>
+      <w:r>
+        <w:t>Each race type carries one innate ability, shared by every member of that type regardless of rank. They are born into the blood, not trained.</w:t>
+      </w:r>
+    </w:p>
+    <w:p>
+      <w:r>
+        <w:t>Imperishable — Cannot be struck down by ordinary means — only a Divine Weapon or a Corrupted Divine Weapon can end them.</w:t>
+      </w:r>
+    </w:p>
+    <w:p>
+      <w:r>
+        <w:t>Veyn-Regen — Their Veyn replenishes on its own, faster than it drains.</w:t>
+      </w:r>
+    </w:p>
+    <w:p>
+      <w:r>
+        <w:t>Rapid-Mend — Their regeneration speeds up in bursts, mending wounds quicker than it should.</w:t>
+      </w:r>
+    </w:p>
+    <w:p>
+      <w:r>
+        <w:t>Sovereign Resilience — Cannot be harmed or killed by regular weapons — only a Divine Weapon can end them.</w:t>
+        <w:br/>
+        <w:t>They can be damaged by a holy weapon</w:t>
+      </w:r>
+    </w:p>
+    <w:p>
+      <w:r>
+        <w:t>Vitality-Regen — Their regeneration runs on Veyn or Vitality, replenishing faster than it drains.</w:t>
+      </w:r>
+    </w:p>
+    <w:p>
+      <w:r>
+        <w:t>Veyn-Touch — Can drain the Veyn of others without them knowing or feeling it — only a slight discomfort.</w:t>
+      </w:r>
+    </w:p>
+    <w:p>
+      <w:r>
+        <w:t>Potent Blood — Their blood has an extremely high, potent healing capability, and is an excellent conduit for magic — allowing them to use powerful magic easily.</w:t>
+      </w:r>
+    </w:p>
+    <w:p>
+      <w:pPr>
+        <w:pStyle w:val="Heading1"/>
+      </w:pPr>
+      <w:r>
+        <w:t>The Six Pillars of Angels</w:t>
+      </w:r>
+    </w:p>
+    <w:p>
+      <w:r>
+        <w:t>The Angel Realm’s six generals are known as the Six Pillars, ranked First through Sixth. The First Pillar is Chronous, held by Ordium; the Second through Sixth are Helious, Areous, Deimous, Horkous, and Argous. Each pillar bears a title, its own skills, and a duty — from guarding the Sundering Altar to standing as the Serapharch’s personal guard.</w:t>
+      </w:r>
+    </w:p>
+    <w:p>
+      <w:pPr>
+        <w:pStyle w:val="Heading2"/>
+      </w:pPr>
+      <w:r>
+        <w:t>Ordium — First Pillar, Chronous</w:t>
+      </w:r>
+    </w:p>
+    <w:p>
+      <w:r>
+        <w:t>The First Pillar — the highest-ranked of the six angel generals, the one the others took their orders from. He met Lisa and left his post for nine months. When the rulers called him back, they ordered him executed for lying with a demon. The First Pillar fell, and the five beneath him were never the same after.</w:t>
+      </w:r>
+    </w:p>
+    <w:p>
+      <w:r>
+        <w:t>Skills: Lapse, Rewind, Still Hour</w:t>
+      </w:r>
+    </w:p>
+    <w:p>
+      <w:r>
+        <w:t>Mastered Skill: Time’s Grasp</w:t>
+      </w:r>
+    </w:p>
+    <w:p>
+      <w:r>
+        <w:t>Personalized Skill: The Stolen Hour</w:t>
+      </w:r>
+    </w:p>
+    <w:p>
+      <w:pPr>
+        <w:pStyle w:val="Heading2"/>
+      </w:pPr>
+      <w:r>
+        <w:t>Cyrion — Second Pillar, Helious</w:t>
+      </w:r>
+    </w:p>
+    <w:p>
+      <w:r>
+        <w:t>The Second Pillar. He watches the far edge of the Angel Realm, where the host does not march. He saw Ordium slip away the first time and said nothing — and he has kept the secret of Jaiden’s parentage ever since, not out of loyalty, but because he doesn’t report what he hasn’t decided to act on.</w:t>
+      </w:r>
+    </w:p>
+    <w:p>
+      <w:r>
+        <w:t>Skills: Long Sight, Burning Path, Second Sun</w:t>
+      </w:r>
+    </w:p>
+    <w:p>
+      <w:pPr>
+        <w:pStyle w:val="Heading2"/>
+      </w:pPr>
+      <w:r>
+        <w:t>Serathiel — Third Pillar, Areous</w:t>
+      </w:r>
+    </w:p>
+    <w:p>
+      <w:r>
+        <w:t>The Third Pillar — the bulwark who never retreats, and no one has ever thanked her for it. When Ordium abandoned his post, she was next in line for his seat, and she resents that he threw away a rank she would have bled to hold.</w:t>
+      </w:r>
+    </w:p>
+    <w:p>
+      <w:r>
+        <w:t>Skills: Battle Trance, Ravager’s Grasp, War-Worn</w:t>
+      </w:r>
+    </w:p>
+    <w:p>
+      <w:pPr>
+        <w:pStyle w:val="Heading2"/>
+      </w:pPr>
+      <w:r>
+        <w:t>Liora Veyne — Fourth Pillar, Deimous</w:t>
+      </w:r>
+    </w:p>
+    <w:p>
+      <w:r>
+        <w:t>The Fourth Pillar. She carries the bad news, and she is never wrong. It was Liora who brought the execution order to Ordium’s door, in the same soft voice she uses to announce a dawn. The soldiers say the dread before a battle is her, arriving first.</w:t>
+      </w:r>
+    </w:p>
+    <w:p>
+      <w:r>
+        <w:t>Skills: Dread-Herald, Unheralded, Kneel</w:t>
+      </w:r>
+    </w:p>
+    <w:p>
+      <w:pPr>
+        <w:pStyle w:val="Heading2"/>
+      </w:pPr>
+      <w:r>
+        <w:t>Thalor Elwin — Fifth Pillar, Horkous</w:t>
+      </w:r>
+    </w:p>
+    <w:p>
+      <w:r>
+        <w:t>The Fifth Pillar — the guardian of the Sundering Altar, where every person in the world is brought at fifteen to have their latent connection to Veyn unlocked for the first time. Angels swear their Veyn Vow there, and it is where each halo first forms. Thalor records every vow sworn at the altar and watches for the first sign that one is fraying. He saw the signs in Ordium long before he left: a vow pulled thin by something it was never meant to contain. He said nothing then, and has spent every day since wondering whether a single word from him could have stopped all of it.</w:t>
+      </w:r>
+    </w:p>
+    <w:p>
+      <w:r>
+        <w:t>Skills: Altar-Rite, Vowbrand, Truthvein</w:t>
+      </w:r>
+    </w:p>
+    <w:p>
+      <w:pPr>
+        <w:pStyle w:val="Heading2"/>
+      </w:pPr>
+      <w:r>
+        <w:t>Aranweis — Sixth Pillar, Argous</w:t>
+      </w:r>
+    </w:p>
+    <w:p>
+      <w:r>
+        <w:t>The Sixth Pillar — the personal guard of the Serapharch, the first-rank ruler of the Angel Realm. Aranweis is the king’s own watcher, standing always within reach of the throne, his hundred-eyed gaze missing nothing. He has seen every supplicant, every messenger, and every traitor who ever came before the king, and he forgets none of them.</w:t>
+      </w:r>
+    </w:p>
+    <w:p>
+      <w:r>
+        <w:t>Skills: All-Seeing Eye, Warden’s Recall, Warden’s Mark</w:t>
+      </w:r>
+    </w:p>
+    <w:p>
+      <w:pPr>
+        <w:pStyle w:val="Heading1"/>
+      </w:pPr>
+      <w:r>
+        <w:t>The Demon Generals</w:t>
+      </w:r>
+    </w:p>
+    <w:p>
+      <w:r>
+        <w:t>The Demon Realm has six generals, each bearing a title and their own skills.</w:t>
+      </w:r>
+    </w:p>
+    <w:p>
+      <w:pPr>
+        <w:pStyle w:val="Heading2"/>
+      </w:pPr>
+      <w:r>
+        <w:t xml:space="preserve">Lisa — </w:t>
+      </w:r>
+    </w:p>
+    <w:p>
+      <w:r>
+        <w:t>She had a child for Ordium, and due to their ranks and positions they could not stay together and were separated to their various Realms: Lisa went to her realm, the Demon Realm, and Ordium went to the Angel Realm. Her rank was Bloodward. She was known to bring cruelty upon people who fight her and is the most powerful demon in the Demon Realm after the Mordrach. After realizing she was pregnant with Jaiden and found his aura very abnormal — carrying both an angelic aura and a demonic aura — she knew he would be killed off and she could not bear it, so she gave the child to her personal maid, not before giving her a ruby pendant called the Auralis Ruby to seal all his auras, which makes him look human.</w:t>
+      </w:r>
+    </w:p>
+    <w:p>
+      <w:r>
+        <w:t>Race: Imp</w:t>
+      </w:r>
+    </w:p>
+    <w:p>
+      <w:r>
+        <w:t>Skills: Glut, Cornucopia, Reap</w:t>
+      </w:r>
+    </w:p>
+    <w:p>
+      <w:r>
+        <w:t>Mastered Skill: Sovereign Aura</w:t>
+      </w:r>
+    </w:p>
+    <w:p>
+      <w:r>
+        <w:t>Personalized Skill: Auralis Seal</w:t>
+      </w:r>
+    </w:p>
+    <w:p>
+      <w:pPr>
+        <w:pStyle w:val="Heading2"/>
+      </w:pPr>
+      <w:r>
+        <w:t>Licent Varak — Demon of the Bloodhound</w:t>
+      </w:r>
+    </w:p>
+    <w:p>
+      <w:r>
+        <w:t>He is the second right-hand man to Tera Morage in the Demon Realm. He had always hated Lisa for being stronger than him and holding the top Bloodward position, so he was constantly looking for a way to take her power and rank away. When he saw Sofia heading to an unknown location, he tried to follow her but lost track of her. He then saw Lisa meet with an angel. After that, he discovered they had intercourse and that she had become pregnant with a child. He used this information to report her to Tera Morage, which enraged the ruler. As a result, Lisa was demoted to Gnash rank and later killed by his men, which he ordered them to do.</w:t>
+      </w:r>
+    </w:p>
+    <w:p>
+      <w:r>
+        <w:t>Race: Dregs</w:t>
+      </w:r>
+    </w:p>
+    <w:p>
+      <w:r>
+        <w:t>Skills: Blood-Oath, Disinter, Guile</w:t>
+      </w:r>
+    </w:p>
+    <w:p>
+      <w:pPr>
+        <w:pStyle w:val="Heading2"/>
+      </w:pPr>
+      <w:r>
+        <w:t>Kael Vornath — Jester demon</w:t>
+      </w:r>
+    </w:p>
+    <w:p>
+      <w:r>
+        <w:t>A general who fights with misdirection, never taken seriously until the feint lands. Tolerated because he wins, and his cruelty is a performance — but the performance is the point, and he has never once shown fear, which is why no one trusts him. Tera Morage keeps him for his usefulness but does not trust him.</w:t>
+      </w:r>
+    </w:p>
+    <w:p>
+      <w:r>
+        <w:t>Race: Imp</w:t>
+      </w:r>
+    </w:p>
+    <w:p>
+      <w:r>
+        <w:t>Skills: Red Whisper, Blood Jape, Traitor’s Step</w:t>
+      </w:r>
+    </w:p>
+    <w:p>
+      <w:pPr>
+        <w:pStyle w:val="Heading2"/>
+      </w:pPr>
+      <w:r>
+        <w:t>Sythra Kaelis — Demon of melancholy</w:t>
+      </w:r>
+    </w:p>
+    <w:p>
+      <w:r>
+        <w:t>Her cruelty wears the face of mercy. She kills not in anger but in pity — she tells her victims she is relieving them of their sadness as her miasma drains the will and Veyn from them, leaving behind empty, obedient shells. The grief she carries is real, but it is a grief she now administers to others. She was the one sent to “comfort” Lisa after her demotion to Gnash, draining what remained of her before Licent Varak’s men finished it.</w:t>
+      </w:r>
+    </w:p>
+    <w:p>
+      <w:r>
+        <w:t>Race: Dregs</w:t>
+      </w:r>
+    </w:p>
+    <w:p>
+      <w:r>
+        <w:t>Skills: Grey Miasma, Widow’s Toll, Fading Wound</w:t>
+      </w:r>
+    </w:p>
+    <w:p>
+      <w:pPr>
+        <w:pStyle w:val="Heading2"/>
+      </w:pPr>
+      <w:r>
+        <w:t>Nyra Thessan — Demon of gluttony</w:t>
+      </w:r>
+    </w:p>
+    <w:p>
+      <w:r>
+        <w:t>She devours magic the way others eat bread. The more she consumes, the stronger she grows, and no battlefield has ever been enough to fill her. She fights not for the realm but because stopping means feeling the hunger again.</w:t>
+      </w:r>
+    </w:p>
+    <w:p>
+      <w:r>
+        <w:t>Race: Dregs</w:t>
+      </w:r>
+    </w:p>
+    <w:p>
+      <w:r>
+        <w:t>Skills: Siphon, Unslaked, Seal</w:t>
+      </w:r>
+    </w:p>
+    <w:p>
+      <w:pPr>
+        <w:pStyle w:val="Heading2"/>
+      </w:pPr>
+      <w:r>
+        <w:t>Isella Marrek — Demon of love</w:t>
+      </w:r>
+    </w:p>
+    <w:p>
+      <w:r>
+        <w:t>A general who has never once loved anyone back. She treats love as a resource — the devotion and affection of others is something she harvests and hoards to fuel her power. The more people love her, the stronger she grows, so she cultivates followers endlessly, and it is entirely transactional on her end. She recruits and binds the Demon army’s soldiers, which is why their ranks hold together even when the cause is lost, keeping her in Tera Morage’s orbit.</w:t>
+      </w:r>
+    </w:p>
+    <w:p>
+      <w:r>
+        <w:t>Race: Dregs</w:t>
+      </w:r>
+    </w:p>
+    <w:p>
+      <w:r>
+        <w:t>Skills: Heart-Bind, Lover’s Step, Bond-Sight</w:t>
+      </w:r>
+    </w:p>
+    <w:p>
+      <w:pPr>
+        <w:pStyle w:val="Heading1"/>
+      </w:pPr>
+      <w:r>
+        <w:t>Evolution</w:t>
+      </w:r>
+    </w:p>
+    <w:p>
+      <w:pPr>
+        <w:pStyle w:val="Heading2"/>
+      </w:pPr>
+      <w:r>
+        <w:t>Angel Evolution</w:t>
+      </w:r>
+    </w:p>
+    <w:p>
+      <w:r>
+        <w:t>To become the first rank — the Serapharch — the heir is flooded with a massive amount of Veyn, then exposed to ten days of raw, concentrated Veyn. If they survive, they evolve into an Cherubim angel and become the new ruler of the Angel Realm. This rite is performed on the heir, and only after the king has died or has given up the throne</w:t>
+      </w:r>
+    </w:p>
+    <w:p>
+      <w:pPr>
+        <w:pStyle w:val="Heading2"/>
+      </w:pPr>
+      <w:r>
+        <w:t>Demon Evolution</w:t>
+      </w:r>
+    </w:p>
+    <w:p>
+      <w:r>
+        <w:t>To evolve from a Dregs demon to a Fiend — the Mordrach — the first rank must die. When that happens, all the Veyn the first rank held while alive is passed on to the next heir; if the heir can withstand it, they become the new king of the Demon Realm.</w:t>
+      </w:r>
+    </w:p>
+    <w:p>
+      <w:pPr>
+        <w:pStyle w:val="Heading1"/>
+      </w:pPr>
+      <w:r>
+        <w:t>Additional Rules &amp; Notes</w:t>
+      </w:r>
+    </w:p>
+    <w:p>
+      <w:pPr>
+        <w:pStyle w:val="Heading2"/>
+      </w:pPr>
+      <w:r>
+        <w:t>Titles and Their Skills</w:t>
+      </w:r>
+    </w:p>
+    <w:p>
+      <w:r>
+        <w:t>A title is more than a name — each one carries its own set of skills, mastered by the one who holds it. A title’s skills are distinct from a character’s innate rank abilities. Titles cannot be passed down; only a ruler of the first rank can grant a title to another, and only if they see that person as worthy of it. What can be passed down is a personalized skill — like Ordium’s The Stolen Hour or Lisa’s Auralis Seal — which flows from parent to offspring.</w:t>
+      </w:r>
+    </w:p>
+    <w:p>
+      <w:pPr>
+        <w:pStyle w:val="Heading2"/>
+      </w:pPr>
+      <w:r>
+        <w:t>Mastered and Personalized Skills</w:t>
+      </w:r>
+    </w:p>
+    <w:p>
+      <w:r>
+        <w:t>Beyond ordinary skills, a character can reach two higher tiers. A Mastered skill is one they have perfected beyond what their rank normally allows — their peak. A Personalized skill is their signature, unique to them alone, forged from their own experience. These are the skills that can be passed down to an offspring, and they mark the few who stand above their rank.</w:t>
+      </w:r>
+    </w:p>
+    <w:p>
+      <w:pPr>
+        <w:pStyle w:val="Heading2"/>
+      </w:pPr>
+      <w:r>
+        <w:t>The Hybrid</w:t>
+      </w:r>
+    </w:p>
+    <w:p>
+      <w:r>
+        <w:t>A hybrid is an angel and a demon born of a single body — a union the world considers impossible, since Veyn and Ren cannot coexist and the two realms’ natures are opposed. Jaiden Marlock is the first, born of Ordium (an Aetherblade Lord Angel) and Lisa (a Bloodward), and his aura carries both an angelic and a demonic aura at once. Hybrids inherit both parents’ race types — in Jaiden’s case the Imp demon half and the Malakhim angel half — and can draw on the abilities of both. Because such a being has never existed before, there are no rules for it, only what Jaiden himself becomes.</w:t>
+      </w:r>
+    </w:p>
+    <w:p>
+      <w:pPr>
+        <w:pStyle w:val="Heading2"/>
+      </w:pPr>
+      <w:r>
+        <w:t>Spirits</w:t>
+      </w:r>
+    </w:p>
+    <w:p>
+      <w:r>
+        <w:t>Not every creature of the Dark belongs to the Demon Realm’s ranks. Some are spirits — beings given shape by unstable Veyn rather than born of the demonic bloodline. The Cindergrave Wraith Lord and the Lesser Cindergrave Wraiths are evil spirits: fragments of will pulled from the fallen kingdom of Lethmoor and held together by the unstable Veyn of its terrain. They are not demons and hold no demon rank; they simply endure where the Veyn is too broken to be called a realm, feeding on the Veyn of the living to stay whole.</w:t>
+      </w:r>
+    </w:p>
+    <w:p>
+      <w:pPr>
+        <w:pStyle w:val="Heading2"/>
+      </w:pPr>
+      <w:r>
+        <w:t>The Vael</w:t>
+      </w:r>
+    </w:p>
+    <w:p>
+      <w:r>
+        <w:t>The Vael were an ancient race of realm-makers, wiped out by the former ruler of the Human Realm. Their survivors tore open the Hidden Realm as a hiding place, an act so violent it nearly destroyed the world, but even that refuge could not save them — the realm’s creatures formed almost immediately and the Vael died out inside it, leaving one survivor: the Headmaster of the Academy, who alone learned to endure the realm and became the only person to ever brew the Ethereal Potion.</w:t>
+      </w:r>
+    </w:p>
+    <w:p>
+      <w:pPr>
+        <w:pStyle w:val="Heading1"/>
+      </w:pPr>
+      <w:r>
+        <w:t>New Characters &amp; Places</w:t>
+      </w:r>
+    </w:p>
+    <w:p>
+      <w:pPr>
+        <w:pStyle w:val="Heading2"/>
+      </w:pPr>
+      <w:r>
+        <w:t>Kael von Ashen — Head Master of the Academy</w:t>
+      </w:r>
+    </w:p>
+    <w:p>
+      <w:r>
+        <w:t>The only survivor of the old race that was killed off by the former Human Realm ruler when the Hidden Realm was forcefully created. He is the Head Master of the academy, and he is the character who takes the MC, Jaiden, to the Hidden Realm. His extinct race has no name yet, and neither does the academy.</w:t>
+      </w:r>
+    </w:p>
+    <w:p>
+      <w:r>
+        <w:t>Race: Vael</w:t>
+      </w:r>
+    </w:p>
+    <w:p>
+      <w:pPr>
+        <w:pStyle w:val="Heading2"/>
+      </w:pPr>
+      <w:r>
+        <w:t>Elyndor Academy</w:t>
+      </w:r>
+    </w:p>
+    <w:p>
+      <w:r>
+        <w:t>The academy led by Kael von Ashen, the sole survivor of the old race killed off by the former Human Realm ruler.</w:t>
+      </w:r>
+    </w:p>
+    <w:p>
+      <w:pPr>
+        <w:pStyle w:val="Heading2"/>
+      </w:pPr>
+      <w:r>
+        <w:t>Carin</w:t>
+      </w:r>
+    </w:p>
+    <w:p>
+      <w:r>
+        <w:t>she used to serve Lisa and later when she discovered that Lisa had a child with an angel she decided to teach the child about his demon powers. The mc met her when he visited the demon realm</w:t>
+      </w:r>
+    </w:p>
+    <w:p>
+      <w:r>
+        <w:t>Race: Imp, Rank: Scourge</w:t>
+      </w:r>
+    </w:p>
+    <w:p>
+      <w:pPr>
+        <w:pStyle w:val="Heading2"/>
+      </w:pPr>
+      <w:r>
+        <w:t>Wener Leger</w:t>
+      </w:r>
+    </w:p>
+    <w:p>
+      <w:r>
+        <w:t>The true leader of the Dark moon clan</w:t>
+      </w:r>
+    </w:p>
+    <w:p>
+      <w:r>
+        <w:t>Race: Fallen Angel</w:t>
       </w:r>
     </w:p>
     <w:sectPr>

</xml_diff>

<commit_message>
Update reference docx: race appearances, world barrier/core, Veyn/Ren forms, Clergy/Healers; fix stale Healer/Paladin/Saintess entries
</commit_message>
<xml_diff>
--- a/Half_made world ideas.docx
+++ b/Half_made world ideas.docx
@@ -25090,7 +25090,146 @@
     </w:p>
     <w:p>
       <w:r>
-        <w:t xml:space="preserve">Unlike a Mage who draws on raw </w:t>
+        <w:t>Unlike a Mage who draws on raw Veyn, a Saintess channels Holy Energy, the same energy Diviners, Holy Rain, and Holy Flame use. This makes her spells naturally effective against undead, miasma, and other corrupted Veyn, but weaker against things that have nothing to do with corruption. Her magic leans almost entirely toward healing, protection, and cleansing rather than direct offense. A Magic/Veyn class, Holy class</w:t>
+      </w:r>
+      <w:r>
+        <w:rPr>
+          <w:b/>
+          <w:bCs/>
+          <w:color w:val="215E99" w:themeColor="text2" w:themeTint="BF"/>
+          <w:u w:val="single"/>
+        </w:rPr>
+      </w:r>
+      <w:r/>
+      <w:r>
+        <w:rPr>
+          <w:b/>
+          <w:bCs/>
+          <w:color w:val="215E99" w:themeColor="text2" w:themeTint="BF"/>
+          <w:u w:val="single"/>
+        </w:rPr>
+      </w:r>
+      <w:r/>
+      <w:r>
+        <w:rPr>
+          <w:b/>
+          <w:bCs/>
+          <w:color w:val="215E99" w:themeColor="text2" w:themeTint="BF"/>
+          <w:u w:val="single"/>
+        </w:rPr>
+      </w:r>
+      <w:r/>
+      <w:r>
+        <w:rPr>
+          <w:b/>
+          <w:bCs/>
+          <w:color w:val="215E99" w:themeColor="text2" w:themeTint="BF"/>
+          <w:u w:val="single"/>
+        </w:rPr>
+      </w:r>
+      <w:r>
+        <w:rPr>
+          <w:color w:val="215E99" w:themeColor="text2" w:themeTint="BF"/>
+        </w:rPr>
+      </w:r>
+      <w:r/>
+      <w:r/>
+      <w:r/>
+      <w:r>
+        <w:rPr>
+          <w:b/>
+          <w:bCs/>
+          <w:u w:val="thick"/>
+        </w:rPr>
+      </w:r>
+      <w:r>
+        <w:rPr>
+          <w:b/>
+          <w:bCs/>
+          <w:u w:val="thick"/>
+        </w:rPr>
+      </w:r>
+    </w:p>
+    <w:p>
+      <w:pPr>
+        <w:pStyle w:val="Heading2"/>
+      </w:pPr>
+      <w:bookmarkStart w:id="141" w:name="_Toc235281199"/>
+      <w:r>
+        <w:rPr>
+          <w:b/>
+          <w:bCs/>
+          <w:color w:val="215E99" w:themeColor="text2" w:themeTint="BF"/>
+          <w:u w:val="single"/>
+        </w:rPr>
+        <w:t xml:space="preserve">Clergy→ </w:t>
+      </w:r>
+      <w:r/>
+      <w:bookmarkEnd w:id="141"/>
+      <w:r/>
+    </w:p>
+    <w:p>
+      <w:r>
+        <w:t>Trained in restoring injuries and health using Veyn. Anyone can join the Clergy — from among them, the Seer chooses the seven who hold the title of Healer in the Human Realm. A Magic/Veyn class</w:t>
+      </w:r>
+      <w:r>
+        <w:rPr>
+          <w:b/>
+          <w:bCs/>
+          <w:color w:val="215E99" w:themeColor="text2" w:themeTint="BF"/>
+          <w:u w:val="single"/>
+        </w:rPr>
+      </w:r>
+      <w:r/>
+      <w:r>
+        <w:rPr>
+          <w:b/>
+          <w:bCs/>
+          <w:color w:val="215E99" w:themeColor="text2" w:themeTint="BF"/>
+          <w:u w:val="single"/>
+        </w:rPr>
+      </w:r>
+      <w:r/>
+      <w:r>
+        <w:rPr>
+          <w:b/>
+          <w:bCs/>
+          <w:color w:val="215E99" w:themeColor="text2" w:themeTint="BF"/>
+          <w:u w:val="single"/>
+        </w:rPr>
+      </w:r>
+      <w:r/>
+      <w:r/>
+      <w:r>
+        <w:rPr>
+          <w:b/>
+          <w:bCs/>
+          <w:u w:val="thick"/>
+        </w:rPr>
+      </w:r>
+    </w:p>
+    <w:p>
+      <w:pPr>
+        <w:pStyle w:val="Heading2"/>
+      </w:pPr>
+      <w:bookmarkStart w:id="142" w:name="_Toc235281200"/>
+      <w:r>
+        <w:rPr>
+          <w:b/>
+          <w:bCs/>
+          <w:color w:val="215E99" w:themeColor="text2" w:themeTint="BF"/>
+          <w:u w:val="single"/>
+        </w:rPr>
+        <w:t>Archer</w:t>
+      </w:r>
+      <w:r>
+        <w:t>→</w:t>
+      </w:r>
+      <w:bookmarkEnd w:id="142"/>
+    </w:p>
+    <w:p>
+      <w:r>
+        <w:t xml:space="preserve">Uses </w:t>
       </w:r>
       <w:r>
         <w:rPr>
@@ -25102,239 +25241,61 @@
         <w:t>Veyn</w:t>
       </w:r>
       <w:r>
-        <w:t xml:space="preserve">, a Saintess channels holy energy, the same energy </w:t>
-      </w:r>
-      <w:r>
-        <w:rPr>
-          <w:b/>
-          <w:bCs/>
-          <w:color w:val="215E99" w:themeColor="text2" w:themeTint="BF"/>
-          <w:u w:val="single"/>
-        </w:rPr>
-        <w:t>Diviners</w:t>
-      </w:r>
-      <w:r>
-        <w:t xml:space="preserve">, </w:t>
-      </w:r>
-      <w:r>
-        <w:rPr>
-          <w:b/>
-          <w:bCs/>
-          <w:color w:val="215E99" w:themeColor="text2" w:themeTint="BF"/>
-          <w:u w:val="single"/>
-        </w:rPr>
-        <w:t>Holy Rain</w:t>
-      </w:r>
-      <w:r>
-        <w:t xml:space="preserve">, and </w:t>
-      </w:r>
-      <w:r>
-        <w:rPr>
-          <w:b/>
-          <w:bCs/>
-          <w:color w:val="215E99" w:themeColor="text2" w:themeTint="BF"/>
-          <w:u w:val="single"/>
-        </w:rPr>
-        <w:t>Holy Flame</w:t>
-      </w:r>
-      <w:r>
         <w:rPr>
           <w:color w:val="215E99" w:themeColor="text2" w:themeTint="BF"/>
         </w:rPr>
         <w:t xml:space="preserve"> </w:t>
       </w:r>
       <w:r>
-        <w:t xml:space="preserve">use. This makes her spells naturally effective against undead, miasma, and other corrupted Veyn, but weaker against things that have nothing to </w:t>
-      </w:r>
-      <w:r>
-        <w:lastRenderedPageBreak/>
-        <w:t>do with corruption. Her magic leans almost entirely toward healing, protection, and cleansing rather than direct offense.</w:t>
-      </w:r>
+        <w:t>to enchant their arrows or shots, giving them extra effects like piercing, explosive, or homing properties</w:t>
+      </w:r>
+      <w:r>
+        <w:t xml:space="preserve">. </w:t>
+      </w:r>
+      <w:r>
+        <w:rPr>
+          <w:b/>
+          <w:bCs/>
+          <w:u w:val="thick"/>
+        </w:rPr>
+        <w:t>A Magic/Veyn class</w:t>
+      </w:r>
+    </w:p>
+    <w:p>
+      <w:pPr>
+        <w:pStyle w:val="Heading2"/>
+      </w:pPr>
+      <w:bookmarkStart w:id="143" w:name="_Toc235281201"/>
+      <w:r>
+        <w:rPr>
+          <w:b/>
+          <w:bCs/>
+          <w:color w:val="215E99" w:themeColor="text2" w:themeTint="BF"/>
+          <w:u w:val="single"/>
+        </w:rPr>
+        <w:t>Paladin</w:t>
+      </w:r>
+      <w:r>
+        <w:t>→</w:t>
+      </w:r>
+      <w:bookmarkEnd w:id="143"/>
       <w:r>
         <w:t xml:space="preserve"> </w:t>
       </w:r>
-      <w:r>
-        <w:rPr>
-          <w:b/>
-          <w:bCs/>
-          <w:u w:val="thick"/>
-        </w:rPr>
-        <w:t>A Magic/Veyn class</w:t>
-      </w:r>
-      <w:r>
-        <w:rPr>
-          <w:b/>
-          <w:bCs/>
-          <w:u w:val="thick"/>
-        </w:rPr>
-        <w:t>, Holy class</w:t>
-      </w:r>
-    </w:p>
-    <w:p>
-      <w:pPr>
-        <w:pStyle w:val="Heading2"/>
-      </w:pPr>
-      <w:bookmarkStart w:id="141" w:name="_Toc235281199"/>
-      <w:r>
-        <w:rPr>
-          <w:b/>
-          <w:bCs/>
-          <w:color w:val="215E99" w:themeColor="text2" w:themeTint="BF"/>
-          <w:u w:val="single"/>
-        </w:rPr>
-        <w:t>Healer</w:t>
-      </w:r>
-      <w:r>
-        <w:t>→</w:t>
-      </w:r>
-      <w:bookmarkEnd w:id="141"/>
-      <w:r>
-        <w:t xml:space="preserve"> </w:t>
-      </w:r>
-    </w:p>
-    <w:p>
-      <w:r>
-        <w:t xml:space="preserve">Trained in restoring injuries and health using </w:t>
-      </w:r>
-      <w:r>
-        <w:rPr>
-          <w:b/>
-          <w:bCs/>
-          <w:color w:val="215E99" w:themeColor="text2" w:themeTint="BF"/>
-          <w:u w:val="single"/>
-        </w:rPr>
-        <w:t>Veyn</w:t>
-      </w:r>
-      <w:r>
-        <w:t xml:space="preserve">. Anyone can train as a </w:t>
-      </w:r>
-      <w:r>
-        <w:rPr>
-          <w:b/>
-          <w:bCs/>
-          <w:color w:val="215E99" w:themeColor="text2" w:themeTint="BF"/>
-          <w:u w:val="single"/>
-        </w:rPr>
-        <w:t>Healer</w:t>
-      </w:r>
-      <w:r>
-        <w:t xml:space="preserve">, though only seven at a time hold the actual title in the </w:t>
-      </w:r>
-      <w:r>
-        <w:rPr>
-          <w:b/>
-          <w:bCs/>
-          <w:color w:val="215E99" w:themeColor="text2" w:themeTint="BF"/>
-          <w:u w:val="single"/>
-        </w:rPr>
-        <w:t>Human Realm</w:t>
-      </w:r>
-      <w:r>
-        <w:t>.</w:t>
-      </w:r>
-      <w:r>
-        <w:t xml:space="preserve"> </w:t>
-      </w:r>
-      <w:r>
-        <w:rPr>
-          <w:b/>
-          <w:bCs/>
-          <w:u w:val="thick"/>
-        </w:rPr>
-        <w:t>A Magic/Veyn class</w:t>
-      </w:r>
-    </w:p>
-    <w:p>
-      <w:pPr>
-        <w:pStyle w:val="Heading2"/>
-      </w:pPr>
-      <w:bookmarkStart w:id="142" w:name="_Toc235281200"/>
-      <w:r>
-        <w:rPr>
-          <w:b/>
-          <w:bCs/>
-          <w:color w:val="215E99" w:themeColor="text2" w:themeTint="BF"/>
-          <w:u w:val="single"/>
-        </w:rPr>
-        <w:t>Archer</w:t>
-      </w:r>
-      <w:r>
-        <w:t>→</w:t>
-      </w:r>
-      <w:bookmarkEnd w:id="142"/>
-    </w:p>
-    <w:p>
-      <w:r>
-        <w:t xml:space="preserve">Uses </w:t>
-      </w:r>
-      <w:r>
-        <w:rPr>
-          <w:b/>
-          <w:bCs/>
-          <w:color w:val="215E99" w:themeColor="text2" w:themeTint="BF"/>
-          <w:u w:val="single"/>
-        </w:rPr>
-        <w:t>Veyn</w:t>
-      </w:r>
-      <w:r>
-        <w:rPr>
-          <w:color w:val="215E99" w:themeColor="text2" w:themeTint="BF"/>
-        </w:rPr>
-        <w:t xml:space="preserve"> </w:t>
-      </w:r>
-      <w:r>
-        <w:t>to enchant their arrows or shots, giving them extra effects like piercing, explosive, or homing properties</w:t>
-      </w:r>
-      <w:r>
-        <w:t xml:space="preserve">. </w:t>
-      </w:r>
-      <w:r>
-        <w:rPr>
-          <w:b/>
-          <w:bCs/>
-          <w:u w:val="thick"/>
-        </w:rPr>
-        <w:t>A Magic/Veyn class</w:t>
-      </w:r>
-    </w:p>
-    <w:p>
-      <w:pPr>
-        <w:pStyle w:val="Heading2"/>
-      </w:pPr>
-      <w:bookmarkStart w:id="143" w:name="_Toc235281201"/>
-      <w:r>
-        <w:rPr>
-          <w:b/>
-          <w:bCs/>
-          <w:color w:val="215E99" w:themeColor="text2" w:themeTint="BF"/>
-          <w:u w:val="single"/>
-        </w:rPr>
-        <w:t>Paladin</w:t>
-      </w:r>
-      <w:r>
-        <w:t>→</w:t>
-      </w:r>
-      <w:bookmarkEnd w:id="143"/>
-      <w:r>
-        <w:t xml:space="preserve"> </w:t>
-      </w:r>
-    </w:p>
-    <w:p>
-      <w:r>
-        <w:t xml:space="preserve">Blends physical strength with </w:t>
-      </w:r>
-      <w:r>
-        <w:rPr>
-          <w:b/>
-          <w:bCs/>
-          <w:color w:val="215E99" w:themeColor="text2" w:themeTint="BF"/>
-          <w:u w:val="single"/>
-        </w:rPr>
-        <w:t>holy energy</w:t>
-      </w:r>
-      <w:r>
-        <w:t xml:space="preserve">, giving them the fighting capability of </w:t>
-      </w:r>
+    </w:p>
+    <w:p>
+      <w:r>
+        <w:t>Blends physical strength with Auric Ren — their own Ren brightened into gold — giving them the fighting power of a warrior and the ability to heal and protect, all through their own Vitality rather than Veyn. Because they never hold Veyn and Ren together, paladins avoid the incompatibility that would kill anyone else. Common among those who protect others directly, like guards or knights. A Ren class (Auric Ren)</w:t>
+      </w:r>
+      <w:r>
+        <w:rPr>
+          <w:b/>
+          <w:bCs/>
+          <w:color w:val="215E99" w:themeColor="text2" w:themeTint="BF"/>
+          <w:u w:val="single"/>
+        </w:rPr>
+      </w:r>
+      <w:r/>
       <w:r>
         <w:rPr>
           <w:b/>
@@ -25343,51 +25304,43 @@
           <w:iCs/>
           <w:color w:val="BF4E14" w:themeColor="accent2" w:themeShade="BF"/>
         </w:rPr>
-        <w:t>a warrior alongside the ability to heal or protect using</w:t>
       </w:r>
       <w:r>
         <w:rPr>
           <w:color w:val="BF4E14" w:themeColor="accent2" w:themeShade="BF"/>
         </w:rPr>
-        <w:t xml:space="preserve"> </w:t>
-      </w:r>
-      <w:r>
-        <w:rPr>
-          <w:b/>
-          <w:bCs/>
-          <w:color w:val="215E99" w:themeColor="text2" w:themeTint="BF"/>
-          <w:u w:val="single"/>
-        </w:rPr>
-        <w:t xml:space="preserve">Pure version of </w:t>
-      </w:r>
-      <w:r>
-        <w:rPr>
-          <w:b/>
-          <w:bCs/>
-          <w:color w:val="215E99" w:themeColor="text2" w:themeTint="BF"/>
-          <w:u w:val="single"/>
-        </w:rPr>
-        <w:t>Veyn (</w:t>
-      </w:r>
-      <w:r>
-        <w:rPr>
-          <w:b/>
-          <w:bCs/>
-          <w:color w:val="215E99" w:themeColor="text2" w:themeTint="BF"/>
-          <w:u w:val="single"/>
-        </w:rPr>
-        <w:t>holy energy)</w:t>
-      </w:r>
-      <w:r>
-        <w:t xml:space="preserve">. Common among those who protect others directly, like guards or knights. </w:t>
-      </w:r>
+      </w:r>
+      <w:r>
+        <w:rPr>
+          <w:b/>
+          <w:bCs/>
+          <w:color w:val="215E99" w:themeColor="text2" w:themeTint="BF"/>
+          <w:u w:val="single"/>
+        </w:rPr>
+      </w:r>
+      <w:r>
+        <w:rPr>
+          <w:b/>
+          <w:bCs/>
+          <w:color w:val="215E99" w:themeColor="text2" w:themeTint="BF"/>
+          <w:u w:val="single"/>
+        </w:rPr>
+      </w:r>
+      <w:r>
+        <w:rPr>
+          <w:b/>
+          <w:bCs/>
+          <w:color w:val="215E99" w:themeColor="text2" w:themeTint="BF"/>
+          <w:u w:val="single"/>
+        </w:rPr>
+      </w:r>
+      <w:r/>
       <w:r>
         <w:rPr>
           <w:b/>
           <w:bCs/>
           <w:u w:val="thick"/>
         </w:rPr>
-        <w:t>A Ren class, Holy class</w:t>
       </w:r>
     </w:p>
     <w:p>
@@ -32496,6 +32449,411 @@
     <w:p>
       <w:r>
         <w:t>Race: Fallen Angel</w:t>
+      </w:r>
+    </w:p>
+    <w:p>
+      <w:pPr>
+        <w:pStyle w:val="Heading1"/>
+      </w:pPr>
+      <w:r>
+        <w:t>Race Appearances</w:t>
+      </w:r>
+    </w:p>
+    <w:p>
+      <w:r>
+        <w:t>In addition to their rank-level appearance, each race type carries a baseline appearance. Below are the appearance traits for the six living races.</w:t>
+      </w:r>
+    </w:p>
+    <w:p>
+      <w:pPr>
+        <w:pStyle w:val="Heading2"/>
+      </w:pPr>
+      <w:r>
+        <w:t>Cherubim</w:t>
+      </w:r>
+    </w:p>
+    <w:p>
+      <w:r>
+        <w:t>Skin: Luminous, pale gold like sunlight through marble, holding light rather than reflecting it, faintly radiant at the edges.</w:t>
+      </w:r>
+    </w:p>
+    <w:p>
+      <w:r>
+        <w:t>Build: Tall and statuesque, carrying themselves like living monuments, regal, unhurried, impossible to rush.</w:t>
+      </w:r>
+    </w:p>
+    <w:p>
+      <w:r>
+        <w:t>Eyes: Pure radiant gold with no visible pupil, glowing steady and calm with the same light as their halo.</w:t>
+      </w:r>
+    </w:p>
+    <w:p>
+      <w:r>
+        <w:t>Presence: Their Angelic Aura is so pure it visibly brightens the air around them, a quiet, overwhelming weight that makes lesser beings lower their gaze.</w:t>
+      </w:r>
+    </w:p>
+    <w:p>
+      <w:pPr>
+        <w:pStyle w:val="Heading2"/>
+      </w:pPr>
+      <w:r>
+        <w:t>Malakhim</w:t>
+      </w:r>
+    </w:p>
+    <w:p>
+      <w:r>
+        <w:t>Skin: Fair, luminous, holding a soft white-gold glow, less radiant than a Cherubim's deep gold luminance, but still clearly not human.</w:t>
+      </w:r>
+    </w:p>
+    <w:p>
+      <w:r>
+        <w:t>Build: Upright and disciplined, built for duty and combat readiness rather than a Cherubim's towering presence.</w:t>
+      </w:r>
+    </w:p>
+    <w:p>
+      <w:r>
+        <w:t>Eyes: Bright, pale gold or white, glowing steadily, matching the brightness of their halo.</w:t>
+      </w:r>
+    </w:p>
+    <w:p>
+      <w:r>
+        <w:t>Presence: Their Angelic Aura is clearly visible, a genuine glow and pressure in the air around them, though not as overwhelming as a Cherubim's.</w:t>
+      </w:r>
+    </w:p>
+    <w:p>
+      <w:pPr>
+        <w:pStyle w:val="Heading2"/>
+      </w:pPr>
+      <w:r>
+        <w:t>Fiends</w:t>
+      </w:r>
+    </w:p>
+    <w:p>
+      <w:r>
+        <w:t>Skin: Deep onyx-black, almost absorbing light, with faint ember-orange cracks like cooling magma at the edges of their horns and fingers.</w:t>
+      </w:r>
+    </w:p>
+    <w:p>
+      <w:r>
+        <w:t>Build: Towering, broad, heavy, they carry themselves like living thrones.</w:t>
+      </w:r>
+    </w:p>
+    <w:p>
+      <w:r>
+        <w:t>Eyes: Smoldering embers, no visible pupil, shedding a faint heat-haze.</w:t>
+      </w:r>
+    </w:p>
+    <w:p>
+      <w:r>
+        <w:t>Presence: Their Demonic Aura is so thick it visibly darkens the air around them.</w:t>
+      </w:r>
+    </w:p>
+    <w:p>
+      <w:pPr>
+        <w:pStyle w:val="Heading2"/>
+      </w:pPr>
+      <w:r>
+        <w:t>Dregs</w:t>
+      </w:r>
+    </w:p>
+    <w:p>
+      <w:r>
+        <w:t>Skin: Rough, ashen or bruised-purple, scarred and battle-worn.</w:t>
+      </w:r>
+    </w:p>
+    <w:p>
+      <w:r>
+        <w:t>Build: Varied but hardened, soldier-like, lean and coiled.</w:t>
+      </w:r>
+    </w:p>
+    <w:p>
+      <w:r>
+        <w:t>Eyes: Bloodshot amber or sickly yellow, no warmth.</w:t>
+      </w:r>
+    </w:p>
+    <w:p>
+      <w:r>
+        <w:t>Presence: A faint, constant oppressive hum, lesser than a Fiend's, but always felt.</w:t>
+      </w:r>
+    </w:p>
+    <w:p>
+      <w:pPr>
+        <w:pStyle w:val="Heading2"/>
+      </w:pPr>
+      <w:r>
+        <w:t>Imps</w:t>
+      </w:r>
+    </w:p>
+    <w:p>
+      <w:r>
+        <w:t>Skin: Warmer and less monstrous than a Dreg's, closer to a deep violet or plum tone rather than ash or bruise-purple, unsettling mostly in how normal it can look at a glance.</w:t>
+      </w:r>
+    </w:p>
+    <w:p>
+      <w:r>
+        <w:t>Build: Lithe and human-passing, more agile than hardened, built for misdirection rather than raw force.</w:t>
+      </w:r>
+    </w:p>
+    <w:p>
+      <w:r>
+        <w:t>Eyes: Sharp, alert, with a flicker of amusement even in danger, unlike a Dreg's flat hostility.</w:t>
+      </w:r>
+    </w:p>
+    <w:p>
+      <w:r>
+        <w:t>Presence: Their aura doesn't press down the way a Fiend's or Dreg's does, it unsettles more subtly, a playful-cruel undertone that makes people uneasy without knowing exactly why.</w:t>
+      </w:r>
+    </w:p>
+    <w:p>
+      <w:pPr>
+        <w:pStyle w:val="Heading1"/>
+      </w:pPr>
+      <w:r>
+        <w:t>The World Barrier</w:t>
+      </w:r>
+    </w:p>
+    <w:p>
+      <w:r>
+        <w:t>The world barrier was raised to split the realms apart after the old race's tearing-open of the Hidden Realm nearly destroyed the world. Its magic is drawn directly from the untouched world core — the same primal source from which Veyn is pulled — rather than from any single caster, which is why it has endured without ever being re-made. The Shudon, stone golems carved from the world core, were set at every entrance between the realms to guard the barrier and keep the world from collapsing inward.</w:t>
+      </w:r>
+    </w:p>
+    <w:p>
+      <w:pPr>
+        <w:pStyle w:val="Heading1"/>
+      </w:pPr>
+      <w:r>
+        <w:t>The World Core</w:t>
+      </w:r>
+    </w:p>
+    <w:p>
+      <w:r>
+        <w:t>The world core has no mind and no body — only a will. It is the untouched source from which all Veyn flows into the world, but it does not think or feel the way a living thing does. When the world was put in danger — when the old race tore open the Hidden Realm and nearly destroyed everything — the core's will answered on its own, raising the world barrier to split the realms apart and carving the Shudon from its own stone to guard the entrances against collapse.</w:t>
+      </w:r>
+    </w:p>
+    <w:p>
+      <w:pPr>
+        <w:pStyle w:val="Heading1"/>
+      </w:pPr>
+      <w:r>
+        <w:t>The Forms of Veyn and Ren</w:t>
+      </w:r>
+    </w:p>
+    <w:p>
+      <w:pPr>
+        <w:pStyle w:val="Heading2"/>
+      </w:pPr>
+      <w:r>
+        <w:t>Holy Energy</w:t>
+      </w:r>
+    </w:p>
+    <w:p>
+      <w:r>
+        <w:t>Holy energy is Veyn purified and brightened into gold — the form of Veyn channeled by angels, saints, diviners, paladins, and other holy beings. Where raw Veyn glows a neutral silver-blue, holy energy glows gold and burns corruption on contact, so it is naturally strong against undead, miasma, and corrupted Veyn while doing little to anything uncorrupted. It is not a separate source of power — it is Veyn refined, drawn from the same world core and bound by the same limits.</w:t>
+      </w:r>
+    </w:p>
+    <w:p>
+      <w:r>
+        <w:t>Color: Gold</w:t>
+      </w:r>
+    </w:p>
+    <w:p>
+      <w:r>
+        <w:t>Nature: Purified Veyn — not a separate source</w:t>
+      </w:r>
+    </w:p>
+    <w:p>
+      <w:r>
+        <w:t>Used by: Angels, saints, diviners, paladins, and other holy beings — including the angel half of the hybrid Jaiden Marlock.</w:t>
+      </w:r>
+    </w:p>
+    <w:p>
+      <w:r>
+        <w:t>Effect: Burns corruption on contact — strong against undead, miasma, and corrupted Veyn; weak against the uncorrupted</w:t>
+      </w:r>
+    </w:p>
+    <w:p>
+      <w:pPr>
+        <w:pStyle w:val="Heading2"/>
+      </w:pPr>
+      <w:r>
+        <w:t>Corrupted Veyn</w:t>
+      </w:r>
+    </w:p>
+    <w:p>
+      <w:r>
+        <w:t>Corrupted Veyn is Veyn darkened and corrupted into a deep purple or black — the form of Veyn that demons wield, which they call miasma. Where raw Veyn glows a neutral silver-blue and holy energy brightens it into gold, corrupted Veyn darkens it, poisoning and contaminating whatever it touches. It harms humans and can contaminate holy auras and holy energy. It is not a separate source of power — it is Veyn corrupted, drawn from the same world core and bound by the same limits.</w:t>
+      </w:r>
+    </w:p>
+    <w:p>
+      <w:r>
+        <w:t>Color: Deep purple or black</w:t>
+      </w:r>
+    </w:p>
+    <w:p>
+      <w:r>
+        <w:t>Nature: Corrupted Veyn — not a separate source</w:t>
+      </w:r>
+    </w:p>
+    <w:p>
+      <w:r>
+        <w:t>Also called: Miasma</w:t>
+      </w:r>
+    </w:p>
+    <w:p>
+      <w:r>
+        <w:t>Used by: Demons</w:t>
+      </w:r>
+    </w:p>
+    <w:p>
+      <w:r>
+        <w:t>Effect: Harms humans and contaminates holy auras and holy energy</w:t>
+      </w:r>
+    </w:p>
+    <w:p>
+      <w:pPr>
+        <w:pStyle w:val="Heading2"/>
+      </w:pPr>
+      <w:r>
+        <w:t>Auric Ren</w:t>
+      </w:r>
+    </w:p>
+    <w:p>
+      <w:r>
+        <w:t>Auric Ren is Ren brightened into gold — a person’s own inner Vitality refined into a radiant, holy-tinged form, the way Holy Energy is Veyn purified. Where raw Ren glows a deep crimson, Auric Ren glows a warm white-gold, and instead of only strengthening the body it can heal and protect. Because it is still Ren — drawn from the body’s own Vitality rather than the world core — a paladin who wields Auric Ren never holds Veyn and Ren together, and so never suffers their incompatibility.</w:t>
+      </w:r>
+    </w:p>
+    <w:p>
+      <w:r>
+        <w:t>Color: Warm white-gold</w:t>
+      </w:r>
+    </w:p>
+    <w:p>
+      <w:r>
+        <w:t>Nature: Auric Ren — not a separate source</w:t>
+      </w:r>
+    </w:p>
+    <w:p>
+      <w:r>
+        <w:t>Used by: Paladins and other holy warriors</w:t>
+      </w:r>
+    </w:p>
+    <w:p>
+      <w:r>
+        <w:t>Effect: Strengthens, heals, and protects using the body’s own gold-brightened Vitality</w:t>
+      </w:r>
+    </w:p>
+    <w:p>
+      <w:pPr>
+        <w:pStyle w:val="Heading2"/>
+      </w:pPr>
+      <w:r>
+        <w:t>The Three Forms of Veyn</w:t>
+      </w:r>
+    </w:p>
+    <w:p>
+      <w:r>
+        <w:t>The three peoples of the world each draw on a different form of Veyn. Humans use raw Veyn — neutral and silver-blue, the unshaped source itself. Angels channel Holy Energy — Veyn purified into gold. Demons wield Corrupted Veyn — Veyn darkened into miasma. All three trace back to the same world core; they are not separate powers, but one Veyn expressed three ways, each reflecting the nature of those who use it.</w:t>
+      </w:r>
+    </w:p>
+    <w:p>
+      <w:pPr>
+        <w:pStyle w:val="Heading2"/>
+      </w:pPr>
+      <w:r>
+        <w:t>Holy Energy and Corrupted Veyn</w:t>
+      </w:r>
+    </w:p>
+    <w:p>
+      <w:r>
+        <w:t>Holy energy and corrupted Veyn are the two opposite poles of Veyn — one purified into gold, the other darkened into black. They are naturally at war with each other: holy energy burns corruption on contact, while corrupted Veyn contaminates and corrodes holy auras and holy energy. When they clash directly, they cancel each other out — Holy Flame and Purgatory Flames each consume the other rather than one overcoming the other.</w:t>
+      </w:r>
+    </w:p>
+    <w:p>
+      <w:pPr>
+        <w:pStyle w:val="Heading2"/>
+      </w:pPr>
+      <w:r>
+        <w:t>The Formation of Holy Energy and Corrupted Veyn</w:t>
+      </w:r>
+    </w:p>
+    <w:p>
+      <w:r>
+        <w:t>Both holy energy and corrupted Veyn are made from the same raw Veyn, but by opposite processes. Holy energy is formed through purification: a holy being burns away Veyn’s impurity — an angel through the discipline of their halo and Veyn Vow, a saint or diviner through their own holy channeling — brightening the Veyn from silver-blue into gold. Corrupted Veyn is formed through corruption: a demon turns its own Veyn inward and decomposes it into miasma, darkening and poisoning it until it stains a deep purple or black. One Veyn pulled in two directions — which is exactly why they cannot coexist and cancel each other out when they meet.</w:t>
+      </w:r>
+    </w:p>
+    <w:p>
+      <w:pPr>
+        <w:pStyle w:val="Heading2"/>
+      </w:pPr>
+      <w:r>
+        <w:t>Corruption Sickness</w:t>
+      </w:r>
+    </w:p>
+    <w:p>
+      <w:r>
+        <w:t>When a human comes into contact with corrupted Veyn, it does not kill them at once — it corrupts their own Veyn and slowly kills them over three stages, each worse than the last, like a disease eating through the body. Holy energy is the only thing that can halt or reverse it, and only in the early stages.</w:t>
+      </w:r>
+    </w:p>
+    <w:p>
+      <w:r>
+        <w:t>Stage 1 — The Taint: The corrupted Veyn darkens the Veyn at the point of contact. Symptoms: nausea, fatigue, and a faint grey-purple discoloration where it touched. Still reversible with holy energy.</w:t>
+      </w:r>
+    </w:p>
+    <w:p>
+      <w:r>
+        <w:t>Stage 2 — The Spread: The corruption spreads through the body's Veyn channels. Symptoms: constant pain, blackened veins surfacing under the skin, unstable or darkening magic, and rapid weakening. Only strong holy purification can halt it.</w:t>
+      </w:r>
+    </w:p>
+    <w:p>
+      <w:r>
+        <w:t>Stage 3 — The End: The corruption consumes the body's Veyn entirely, and the body fails as its own poisoned Veyn destroys it from within. Death is inevitable; holy energy can only ease the pain.</w:t>
+      </w:r>
+    </w:p>
+    <w:p>
+      <w:pPr>
+        <w:pStyle w:val="Heading1"/>
+      </w:pPr>
+      <w:r>
+        <w:t>The Clergy and the Healers</w:t>
+      </w:r>
+    </w:p>
+    <w:p>
+      <w:pPr>
+        <w:pStyle w:val="Heading2"/>
+      </w:pPr>
+      <w:r>
+        <w:t>Clergy</w:t>
+      </w:r>
+    </w:p>
+    <w:p>
+      <w:r>
+        <w:t>Trained in restoring injuries and health using Veyn. Anyone can join the Clergy — from among them, the Seer chooses the seven who hold the title of Healer in the Human Realm.</w:t>
+      </w:r>
+    </w:p>
+    <w:p>
+      <w:pPr>
+        <w:pStyle w:val="Heading2"/>
+      </w:pPr>
+      <w:r>
+        <w:t>Healers</w:t>
+      </w:r>
+    </w:p>
+    <w:p>
+      <w:r>
+        <w:t>There are only seven Healers in the Human Realm. Anyone can join the Clergy, but only seven at a time hold the actual title of Healer. When one of the seven dies, the Seer chooses the next Healer within two years — the Seer is the only person in the Human Realm who knows who the next Healer will be, locating them through the Truthstone.</w:t>
+      </w:r>
+    </w:p>
+    <w:p>
+      <w:pPr>
+        <w:pStyle w:val="Heading2"/>
+      </w:pPr>
+      <w:r>
+        <w:t>The Seer</w:t>
+      </w:r>
+    </w:p>
+    <w:p>
+      <w:r>
+        <w:t>One person in the Human Realm knows who the next Healer will be; this role is called The Seer. The Seer is entrusted with a gem known as The Truthstone which has the power to locate who the new Healer is. The Seer is the only one who knows the gem’s location.</w:t>
       </w:r>
     </w:p>
     <w:sectPr>

</xml_diff>

<commit_message>
Update reference docx: currency, populations, kingdoms, ruler plots, magic systems, full skill descriptions, hybrid skills, World Curse/Shudon, and renames
</commit_message>
<xml_diff>
--- a/Half_made world ideas.docx
+++ b/Half_made world ideas.docx
@@ -27634,21 +27634,19 @@
           <w:b/>
           <w:bCs/>
         </w:rPr>
-        <w:t xml:space="preserve">Grinded powder from the bark of the </w:t>
-      </w:r>
-      <w:r>
-        <w:rPr>
-          <w:b/>
-          <w:bCs/>
-        </w:rPr>
-        <w:t>Kaelroot</w:t>
-      </w:r>
-      <w:r>
-        <w:rPr>
-          <w:b/>
-          <w:bCs/>
-        </w:rPr>
-        <w:t xml:space="preserve"> tree</w:t>
+        <w:t>Grinded powder from the bark of the Ebonspire tree</w:t>
+      </w:r>
+      <w:r>
+        <w:rPr>
+          <w:b/>
+          <w:bCs/>
+        </w:rPr>
+      </w:r>
+      <w:r>
+        <w:rPr>
+          <w:b/>
+          <w:bCs/>
+        </w:rPr>
       </w:r>
     </w:p>
     <w:p>
@@ -27810,15 +27808,11 @@
           <w:color w:val="215E99" w:themeColor="text2" w:themeTint="BF"/>
           <w:u w:val="single"/>
         </w:rPr>
-        <w:t>Kaelroot tree</w:t>
-      </w:r>
-      <w:r>
-        <w:t>→</w:t>
-      </w:r>
+        <w:t xml:space="preserve">Ebonspire tree→ </w:t>
+      </w:r>
+      <w:r/>
       <w:bookmarkEnd w:id="174"/>
-      <w:r>
-        <w:t xml:space="preserve"> </w:t>
-      </w:r>
+      <w:r/>
     </w:p>
     <w:p>
       <w:pPr>
@@ -29088,15 +29082,11 @@
           <w:color w:val="215E99" w:themeColor="text2" w:themeTint="BF"/>
           <w:u w:val="single"/>
         </w:rPr>
-        <w:t>Sael's Luck</w:t>
-      </w:r>
-      <w:r>
-        <w:t>→</w:t>
-      </w:r>
+        <w:t xml:space="preserve">Selene’s Luck→ </w:t>
+      </w:r>
+      <w:r/>
       <w:bookmarkEnd w:id="186"/>
-      <w:r>
-        <w:t xml:space="preserve"> </w:t>
-      </w:r>
+      <w:r/>
     </w:p>
     <w:p>
       <w:pPr>
@@ -30729,15 +30719,11 @@
           <w:color w:val="215E99" w:themeColor="text2" w:themeTint="BF"/>
           <w:u w:val="single"/>
         </w:rPr>
-        <w:t>Sael’s Luck</w:t>
-      </w:r>
-      <w:r>
-        <w:t>→</w:t>
-      </w:r>
+        <w:t xml:space="preserve">Selene’s Luck→ </w:t>
+      </w:r>
+      <w:r/>
       <w:bookmarkEnd w:id="204"/>
-      <w:r>
-        <w:t xml:space="preserve"> </w:t>
-      </w:r>
+      <w:r/>
     </w:p>
     <w:p>
       <w:pPr>
@@ -31891,7 +31877,7 @@
     </w:p>
     <w:p>
       <w:r>
-        <w:t>A demon type set apart from the ordinary Dregs — the impish few, including Lisa and Kael Vornath the Jester demon, and the MC’s demon half.</w:t>
+        <w:t>A demon type set apart from the ordinary Dregs — the impish few, including Lisa and Laren Vornath the Jester demon, and the MC’s demon half.</w:t>
       </w:r>
     </w:p>
     <w:p>
@@ -31904,7 +31890,7 @@
         <w:pStyle w:val="Heading2"/>
       </w:pPr>
       <w:r>
-        <w:t>Vael</w:t>
+        <w:t>Aelthar</w:t>
       </w:r>
     </w:p>
     <w:p>
@@ -31914,7 +31900,7 @@
     </w:p>
     <w:p>
       <w:r>
-        <w:t>An extinct race, wiped out by the former ruler of the Human Realm, forcing the survivors to flee by tearing open the Hidden Realm as a hiding place — an act so violent it nearly destroyed the world outright. Escaping the ruler didn’t save them: once inside, the realm’s own creatures began forming almost immediately, and the Vael had no way to survive against them. Nearly the entire race died out inside the very refuge they built, save for one survivor — the Headmaster of the Academy — who alone learned to endure it and later became the only person to ever successfully brew the Ethereal Potion.</w:t>
+        <w:t>An extinct race, wiped out by the former ruler of the Human Realm, forcing the survivors to flee by tearing open the Hidden Realm as a hiding place — an act so violent it nearly destroyed the world outright. Escaping the ruler didn’t save them: once inside, the realm’s own creatures began forming almost immediately, and the Aelthar had no way to survive against them. Nearly the entire race died out inside the very refuge they built, save for one survivor — the Headmaster of the Academy — who alone learned to endure it and later became the only person to ever successfully brew the Ethereal Potion.</w:t>
       </w:r>
     </w:p>
     <w:p>
@@ -32069,7 +32055,7 @@
     </w:p>
     <w:p>
       <w:r>
-        <w:t>Skills: Dread-Herald, Unheralded, Kneel</w:t>
+        <w:t>Skills: Dread-Herald, Unheralded, Dreadweight</w:t>
       </w:r>
     </w:p>
     <w:p>
@@ -32182,7 +32168,7 @@
         <w:pStyle w:val="Heading2"/>
       </w:pPr>
       <w:r>
-        <w:t>Kael Vornath — Jester demon</w:t>
+        <w:t>Laren Vornath — Jester demon</w:t>
       </w:r>
     </w:p>
     <w:p>
@@ -32368,12 +32354,12 @@
         <w:pStyle w:val="Heading2"/>
       </w:pPr>
       <w:r>
-        <w:t>The Vael</w:t>
-      </w:r>
-    </w:p>
-    <w:p>
-      <w:r>
-        <w:t>The Vael were an ancient race of realm-makers, wiped out by the former ruler of the Human Realm. Their survivors tore open the Hidden Realm as a hiding place, an act so violent it nearly destroyed the world, but even that refuge could not save them — the realm’s creatures formed almost immediately and the Vael died out inside it, leaving one survivor: the Headmaster of the Academy, who alone learned to endure the realm and became the only person to ever brew the Ethereal Potion.</w:t>
+        <w:t>The Aelthar</w:t>
+      </w:r>
+    </w:p>
+    <w:p>
+      <w:r>
+        <w:t>The Aelthar were an ancient race of realm-makers, wiped out by the former ruler of the Human Realm. Their survivors tore open the Hidden Realm as a hiding place, an act so violent it nearly destroyed the world, but even that refuge could not save them — the realm’s creatures formed almost immediately and the Aelthar died out inside it, leaving one survivor: the Headmaster of the Academy, who alone learned to endure the realm and became the only person to ever brew the Ethereal Potion.</w:t>
       </w:r>
     </w:p>
     <w:p>
@@ -32399,7 +32385,7 @@
     </w:p>
     <w:p>
       <w:r>
-        <w:t>Race: Vael</w:t>
+        <w:t>Race: Aelthar</w:t>
       </w:r>
     </w:p>
     <w:p>
@@ -32854,6 +32840,1046 @@
     <w:p>
       <w:r>
         <w:t>One person in the Human Realm knows who the next Healer will be; this role is called The Seer. The Seer is entrusted with a gem known as The Truthstone which has the power to locate who the new Healer is. The Seer is the only one who knows the gem’s location.</w:t>
+      </w:r>
+    </w:p>
+    <w:p>
+      <w:pPr>
+        <w:pStyle w:val="Heading1"/>
+      </w:pPr>
+      <w:r>
+        <w:t>Currency</w:t>
+      </w:r>
+    </w:p>
+    <w:p>
+      <w:r>
+        <w:t>The single currency used across all three realms, minted in three metals. One hundred silver sigils make one gold sigil, and one thousand gold sigils make one platinum sigil — so a single platinum sigil is worth one hundred thousand silver. The same coins circulate in the Human, Angel, and Demon Realms alike.</w:t>
+      </w:r>
+    </w:p>
+    <w:p>
+      <w:r>
+        <w:t>Silver Sigil — The lowest tier of currency, used for everyday purchases. One hundred silver sigils are worth one gold sigil.</w:t>
+      </w:r>
+    </w:p>
+    <w:p>
+      <w:r>
+        <w:t>Gold Sigil — The middle tier of currency. One gold sigil is worth one hundred silver, and one thousand gold sigils are worth one platinum sigil.</w:t>
+      </w:r>
+    </w:p>
+    <w:p>
+      <w:r>
+        <w:t>Platinum Sigil — The highest tier of currency, reserved for large transactions and wealth. One platinum sigil is worth one thousand gold, or one hundred thousand silver.</w:t>
+      </w:r>
+    </w:p>
+    <w:p>
+      <w:pPr>
+        <w:pStyle w:val="Heading1"/>
+      </w:pPr>
+      <w:r>
+        <w:t>Realm Populations</w:t>
+      </w:r>
+    </w:p>
+    <w:p>
+      <w:pPr>
+        <w:pStyle w:val="Heading2"/>
+      </w:pPr>
+      <w:r>
+        <w:t>Human Realm</w:t>
+      </w:r>
+    </w:p>
+    <w:p>
+      <w:r>
+        <w:t>The realm of humanity. It has a large population, likely in the hundreds of thousands, which is part of why only having 7 Healers at any given time is considered so rare and significant. The Arubian Forest, the light half of the Ether Forest, lies within it, along with its own ruler, Ruby Divina.</w:t>
+      </w:r>
+    </w:p>
+    <w:p>
+      <w:pPr>
+        <w:pStyle w:val="Heading2"/>
+      </w:pPr>
+      <w:r>
+        <w:t>Angel Realm</w:t>
+      </w:r>
+    </w:p>
+    <w:p>
+      <w:r>
+        <w:t>The home of the angels. The Lumen, the lowest-ranking angels, are its citizens and almost never leave it. Lethmoor, a fallen kingdom recorded in this realm, was later replicated inside the Hidden Realm. Ruled by Clint Ashborn, a Serapharch. Its population is small — only in the tens of thousands, a single city’s worth — because angels barely die and do not breed the way humans do; that smallness is what lets the Veyn Vow and the rank hierarchy hold the whole realm in perfect order, and why the loss of even one of the Six Pillars stung so deeply.</w:t>
+      </w:r>
+    </w:p>
+    <w:p>
+      <w:pPr>
+        <w:pStyle w:val="Heading2"/>
+      </w:pPr>
+      <w:r>
+        <w:t>Demon Realm</w:t>
+      </w:r>
+    </w:p>
+    <w:p>
+      <w:r>
+        <w:t>The home of the demons, ruled by Tera Morage, a Mordrach. The Umbrage Forest, the dark half of the Ether Forest, is located here, where all the hostile monsters stay. Its population runs into the hundreds of thousands but never holds still — demons die in droves and must breed fast just to keep the ranks filled, which is why the Demon Realm alone can field its endless armies.</w:t>
+      </w:r>
+    </w:p>
+    <w:p>
+      <w:pPr>
+        <w:pStyle w:val="Heading1"/>
+      </w:pPr>
+      <w:r>
+        <w:t>The Three Kingdoms</w:t>
+      </w:r>
+    </w:p>
+    <w:p>
+      <w:pPr>
+        <w:pStyle w:val="Heading2"/>
+      </w:pPr>
+      <w:r>
+        <w:t>Aldermere</w:t>
+      </w:r>
+    </w:p>
+    <w:p>
+      <w:r>
+        <w:t>The kingdom of the Human Realm</w:t>
+      </w:r>
+    </w:p>
+    <w:p>
+      <w:r>
+        <w:t>The ruling kingdom of the Human Realm, seat of Ruby Divina. Unlike the other realms’ capitals, Aldermere governs no rigid caste or rank — its people are the varied hundreds of thousands of humanity, and its ruler holds power through political skill and the trust of that population rather than divine right or raw strength.</w:t>
+      </w:r>
+    </w:p>
+    <w:p>
+      <w:pPr>
+        <w:pStyle w:val="Heading2"/>
+      </w:pPr>
+      <w:r>
+        <w:t>Aurelion</w:t>
+      </w:r>
+    </w:p>
+    <w:p>
+      <w:r>
+        <w:t>The kingdom of the Angel Realm</w:t>
+      </w:r>
+    </w:p>
+    <w:p>
+      <w:r>
+        <w:t>The ruling kingdom of the Angel Realm, seat of the Serapharch Clint Ashborn. Built around the throne, it is home to the angelic hierarchy at its purest — the Six Pillars, the Veyn Vow, and the ranks held in order. Its population numbers only in the tens of thousands, small enough to be governed perfectly.</w:t>
+      </w:r>
+    </w:p>
+    <w:p>
+      <w:pPr>
+        <w:pStyle w:val="Heading2"/>
+      </w:pPr>
+      <w:r>
+        <w:t>Vorath</w:t>
+      </w:r>
+    </w:p>
+    <w:p>
+      <w:r>
+        <w:t>The kingdom of the Demon Realm</w:t>
+      </w:r>
+    </w:p>
+    <w:p>
+      <w:r>
+        <w:t>The ruling kingdom of the Demon Realm, seat of the Mordrach Tera Morage. A city that never sleeps, its hundreds of thousands churning as demons kill their way up the ranks and breed to fill what battle empties. It is the only realm capital that fields endless armies.</w:t>
+      </w:r>
+    </w:p>
+    <w:p>
+      <w:pPr>
+        <w:pStyle w:val="Heading1"/>
+      </w:pPr>
+      <w:r>
+        <w:t>The Four Rulers</w:t>
+      </w:r>
+    </w:p>
+    <w:p>
+      <w:pPr>
+        <w:pStyle w:val="Heading2"/>
+      </w:pPr>
+      <w:r>
+        <w:t>Ruby Divina</w:t>
+      </w:r>
+    </w:p>
+    <w:p>
+      <w:r>
+        <w:t>Ruler of the Human Realm (Female)</w:t>
+      </w:r>
+    </w:p>
+    <w:p>
+      <w:r>
+        <w:t>Ruby Divina is the only mortal ruler in a world governed by immortals — Clint Ashborn does not age, and Tera Morage dies of nothing short of a Divine Weapon, while Ruby will be gone within a mortal lifetime and knows it. She rules humanity, the one people with no wings, no halo, no miasma — just raw Veyn and short years — caught between two realms that could crush hers on a whim. Her whole reign has been the slow, careful work of making humanity too useful and too dangerous to be worth crushing. She has known about Jaiden Marlock from the beginning — the hybrid child hiding in her realm under a maid’s care is no secret to her — and she has shielded him not from kindness but because he is her insurance: a being both realms would go to war over, the one card that could make humanity a power instead of a client.</w:t>
+      </w:r>
+    </w:p>
+    <w:p>
+      <w:pPr>
+        <w:pStyle w:val="Heading2"/>
+      </w:pPr>
+      <w:r>
+        <w:t>Clint Ashborn</w:t>
+      </w:r>
+    </w:p>
+    <w:p>
+      <w:r>
+        <w:t>Ruler of the Angel Realm — Serapharch (Male)</w:t>
+      </w:r>
+    </w:p>
+    <w:p>
+      <w:r>
+        <w:t>Clint Ashborn has ruled the Angel Realm so long the realm has forgotten there was ever another way. He ordered his own right-hand man, Ordium, executed for loving a demon and fathering the hybrid child — and to Clint that was not cruelty but necessity, the one clean cut that kept chaos from the door. He believes the Veyn Vow and the hierarchy are the only things standing between order and the collapse of everything, and he administers that belief with the serenity of a man who has never once doubted he was saving the world. He knows the buried truth of the world core’s will, and it frightens him more than any demon, because a will greater than the angelic order would mean the order he has upheld his whole existence is not the highest thing there is. Every impossible thing Jaiden Marlock is, is a refutation of Clint’s entire life — which is what makes him so dangerous an enemy: he is not wrong that the hybrid threatens the world’s balance, only wrong about what to do with it.</w:t>
+      </w:r>
+    </w:p>
+    <w:p>
+      <w:pPr>
+        <w:pStyle w:val="Heading2"/>
+      </w:pPr>
+      <w:r>
+        <w:t>Tera Morage</w:t>
+      </w:r>
+    </w:p>
+    <w:p>
+      <w:r>
+        <w:t>Ruler of the Demon Realm — Mordrach (Female)</w:t>
+      </w:r>
+    </w:p>
+    <w:p>
+      <w:r>
+        <w:t>Tera Morage did not inherit the Mordrach’s crown — she tore it from the king before her, the way every Fiend who ever ruled the Demon Realm rose by killing the one above, and she has never once relaxed her grip since. Unkillable by anything short of a Divine Weapon, she let that invulnerability curdle into contempt, ruling her generals and her right-hand men with the certainty that nothing in the realm can touch her. The single exception was Lisa. Lisa was not merely her right-hand — she was her friend, the one demon Tera trusted enough to keep close — and so when Licent Varak brought her the truth of Lisa’s affair with an angel, Tera did what no Mordrach is supposed to do: she showed mercy. She demoted Lisa to Gnash, a punishment meant to hurt but not to kill, because in a realm where strength is the only truth, that was the softest sentence she could pass without appearing weak. It was still a death sentence. Licent, who had only ever hated Lisa, had her killed by his own men — and Tera, who can be killed by nothing in her realm, learned that the one law she cannot bend is the one that put her on the throne: when a Mordrach dies, all the Veyn she holds passes to the heir who can withstand it. Her court is a circle of knives, every one of them waiting for a Divine Weapon to appear, and Licent Varak, her own second right-hand, is already in the dark with Dark Moon. She does not see it, because she has spent so long fearing nothing that she has forgotten how to fear her own shadow.</w:t>
+      </w:r>
+    </w:p>
+    <w:p>
+      <w:pPr>
+        <w:pStyle w:val="Heading2"/>
+      </w:pPr>
+      <w:r>
+        <w:t>Wener Leger</w:t>
+      </w:r>
+    </w:p>
+    <w:p>
+      <w:r>
+        <w:t>Leader of Dark Moon</w:t>
+      </w:r>
+    </w:p>
+    <w:p>
+      <w:r>
+        <w:t>Wener Leger was cast out of the Angel Realm, and Dark Moon is what he built from the wreckage of that fall — not a refuge, but a blade pointed back at everything that discarded him. Its goal is exactly what it sounds like: domination of the Realms, with Wener at the top, and he is patient enough to hide behind a swordsmanship teacher’s post at Elyndor Academy while he pieces the world’s next tyrant together from its own cast-offs. He recruits the desperate and the disgraced — fallen angels, banished demons, and now Licent Varak’s raw ambition — not to free them, but to use them, because the broken are the cheapest soldiers and the easiest to convince they are owed something. He is watching Jaiden Marlock, the first hybrid, the way a collector watches a rare weapon he has not yet decided how to wield. There is no higher cause beneath Dark Moon’s banner and no hidden mercy in its leader; Wener does not want to save the world from its lies. He wants to own it, and he has spent his long exile learning exactly how.</w:t>
+      </w:r>
+    </w:p>
+    <w:p>
+      <w:pPr>
+        <w:pStyle w:val="Heading1"/>
+      </w:pPr>
+      <w:r>
+        <w:t>The Ruler Plots</w:t>
+      </w:r>
+    </w:p>
+    <w:p>
+      <w:pPr>
+        <w:pStyle w:val="Heading2"/>
+      </w:pPr>
+      <w:r>
+        <w:t>Ruby Divina’s Plot</w:t>
+      </w:r>
+    </w:p>
+    <w:p>
+      <w:r>
+        <w:t>Ruby Divina is the only mortal ruler in a world governed by immortals, and she has spent her entire reign making humanity too useful — and too dangerous — to be worth crushing. She has known about Jaiden Marlock from the beginning: the hybrid hiding in her realm under a maid’s care is no secret to her, and she has shielded him not from kindness but because he is her insurance, the one being both realms would go to war over. As Jaiden grows into his strength, she is forced to choose what she has spent her life avoiding — keep sheltering the boy who could make humanity a power, or hand him to whichever realm offers the better terms. Her choice, when it comes, decides whether humanity survives free or becomes a vassal, and whether Ruby Divina is remembered as the ruler who saved her people or the one who sold the world’s last hope.</w:t>
+      </w:r>
+    </w:p>
+    <w:p>
+      <w:pPr>
+        <w:pStyle w:val="Heading2"/>
+      </w:pPr>
+      <w:r>
+        <w:t>Clint Ashborn’s Plot</w:t>
+      </w:r>
+    </w:p>
+    <w:p>
+      <w:r>
+        <w:t>Clint Ashborn has ruled the Angel Realm so long the realm has forgotten there was ever another way. He ordered his own right-hand man, Ordium, executed for loving a demon and fathering the hybrid child, and he calls it mercy — the one clean cut that kept chaos from the door. He believes the Veyn Vow and the hierarchy are the only things standing between order and the collapse of everything. But every impossible thing Jaiden Marlock is, is a refutation of Clint’s entire life, and as the hybrid grows, Clint is set on a collision course with the child he tried to prevent — an enemy he cannot dismiss, because he is not wrong that the hybrid threatens the world’s balance, only wrong about what to do with it.</w:t>
+      </w:r>
+    </w:p>
+    <w:p>
+      <w:pPr>
+        <w:pStyle w:val="Heading2"/>
+      </w:pPr>
+      <w:r>
+        <w:t>Tera Morage’s Plot</w:t>
+      </w:r>
+    </w:p>
+    <w:p>
+      <w:r>
+        <w:t>Tera Morage did not inherit the Mordrach’s crown — she tore it from the king before her, the way every Fiend who ever ruled the Demon Realm rose by killing the one above, and she has never once relaxed her grip since. Unkillable by anything short of a Divine Weapon, she let that invulnerability curdle into contempt, ruling her generals and her right-hand men with the certainty that nothing in the realm can touch her. The single exception was Lisa. Lisa was not merely her right-hand — she was her friend, the one demon Tera trusted enough to keep close — and so when Licent Varak brought her the truth of Lisa’s affair with an angel, Tera did what no Mordrach is supposed to do: she showed mercy. She demoted Lisa to Gnash, a punishment meant to hurt but not to kill, because in a realm where strength is the only truth, that was the softest sentence she could pass without appearing weak. It was still a death sentence. Licent, who had only ever hated Lisa, had her killed by his own men — and Tera, who can be killed by nothing in her realm, learned that the one law she cannot bend is the one that put her on the throne: when a Mordrach dies, all the Veyn she holds passes to the heir who can withstand it. Her court is a circle of knives, every one of them waiting for a Divine Weapon to appear, and Licent Varak, her own second right-hand, is already in the dark with Dark Moon. She does not see it, because she has spent so long fearing nothing that she has forgotten how to fear her own shadow.</w:t>
+      </w:r>
+    </w:p>
+    <w:p>
+      <w:pPr>
+        <w:pStyle w:val="Heading2"/>
+      </w:pPr>
+      <w:r>
+        <w:t>Wener Leger’s Plot</w:t>
+      </w:r>
+    </w:p>
+    <w:p>
+      <w:r>
+        <w:t>Wener Leger was cast out of the Angel Realm, and Dark Moon is the blade he built from the wreckage of that fall. Its goal is domination of the Realms, with Wener at the top, and he is patient enough to hide behind a swordsmanship teacher’s post at Elyndor Academy while he pieces the world’s next tyrant together from its own cast-offs — the fallen, the banished, the disgraced, and Licent Varak’s raw ambition. He is watching Jaiden Marlock, the first hybrid, the way a collector watches a rare weapon he has not yet decided how to wield. There is no higher cause and no hidden mercy in Wener; he does not want to save the world from its lies. He wants to own it.</w:t>
+      </w:r>
+    </w:p>
+    <w:p>
+      <w:pPr>
+        <w:pStyle w:val="Heading1"/>
+      </w:pPr>
+      <w:r>
+        <w:t>Magic Systems</w:t>
+      </w:r>
+    </w:p>
+    <w:p>
+      <w:pPr>
+        <w:pStyle w:val="Heading2"/>
+      </w:pPr>
+      <w:r>
+        <w:t>Auric Ren</w:t>
+      </w:r>
+    </w:p>
+    <w:p>
+      <w:r>
+        <w:t>Auric Ren is Ren brightened into gold — a person’s own inner Vitality refined into a radiant, holy-tinged form, the way Holy Energy is Veyn purified. Where raw Ren glows a deep crimson, Auric Ren glows a warm white-gold, and instead of only strengthening the body it can heal and protect. Because it is still Ren — drawn from the body’s own Vitality rather than the world core — a paladin who wields Auric Ren never holds Veyn and Ren together, and so never suffers their incompatibility.</w:t>
+      </w:r>
+    </w:p>
+    <w:p>
+      <w:pPr>
+        <w:pStyle w:val="Heading2"/>
+      </w:pPr>
+      <w:r>
+        <w:t>Corruption Sickness</w:t>
+      </w:r>
+    </w:p>
+    <w:p>
+      <w:r>
+        <w:t>When a human comes into contact with corrupted Veyn, it does not kill them at once — it corrupts their own Veyn and slowly kills them over three stages, each worse than the last, like a disease eating through the body. Holy energy is the only thing that can halt or reverse it, and only in the early stages.</w:t>
+      </w:r>
+    </w:p>
+    <w:p>
+      <w:r>
+        <w:t>Stage 1 — The Taint: The corrupted Veyn darkens the Veyn at the point of contact. Symptoms: nausea, fatigue, and a faint grey-purple discoloration where it touched. Still reversible with holy energy.</w:t>
+      </w:r>
+    </w:p>
+    <w:p>
+      <w:r>
+        <w:t>Stage 2 — The Spread: The corruption spreads through the body's Veyn channels. Symptoms: constant pain, blackened veins surfacing under the skin, unstable or darkening magic, and rapid weakening. Only strong holy purification can halt it.</w:t>
+      </w:r>
+    </w:p>
+    <w:p>
+      <w:r>
+        <w:t>Stage 3 — The End: The corruption consumes the body's Veyn entirely, and the body fails as its own poisoned Veyn destroys it from within. Death is inevitable; holy energy can only ease the pain.</w:t>
+      </w:r>
+    </w:p>
+    <w:p>
+      <w:pPr>
+        <w:pStyle w:val="Heading1"/>
+      </w:pPr>
+      <w:r>
+        <w:t>The World Curse</w:t>
+      </w:r>
+    </w:p>
+    <w:p>
+      <w:r>
+        <w:t>Forms a rune collar around the person’s neck. The bearer is unavoidably hunted by the Shudon when spotted and will be killed.</w:t>
+      </w:r>
+    </w:p>
+    <w:p>
+      <w:r>
+        <w:t>Brand: Makes a rune-like design around the person’s neck and can awaken the golems to hunt the person down. With this mark on, teleportation out of the realm or place is blocked and rendered unusable.</w:t>
+      </w:r>
+    </w:p>
+    <w:p>
+      <w:r>
+        <w:t>Ban: Blocks any use of teleportation out of the realm, and the bearer is hunted down and killed by the Shudon. This means you are locked down and stuck in the realm you were in when you got it.</w:t>
+      </w:r>
+    </w:p>
+    <w:p>
+      <w:r>
+        <w:t>Mark: This mark can’t be hidden or removed by any means.</w:t>
+      </w:r>
+    </w:p>
+    <w:p>
+      <w:pPr>
+        <w:pStyle w:val="Heading2"/>
+      </w:pPr>
+      <w:r>
+        <w:t>Shudon</w:t>
+      </w:r>
+    </w:p>
+    <w:p>
+      <w:r>
+        <w:t>They are highly intelligent stone golems that are skilled in combat. They are made from the core of the world to protect the realms from collapse, though they have been inactive for a long time. The entrances to the three main realms — the Human, Angel, and Demon Realms — are each guarded by a Shudon. The Hidden Realm is not guarded by them; its only entrance is the wandering portal.</w:t>
+      </w:r>
+    </w:p>
+    <w:p>
+      <w:r>
+        <w:t>Status: Inactive for a long time; no one currently knows how to reactivate them.</w:t>
+      </w:r>
+    </w:p>
+    <w:p>
+      <w:r>
+        <w:t>Plot: They become active later in the story.</w:t>
+      </w:r>
+    </w:p>
+    <w:p>
+      <w:r>
+        <w:t>Body: They are completely immune to any form of magic — raw Veyn, Holy Energy, and Corrupted Veyn are all ineffective against them.</w:t>
+      </w:r>
+    </w:p>
+    <w:p>
+      <w:r>
+        <w:t>Control: They act out the will of the world core</w:t>
+      </w:r>
+    </w:p>
+    <w:p>
+      <w:r>
+        <w:t>Hostile: They are hostile to the bearers of the world curse mark</w:t>
+      </w:r>
+    </w:p>
+    <w:p>
+      <w:r>
+        <w:t>Unknown: People still don’t know much about the mark — or even that someone with it can activate a golem, which would then make it the golem’s goal to kill that person.</w:t>
+      </w:r>
+    </w:p>
+    <w:p>
+      <w:pPr>
+        <w:pStyle w:val="Heading1"/>
+      </w:pPr>
+      <w:r>
+        <w:t>Smithing — the Veyn/Ren Exception</w:t>
+      </w:r>
+    </w:p>
+    <w:p>
+      <w:r>
+        <w:t>Crafts weapons and armor using Veyn to reinforce or enchant them during the forging process. Blood-forging (using demon or angel blood in the forge) is one of the hardest skills in this class to learn — not every Smith can do it, since demon and angel blood is reactive to Veyn, and a mistake can cause the death of the smith. Smithing is the one exception to the Veyn and Ren incompatibility: a Smith may draw on both during the forge, but this comes at a heavy price — any skill they learned before taking up Smithing is lost, and they can never learn or use any skill outside Smithing and the forging of weapons.</w:t>
+      </w:r>
+    </w:p>
+    <w:p>
+      <w:pPr>
+        <w:pStyle w:val="Heading1"/>
+      </w:pPr>
+      <w:r>
+        <w:t>Skill Descriptions</w:t>
+      </w:r>
+    </w:p>
+    <w:p>
+      <w:pPr>
+        <w:pStyle w:val="Heading2"/>
+      </w:pPr>
+      <w:r>
+        <w:t>Angel Skills</w:t>
+      </w:r>
+    </w:p>
+    <w:p>
+      <w:r>
+        <w:t>Kings Record — By making physical contact, the user can view fragments of a target's memories and past experiences. The clearer the contact and the stronger the user's focus, the more detailed the visions become.</w:t>
+      </w:r>
+    </w:p>
+    <w:p>
+      <w:r>
+        <w:t>Sixth Sense — Sharpens every one of the user's senses far beyond normal limits. Sight can pierce darkness and illusion, hearing can catch heartbeats and distant footsteps, smell can track individuals across long distances, and touch can feel shifts in Veyn and emotion. At full focus, the user can perceive things that are completely invisible to the naked eye, including hidden auras, faint traces of magic, and the emotional state of those nearby.</w:t>
+      </w:r>
+    </w:p>
+    <w:p>
+      <w:r>
+        <w:t>Time Reversal — Reverses the flow of time in a small area or on a single target for up to 20 seconds, undoing recent actions or injuries within that window.</w:t>
+      </w:r>
+    </w:p>
+    <w:p>
+      <w:r>
+        <w:t>Chronos Fury — Calls down a concentrated storm of lightning onto a chosen location, striking with high precision and destructive force.</w:t>
+      </w:r>
+    </w:p>
+    <w:p>
+      <w:r>
+        <w:t>Will Mastery — Shapes pure Veyn into any weapon the user can imagine. The formed weapons can also launch sharp blades of compressed air from a distance.</w:t>
+      </w:r>
+    </w:p>
+    <w:p>
+      <w:r>
+        <w:t>Holy Rain — Summons a rain of purified holy energy that burns undead and corrupted beings while healing allies and restoring their Veyn.</w:t>
+      </w:r>
+    </w:p>
+    <w:p>
+      <w:r>
+        <w:t>Dignified Presence — The user floods the surrounding area with their own Veyn, thickening the air until it becomes heavy and oppressive. Breathing grows difficult, movement slows, and weaker opponents struggle to stay upright or form skills. The more Veyn the user pours into it, the denser and more crushing the pressure becomes.</w:t>
+      </w:r>
+    </w:p>
+    <w:p>
+      <w:r>
+        <w:t>Angelic Aura (Serapharch) — A constant, overwhelming presence that presses down on anyone weaker. It strips away the will to resist, making targets feel an instinctive urge to bow or submit. Even strong opponents feel their resolve weaken under its weight.</w:t>
+      </w:r>
+    </w:p>
+    <w:p>
+      <w:r>
+        <w:t>Holy Flame — A signature skill of the Serapharch: flames made from pure holy energy that burn corruption on contact. Unlike Purgatory Flames, which simply burns until released, Holy Flame actively consumes anything tied to corrupted Veyn — demons, undead, or miasma take heavy damage from it, while anything untouched by corruption barely feels it. One of the few things capable of matching Purgatory Flames head-on; the two effectively cancel each other out if they clash directly.</w:t>
+      </w:r>
+    </w:p>
+    <w:p>
+      <w:r>
+        <w:t>God's Index Finger — Manifests a massive golden finger that can press down on a target to suppress their movement and power. It can also shrink into an extension of the user's own hand for close combat.</w:t>
+      </w:r>
+    </w:p>
+    <w:p>
+      <w:r>
+        <w:t>God Chain — Creates strong chains of light that bind a target's body and restrict their ability to move or cast skills.</w:t>
+      </w:r>
+    </w:p>
+    <w:p>
+      <w:r>
+        <w:t>Holy Grail — Manifests a sphere of pure holy fire that burns with the heat of a true sun. The user can shrink it down to the size of a pebble for extreme concentrated power, or expand it into a larger form. The bigger it becomes, the more Veyn it costs and the more the heat spreads, though the focused small form is far more destructive against a single target.</w:t>
+      </w:r>
+    </w:p>
+    <w:p>
+      <w:r>
+        <w:t>Warpstep — Allows the user to instantly relocate to any point within 6 meters by folding space with Veyn.</w:t>
+      </w:r>
+    </w:p>
+    <w:p>
+      <w:r>
+        <w:t>Dawnveil (Serapharch) — The highest form of the innate angelic disguise. The user can perfectly hide their wings, halo, aura, and true nature, blending flawlessly into any society. Even strong magical senses struggle to see through it. The disguise costs almost no effort to maintain at this rank.</w:t>
+      </w:r>
+    </w:p>
+    <w:p>
+      <w:r>
+        <w:t>Skyward Chains — A lesser form of God Chain. Forms lighter chains that still restrain a target but are easier to break with enough force.</w:t>
+      </w:r>
+    </w:p>
+    <w:p>
+      <w:r>
+        <w:t>Vanguard's Cry — A powerful battle shout that temporarily strengthens the bodies and resolve of all angels under the user's command.</w:t>
+      </w:r>
+    </w:p>
+    <w:p>
+      <w:r>
+        <w:t>Aegis Ward — Forms a solid barrier of light and condensed Veyn that can block incoming attacks. Maintaining the barrier continuously drains the user's regenerative ability.</w:t>
+      </w:r>
+    </w:p>
+    <w:p>
+      <w:r>
+        <w:t>Holy Mend — A weaker version of Holy Rain. Heals allies and harms undead in a smaller area with reduced potency.</w:t>
+      </w:r>
+    </w:p>
+    <w:p>
+      <w:r>
+        <w:t>Angelic Aura (Aetherblade) — A powerful but lesser version of the Serapharch's aura. It creates heavy pressure that makes weaker beings hesitate and struggle to fight at full strength. Not as absolute as the highest rank, but still difficult to ignore.</w:t>
+      </w:r>
+    </w:p>
+    <w:p>
+      <w:r>
+        <w:t>Swiftstep — The user folds space in an instant, vanishing from their current position and reappearing up to 3 meters away in a blink. The movement is nearly impossible to track with the naked eye, allowing them to slip behind an opponent, dodge a fatal strike, or close distance before the enemy can react. Though shorter in range than Warpstep, its speed and low Veyn cost make it ideal for rapid, repeated use in close combat.</w:t>
+      </w:r>
+    </w:p>
+    <w:p>
+      <w:r>
+        <w:t>Dawnveil (Aetherblade) — Allows the user to hide their true form and aura, blending into normal society. The disguise is solid but not perfect — close inspection or strong magical senses can reveal subtle flaws.</w:t>
+      </w:r>
+    </w:p>
+    <w:p>
+      <w:r>
+        <w:t>Guiding Light — A gentle healing touch that closes minor wounds. It has no effect on undead or heavily corrupted beings.</w:t>
+      </w:r>
+    </w:p>
+    <w:p>
+      <w:r>
+        <w:t>Radiant Strike — Infuses the user's weapon with a faint holy charge, causing extra damage to undead and demons on contact.</w:t>
+      </w:r>
+    </w:p>
+    <w:p>
+      <w:r>
+        <w:t>Formation Discipline — When fighting near other Virtues, the user gains increased strength and defense through coordinated discipline.</w:t>
+      </w:r>
+    </w:p>
+    <w:p>
+      <w:r>
+        <w:t>Angelic Aura (Virtue) — A steady passive presence that creates unease in those nearby. It doesn't force submission, but it unsettles opponents and makes them feel watched and pressured.</w:t>
+      </w:r>
+    </w:p>
+    <w:p>
+      <w:r>
+        <w:t>Dawnveil (Virtue) — A rougher version of the disguise. It works well at a distance, but under stress or close scrutiny it becomes unstable and more likely to slip.</w:t>
+      </w:r>
+    </w:p>
+    <w:p>
+      <w:r>
+        <w:t>Warmth of the Realm — A gentle passive aura that eases minor pain, calms fear, and softens emotional distress in those nearby. It has no combat use and exists purely as a reflection of a Lumen's role as an ordinary citizen rather than a warrior.</w:t>
+      </w:r>
+    </w:p>
+    <w:p>
+      <w:r>
+        <w:t>Faint Ward — Creates a thin, fragile shield capable of blocking only a single low-power attack before shattering.</w:t>
+      </w:r>
+    </w:p>
+    <w:p>
+      <w:r>
+        <w:t>Angelic Aura (Lumen) — The weakest form. It only produces a faint sense of presence, barely noticeable unless someone is paying close attention.</w:t>
+      </w:r>
+    </w:p>
+    <w:p>
+      <w:r>
+        <w:t>Dawnveil (Lumen) — The weakest form of the angelic disguise. It can hide the user's true nature at a glance, but any close inspection or focused magical scrutiny will cause it to break almost immediately.</w:t>
+      </w:r>
+    </w:p>
+    <w:p>
+      <w:r>
+        <w:t>Angelic Aura — A constant presence that presses on the will of those weaker than the user. It creates a natural urge to submit or avoid conflict, growing stronger with higher rank.</w:t>
+      </w:r>
+    </w:p>
+    <w:p>
+      <w:r>
+        <w:t>Dawnveil — Innate to all angels. Allows them to hide their true form and aura. Effectiveness and stability scale directly with rank.</w:t>
+      </w:r>
+    </w:p>
+    <w:p>
+      <w:r>
+        <w:t>Lapse — Slows the flow of time around a single target, making their movements and reactions noticeably sluggish for a short period.</w:t>
+      </w:r>
+    </w:p>
+    <w:p>
+      <w:r>
+        <w:t>Rewind — Reverses the last few seconds of damage the user has taken, restoring the body to its previous state.</w:t>
+      </w:r>
+    </w:p>
+    <w:p>
+      <w:r>
+        <w:t>Still Hour — Freezes a target in the brief moment between one breath and the next, locking them in place for a short time.</w:t>
+      </w:r>
+    </w:p>
+    <w:p>
+      <w:r>
+        <w:t>Long Sight — Extends the user's vision across great distances within the realm, allowing them to spot threats long before they arrive.</w:t>
+      </w:r>
+    </w:p>
+    <w:p>
+      <w:r>
+        <w:t>Burning Path — Leaves a glowing trail of light on the ground that scorches and damages anyone who steps across it.</w:t>
+      </w:r>
+    </w:p>
+    <w:p>
+      <w:r>
+        <w:t>Second Sun — Creates a hovering sphere of intense light that blinds a target and marks them, making them easier to track and hit.</w:t>
+      </w:r>
+    </w:p>
+    <w:p>
+      <w:r>
+        <w:t>Battle Trance — Pushes the user into a focused state where pain no longer interferes with movement or decision-making.</w:t>
+      </w:r>
+    </w:p>
+    <w:p>
+      <w:r>
+        <w:t>Ravager’s Grasp — Violently tears a weapon or shield from an opponent's hands using raw force mixed with Veyn.</w:t>
+      </w:r>
+    </w:p>
+    <w:p>
+      <w:r>
+        <w:t>War-Worn — With every wound the user receives, their body becomes harder and more resistant to further damage.</w:t>
+      </w:r>
+    </w:p>
+    <w:p>
+      <w:r>
+        <w:t>Dread-Herald — The user speaks a single word of power that plants a deep, growing fear inside the target. The fear intensifies over time, steadily weakening the target’s will, slowing their movements, and making it harder for them to use skills. If the fear is allowed to fully mature, the target becomes temporarily paralyzed by terror or forced to flee. Stronger targets take longer to break, but the effect is harder to shake once it takes root.</w:t>
+      </w:r>
+    </w:p>
+    <w:p>
+      <w:r>
+        <w:t>Unheralded — The user vanishes from sight and reappears instantly in a location where the target least expects them. The sudden appearance carries a brief disruptive force that staggers the opponent and leaves them open for a follow-up attack. The skill can be used in rapid succession, but each use after the first becomes harder to control and costs more Veyn.</w:t>
+      </w:r>
+    </w:p>
+    <w:p>
+      <w:r>
+        <w:t>Dreadweight — Unleashes a crushing wave of pure dread that forces the target downward under its weight. The pressure slows their movements, weakens their stance, and makes it difficult for them to stay upright or use skills effectively. Stronger targets can resist being fully forced to their knees, but the oppressive weight still hampers them significantly.</w:t>
+      </w:r>
+    </w:p>
+    <w:p>
+      <w:r>
+        <w:t>Altar-Rite — Channels residual power similar to the Sundering Altar. The user can force a temporary magical binding on a target, locking them into a short-term condition or restriction (e.g., “cannot lie,” “cannot attack,” “cannot flee”) for a limited time. Stronger targets resist longer.</w:t>
+      </w:r>
+    </w:p>
+    <w:p>
+      <w:r>
+        <w:t>Vowbrand — Places a conditional curse on a target. If the target breaks a stated rule or promise, the curse activates — draining Veyn, weakening the body, or briefly locking their movements.</w:t>
+      </w:r>
+    </w:p>
+    <w:p>
+      <w:r>
+        <w:t>Truthvein — Allows the user to sense the truth behind spoken words. Lies, half-truths, and deceptions become clear. In combat, it also helps the user read feints and false openings.</w:t>
+      </w:r>
+    </w:p>
+    <w:p>
+      <w:r>
+        <w:t>All-Seeing Eye — Grants the user complete awareness of everything happening within their designated area of watch at the same time.</w:t>
+      </w:r>
+    </w:p>
+    <w:p>
+      <w:r>
+        <w:t>Warden’s Recall — Grants the user a perfect, unbreakable memory of everything they have ever personally witnessed. Every face, every conversation, every detail of a battlefield, every shift in expression is preserved with absolute clarity and can be recalled at will, no matter how much time has passed. This allows the user to notice patterns others miss, recognize people they saw only once years ago, and reconstruct events with flawless accuracy.</w:t>
+      </w:r>
+    </w:p>
+    <w:p>
+      <w:r>
+        <w:t>Warden’s Mark — Places an invisible mark on a target that allows the user to track them anywhere within the realm.</w:t>
+      </w:r>
+    </w:p>
+    <w:p>
+      <w:r>
+        <w:t>Time’s Grasp — Temporarily halts a single target's personal flow of time for a few heartbeats, freezing them in place.</w:t>
+      </w:r>
+    </w:p>
+    <w:p>
+      <w:r>
+        <w:t>The Stolen Hour — Locks a target into a short time loop of their most recent actions (usually the last 3–5 seconds). While trapped, the target is forced to endlessly re-live that same moment and cannot act outside of it. The user remains free to move, attack, or reposition during the loop. Maintaining the ability drains Veyn continuously, and stronger targets can eventually force their way out.</w:t>
+      </w:r>
+    </w:p>
+    <w:p>
+      <w:pPr>
+        <w:pStyle w:val="Heading2"/>
+      </w:pPr>
+      <w:r>
+        <w:t>Demon Skills</w:t>
+      </w:r>
+    </w:p>
+    <w:p>
+      <w:r>
+        <w:t>Death Scythe — Forms a massive scythe from pure Veyn, enchanted with an instant-death attribute. A clean cut from this weapon can end a life in a single stroke if the target is weaker or caught off guard. Its raw destructive power is the true strength of the ability.</w:t>
+      </w:r>
+    </w:p>
+    <w:p>
+      <w:r>
+        <w:t>Chain Reaper Scythe — A long chain scythe controlled entirely by the user's will. It can be compacted into a small accessory when not needed.</w:t>
+      </w:r>
+    </w:p>
+    <w:p>
+      <w:r>
+        <w:t>Call of the Dead — Tears open a temporary gate that releases a group of undead soldiers to fight under the user's command.</w:t>
+      </w:r>
+    </w:p>
+    <w:p>
+      <w:r>
+        <w:t>Dominating Will — Floods the surrounding area with the user's Veyn, thickening it until breathing becomes difficult and other people struggle to control their own magic. The denser the user makes it, the higher the Veyn cost.</w:t>
+      </w:r>
+    </w:p>
+    <w:p>
+      <w:r>
+        <w:t>Soul Oath — Allows the user to form binding contracts with anyone. Once the contract is accepted, the other party's soul is bound until the terms are fulfilled or the user willingly releases them. Breaking the contract brings severe consequences.</w:t>
+      </w:r>
+    </w:p>
+    <w:p>
+      <w:r>
+        <w:t>Veyn Decomposition (Mordrach) — The strongest form of the innate demon ability. Converts the user's Veyn into a dense, toxic miasma that poisons living beings, weakens holy energy, and contaminates the surrounding area.</w:t>
+      </w:r>
+    </w:p>
+    <w:p>
+      <w:r>
+        <w:t>Hands of Death — A rare high-rank ability. By touching a target, the user can erase a portion of their memories. The erasure is never complete, but it can remove key knowledge, skills, or recent events. Covering the body in stronger Veyn can briefly resist it.</w:t>
+      </w:r>
+    </w:p>
+    <w:p>
+      <w:r>
+        <w:t>Purgatory Flames — Summons purple flames that cling to a target and continue burning until the user releases them or the target dies. The flames are extremely difficult to extinguish and can only be reliably blocked by a strong Holy Rain.</w:t>
+      </w:r>
+    </w:p>
+    <w:p>
+      <w:r>
+        <w:t>Charm — A skill exclusive to female demons. It forces a weaker target to obey the user's spoken commands for a limited time. Stronger beings can resist or break free more easily.</w:t>
+      </w:r>
+    </w:p>
+    <w:p>
+      <w:r>
+        <w:t>Soul-Sight — Allows the user to see the flow of a target's soul, effectively predicting the direction and timing of their next attack. This ability does not work on angels of any rank.</w:t>
+      </w:r>
+    </w:p>
+    <w:p>
+      <w:r>
+        <w:t>Berserk (Mordrach) — Triggers automatically when the user's health drops critically low. Attack power and magic surge to extreme levels (roughly 20 times normal), but reasoning and self-control are sharply reduced, making the user far more reckless.</w:t>
+      </w:r>
+    </w:p>
+    <w:p>
+      <w:r>
+        <w:t>Demonic Aura (Mordrach) — The strongest form of demonic presence. It crushes the will of those weaker than the user, creating a powerful urge to bow or submit. It can be fully cloaked by Duskveil.</w:t>
+      </w:r>
+    </w:p>
+    <w:p>
+      <w:r>
+        <w:t>Duskveil (Mordrach) — The highest form of the innate demon disguise. The user can perfectly hide their true form and aura, passing even under close scrutiny. While active, it cuts the user's true strength roughly in half.</w:t>
+      </w:r>
+    </w:p>
+    <w:p>
+      <w:r>
+        <w:t>Blood Chains — Conjures chains formed from the user's own blood and infused with Veyn. These chains can bind, drag, crush, or restrain a target. The stronger and denser the user's blood, the more powerful the chains become.</w:t>
+      </w:r>
+    </w:p>
+    <w:p>
+      <w:r>
+        <w:t>Warcry of Dominion — A commanding battle shout that temporarily increases the strength and fighting spirit of all demons under the user's authority.</w:t>
+      </w:r>
+    </w:p>
+    <w:p>
+      <w:r>
+        <w:t>Crimson Ward — Forms a dense barrier of hardened blood and Veyn. It can block strong attacks, but holding it steadily drains the user's ability to regenerate.</w:t>
+      </w:r>
+    </w:p>
+    <w:p>
+      <w:r>
+        <w:t>Blood Pact — A lesser form of Soul Oath. It can bind a target to a specific task or promise, but the pact automatically breaks if the Bloodward who created it dies.</w:t>
+      </w:r>
+    </w:p>
+    <w:p>
+      <w:r>
+        <w:t>Veyn Decomposition (Bloodward) — Converts the user's Veyn into a toxic miasma that harms living beings and interferes with holy energy. Noticeably weaker than a Mordrach's version, but still dangerous in close range.</w:t>
+      </w:r>
+    </w:p>
+    <w:p>
+      <w:r>
+        <w:t>Demonic Aura (Bloodward) — A constant oppressive presence that makes those weaker feel the urge to bow or submit. It can be partially hidden with Duskveil, but not completely.</w:t>
+      </w:r>
+    </w:p>
+    <w:p>
+      <w:r>
+        <w:t>Berserk (Bloodward) — Triggers at low health. Provides a strong boost to attack power and magic (around 10 times normal) while reducing clear thinking and restraint.</w:t>
+      </w:r>
+    </w:p>
+    <w:p>
+      <w:r>
+        <w:t>Duskveil (Bloodward) — A strong but imperfect disguise. It hides the user's true nature well, though subtle tells may appear under close or magical inspection. While active, it reduces the user's true strength by roughly 60%.</w:t>
+      </w:r>
+    </w:p>
+    <w:p>
+      <w:r>
+        <w:t>Vitality Surge — The user deliberately burns their own life force, converting raw Vitality into a violent surge of physical power. Muscles strengthen, speed multiplies, and the body becomes capable of feats far beyond its normal limits for a short time. The greater the amount of life force sacrificed, the more overwhelming the boost — but the backlash leaves the user drained and vulnerable once the effect ends.</w:t>
+      </w:r>
+    </w:p>
+    <w:p>
+      <w:r>
+        <w:t>Rend Claws — The user’s claws are naturally honed to a lethal edge, dense enough to tear through most conventional armor, weapons, and reinforced materials. Each slash carries both physical cutting power and a faint trace of demonic energy, allowing them to rip open defenses that would stop ordinary blades.</w:t>
+      </w:r>
+    </w:p>
+    <w:p>
+      <w:r>
+        <w:t>Pack Tactics — When fighting near other Scourges, the user gains increased strength and defense through coordinated aggression.</w:t>
+      </w:r>
+    </w:p>
+    <w:p>
+      <w:r>
+        <w:t>Veyn Decomposition (Scourge) — A weaker form of the toxic miasma. It irritates and unsettles humans rather than truly poisoning them, and can cause confusion and mild disorientation.</w:t>
+      </w:r>
+    </w:p>
+    <w:p>
+      <w:r>
+        <w:t>Berserk (Scourge) — Triggers at low health. Offers a moderate boost (around 5 times normal) with reduced reasoning.</w:t>
+      </w:r>
+    </w:p>
+    <w:p>
+      <w:r>
+        <w:t>Demonic Aura (Scourge) — A weaker but still noticeable pressure. It unsettles those of lower rank and makes them more hesitant to oppose the user.</w:t>
+      </w:r>
+    </w:p>
+    <w:p>
+      <w:r>
+        <w:t>Duskveil (Scourge) — A rough disguise that works at a distance but is more likely to slip under stress or close scrutiny. While active, it reduces the user's true strength by roughly 70%.</w:t>
+      </w:r>
+    </w:p>
+    <w:p>
+      <w:r>
+        <w:t>Binding Contract — The signature ability of Gnash-rank demons. Allows them to form contracts with anyone. Once signed, both parties are bound until the terms are completed.</w:t>
+      </w:r>
+    </w:p>
+    <w:p>
+      <w:r>
+        <w:t>Veyn Decomposition (Gnash) — Produces only a thin, unsettling presence rather than true miasma. Prolonged exposure can cause mild hallucinations and disorientation in weaker targets.</w:t>
+      </w:r>
+    </w:p>
+    <w:p>
+      <w:r>
+        <w:t>Instinctive Bargaining — Gives the user a natural advantage when forming contracts or deals. The user can impose slightly more favorable terms than normal and sense when the other party is trying to cheat or hide a loophole. In combat, this manifests as the ability to force a short-term “bargain” on an opponent (e.g., “trade one attack for reduced damage” or “pause fighting for three seconds”).</w:t>
+      </w:r>
+    </w:p>
+    <w:p>
+      <w:r>
+        <w:t>Demonic Aura (Gnash) — The weakest form of demonic presence. It does not crush the will or force submission, but it creates a subtle, persistent sense of unease in those nearby — a quiet instinct that something is wrong. Most people cannot identify the source, only that they feel mildly unsettled when standing too close.</w:t>
+      </w:r>
+    </w:p>
+    <w:p>
+      <w:r>
+        <w:t>Duskveil (Gnash) — The weakest form of the disguise. It can hide the user's nature at a casual glance, but any real scrutiny will break it. While active, it reduces the user's true strength by roughly 80%.</w:t>
+      </w:r>
+    </w:p>
+    <w:p>
+      <w:r>
+        <w:t>Veyn Decomposition — Innate to all demons. Converts Veyn into a toxic or unsettling presence. Strength and density scale with rank.</w:t>
+      </w:r>
+    </w:p>
+    <w:p>
+      <w:r>
+        <w:t>Berserk — Triggers automatically when the user's health falls critically low. Greatly increases attack power and magic while reducing reasoning and control. The strength of the boost scales with rank.</w:t>
+      </w:r>
+    </w:p>
+    <w:p>
+      <w:r>
+        <w:t>Demonic Aura — A constant oppressive presence that makes those weaker feel the urge to submit. Strength scales with rank.</w:t>
+      </w:r>
+    </w:p>
+    <w:p>
+      <w:r>
+        <w:t>Red Whisper — A quiet, Veyn-laced whisper that can interrupt and shatter an enemy's spell while it is being cast.</w:t>
+      </w:r>
+    </w:p>
+    <w:p>
+      <w:r>
+        <w:t>Blood Jape — Creates a moving double formed from blood and Veyn. The double can take a fatal hit in the user's place before collapsing.</w:t>
+      </w:r>
+    </w:p>
+    <w:p>
+      <w:r>
+        <w:t>Traitor’s Step — After wounding an enemy, the user can instantly exchange positions with them. In the blink of an eye, the injured target is left standing where the user just was, while the user appears in the enemy’s former place — often behind them or in a far more advantageous position. The sudden swap creates perfect openings for follow-up attacks.</w:t>
+      </w:r>
+    </w:p>
+    <w:p>
+      <w:r>
+        <w:t>Grey Miasma — Releases a thin grey mist that clings to the area and slows the movements of anyone who breathes it in.</w:t>
+      </w:r>
+    </w:p>
+    <w:p>
+      <w:r>
+        <w:t>Widow’s Toll — Releases a single deep, resonant note that echoes in the bones of those who hear it. The sound forces the affected to begin crying and strips away their will to fight, making them more obedient to the user for a short time.</w:t>
+      </w:r>
+    </w:p>
+    <w:p>
+      <w:r>
+        <w:t>Fading Wound — Wounds inflicted by the user do not only cause pain — they steadily drain the target's Veyn over time.</w:t>
+      </w:r>
+    </w:p>
+    <w:p>
+      <w:r>
+        <w:t>Heart-Bind — Creates a Veyn-based bond with a target that prevents them from killing the user. Any damage dealt to the user is partially transferred back onto the one who is bound.</w:t>
+      </w:r>
+    </w:p>
+    <w:p>
+      <w:r>
+        <w:t>Lover’s Step — Subtly influences a target's emotions, making them more willing to listen, trust, or obey the user for a limited time.</w:t>
+      </w:r>
+    </w:p>
+    <w:p>
+      <w:r>
+        <w:t>Bond-Sight — Allows the user to see the emotional and magical bonds connecting people. Strong bonds appear as clear threads of light or darkness. The user can read the nature of the bond (loyalty, love, hatred, contract, etc.) and, with enough focus, temporarily weaken or disrupt a bond, creating hesitation or conflict in the target.</w:t>
+      </w:r>
+    </w:p>
+    <w:p>
+      <w:r>
+        <w:t>Siphon — Drains magical energy from targets weaker than the user and adds a portion of it to the user's own reserves.</w:t>
+      </w:r>
+    </w:p>
+    <w:p>
+      <w:r>
+        <w:t>Unslaked — The more magical energy the user absorbs, the stronger their body and attacks temporarily become.</w:t>
+      </w:r>
+    </w:p>
+    <w:p>
+      <w:r>
+        <w:t>Seal — Temporarily locks away one of an opponent's special abilities, preventing its use for a short period.</w:t>
+      </w:r>
+    </w:p>
+    <w:p>
+      <w:r>
+        <w:t>Glut — Forces far more Veyn into a target's body than it can safely contain, causing internal damage and disruption.</w:t>
+      </w:r>
+    </w:p>
+    <w:p>
+      <w:r>
+        <w:t>Cornucopia — Releases a wide burst of surplus Veyn in all directions, overwhelming and damaging weaker beings caught in the wave.</w:t>
+      </w:r>
+    </w:p>
+    <w:p>
+      <w:r>
+        <w:t>Reap — The user extends their power across the surrounding area and violently pulls Veyn from every weaker being within range. Streams of stolen energy are torn away from their targets and drawn directly into the user, simultaneously weakening everyone affected while rapidly restoring and amplifying the user’s own reserves.</w:t>
+      </w:r>
+    </w:p>
+    <w:p>
+      <w:r>
+        <w:t>Sovereign Aura — A refined and intensified form of Demonic Aura strong enough to force even other Bloodwards to feel heavy pressure and the urge to submit.</w:t>
+      </w:r>
+    </w:p>
+    <w:p>
+      <w:r>
+        <w:t>Auralis Seal — Temporarily seals a target’s active abilities and aura, cutting them off from their power. While sealed, the target cannot use skills or project their aura and is forced to fight with only their physical strength and basic techniques. The duration depends on how much Veyn the user has available, and the consumption is extremely high, making it difficult to maintain for long.</w:t>
+      </w:r>
+    </w:p>
+    <w:p>
+      <w:r>
+        <w:t>Blood-Oath — A contract sealed in the breaker’s own blood. Deadlier than a Blood Pact — it does not break when he dies, and whoever breaks it forfeits their Veyn to him.</w:t>
+      </w:r>
+    </w:p>
+    <w:p>
+      <w:r>
+        <w:t>Disinter — Forces hidden or suppressed information to the surface. The user can drag out a target’s recent memories, sealed abilities, or buried emotions, temporarily exposing weaknesses, past injuries, or sealed powers. In combat, this can reveal openings or force a target’s hidden form/ability to surface against their will.</w:t>
+      </w:r>
+    </w:p>
+    <w:p>
+      <w:r>
+        <w:t>Guile — A carefully spoken lie that sinks into the target's mind and feels as if it has always been true.</w:t>
+      </w:r>
+    </w:p>
+    <w:p>
+      <w:pPr>
+        <w:pStyle w:val="Heading2"/>
+      </w:pPr>
+      <w:r>
+        <w:t>Artifact Skills</w:t>
+      </w:r>
+    </w:p>
+    <w:p>
+      <w:r>
+        <w:t>Graceless Edge — A skill of Vireth, the Fallen Grace. Cuts through both holy wards and demonic wards equally, treating corrupted and uncorrupted Veyn as the same thing to sever — essentially cutting magic if you have enough Veyn to cut it. Where most weapons are either blessed or unholy and struggle against the opposite type, Vireth doesn't distinguish between the two at all.</w:t>
+      </w:r>
+    </w:p>
+    <w:p>
+      <w:r>
+        <w:t>Split Grace — A skill of Vireth, the Fallen Grace. Channels both a holy (angelic) and a corrupted (demonic) aura through the blade at the same time, striking with both auras layered into one attack. For most wielders this is dangerous to hold even briefly, since angelic and demonic energy naturally resist coexisting in the same space, let alone the same blade. As a result it causes a force-splitting explosion of the cut area.</w:t>
+      </w:r>
+    </w:p>
+    <w:p>
+      <w:pPr>
+        <w:pStyle w:val="Heading1"/>
+      </w:pPr>
+      <w:r>
+        <w:t>Hybrid Skills</w:t>
+      </w:r>
+    </w:p>
+    <w:p>
+      <w:r>
+        <w:t>When Jaiden Marlock enters his True Hybrid Form, the skills of his two bloodlines stop being separate sets. Each skill of the Aetherblade Lord Angel rank and each skill of the Bloodward demon rank mutate and fuse together, one with another, becoming a single hybrid skill that neither race could wield alone. The fused skills draw on Holy Energy and Corrupted Veyn at once, and exist only while the hybrid form is held.</w:t>
+      </w:r>
+    </w:p>
+    <w:p>
+      <w:r>
+        <w:t>Twilight Chains (Fuses: Skyward Chains + Blood Chains) — Conjures thick chains woven from hardened holy light and living blood. The chains bind with far greater strength than either Skyward Chains or Blood Chains alone. Wherever they touch, they burn with holy fire while simultaneously drinking the target’s strength and Veyn. The more the victim struggles, the tighter and hungrier the chains become, rapidly exhausting even strong opponents.</w:t>
+      </w:r>
+    </w:p>
+    <w:p>
+      <w:r>
+        <w:t>Cry of the Sundered (Fuses: Vanguard's Cry + Warcry of Dominion) — A single, dual-natured battle cry that carries both angelic authority and demonic dominance. Allies who hear it feel their strength, speed, and resolve surge, while enemies experience a sudden collapse of will — their bodies hesitating and their skills faltering for a critical moment. The effect is strong enough to turn the momentum of a battle in a single breath.</w:t>
+      </w:r>
+    </w:p>
+    <w:p>
+      <w:r>
+        <w:t>Hollow Aegis (Fuses: Aegis Ward + Crimson Ward) — Forms a layered barrier of solidified light and hardened blood. The ward is significantly tougher than either Aegis Ward or Crimson Ward alone. Instead of only draining the user’s regeneration, it absorbs a portion of the force from incoming attacks and converts it into restorative energy, partially healing the user with every blow it blocks.</w:t>
+      </w:r>
+    </w:p>
+    <w:p>
+      <w:r>
+        <w:t>Mend-and-Rot (Fuses: Holy Mend + Veyn Decomposition (Bloodward)) — A dual-natured touch that heals and corrupts at the same time. Allies struck by it are rapidly healed by pure holy light, while enemies suffer rotting, decomposing Veyn that eats through flesh and magic. The energy taken from the corrupted side is recycled to fuel the healing, allowing the user to restore allies without fully draining their own reserves.</w:t>
+      </w:r>
+    </w:p>
+    <w:p>
+      <w:r>
+        <w:t>Aura of the Split Crown (Fuses: Angelic Aura (Aetherblade) + Demonic Aura (Bloodward)) — The complete fusion of an Aetherblade’s Angelic Aura and a Bloodward’s Demonic Aura. Those weaker than the user are crushed by two opposing forces at once — the overwhelming urge to kneel in submission and the primal instinct to flee in terror. The conflicting pressure shatters focus, slows reactions, and makes sustained resistance extremely difficult.</w:t>
+      </w:r>
+    </w:p>
+    <w:p>
+      <w:r>
+        <w:t>Frenzied Step (Fuses: Swiftstep + Berserk (Bloodward)) — A rage-fueled blink that combines Swiftstep with the Bloodward’s Berserk state. The user vanishes and reappears behind a target in an instant, each use feeding their growing frenzy. With every step, their strength multiplies and their movements become faster and harder to track, until they are little more than a blur of overwhelming force.</w:t>
+      </w:r>
+    </w:p>
+    <w:p>
+      <w:r>
+        <w:t>Gloaming Veil (Fuses: Dawnveil (Aetherblade) + Duskveil (Bloodward)) — The perfect fusion of Dawnveil and Duskveil. The user can completely erase all traces of their hybrid nature, both auras, wings, horns, and halo. Even under close magical scrutiny, the disguise holds firm, making them appear as an ordinary human or whichever form they choose to present. Maintaining it still carries a cost, but far less than using either veil separately.</w:t>
       </w:r>
     </w:p>
     <w:sectPr>

</xml_diff>

<commit_message>
Update reference docx: rank/role, Ren Organ, Clergy=Healers, guild ranks, grade system, rune stars, class progression, character distribution
</commit_message>
<xml_diff>
--- a/Half_made world ideas.docx
+++ b/Half_made world ideas.docx
@@ -33880,6 +33880,1279 @@
     <w:p>
       <w:r>
         <w:t>Gloaming Veil (Fuses: Dawnveil (Aetherblade) + Duskveil (Bloodward)) — The perfect fusion of Dawnveil and Duskveil. The user can completely erase all traces of their hybrid nature, both auras, wings, horns, and halo. Even under close magical scrutiny, the disguise holds firm, making them appear as an ordinary human or whichever form they choose to present. Maintaining it still carries a cost, but far less than using either veil separately.</w:t>
+      </w:r>
+    </w:p>
+    <w:p>
+      <w:pPr>
+        <w:pStyle w:val="Heading1"/>
+      </w:pPr>
+      <w:r>
+        <w:t>Rank and Role</w:t>
+      </w:r>
+    </w:p>
+    <w:p>
+      <w:r>
+        <w:t>A rank is a measure of power, not a profession. Every angel and demon has a rank — the amount of Veyn their body holds, shown by their wings and horns — but only some choose the army. Most angels and demons are civilians: merchants, craftsmen, scholars, laborers, and tradespeople who happen to hold a high or low rank. A powerful Aetherblade Lord Angel might command the army, or might simply be a master artisan who has never held a sword; a weak Gnash might be a soldier, or might run a shop in a quiet town. Rank decides how strong you are. Role decides what you do. And because rank is power rather than duty, angels and demons of any rank are free to leave their realm and live in the Human Realm as ordinary citizens, hiding their true nature behind Dawnveil or Duskveil.</w:t>
+      </w:r>
+    </w:p>
+    <w:p>
+      <w:pPr>
+        <w:pStyle w:val="Heading2"/>
+      </w:pPr>
+      <w:r>
+        <w:t>Angels (Overview)</w:t>
+      </w:r>
+    </w:p>
+    <w:p>
+      <w:r>
+        <w:t>There are four ranks of angels: Serapharch, Aetherblade Lord Angel, Virtue, and Lumen. They have pure white feathery wings and a glowing halo on top of their heads. The number of wings indicates their rank — the higher the rank, the more wings they have — and the appearance of their halo changes by rank too: the higher the rank, the more powerful and bright they look, while lower-rank halos glow very dimly. A rank measures how much Veyn an angel holds, not what they do for a living. Only some angels join the army; most are ordinary civilians — craftsmen, merchants, scholars, and workers — who simply happen to hold their rank. Angels of any rank can leave the Angel Realm and live in the Human Realm as normal citizens, hiding their true nature behind Dawnveil.</w:t>
+      </w:r>
+    </w:p>
+    <w:p>
+      <w:pPr>
+        <w:pStyle w:val="Heading2"/>
+      </w:pPr>
+      <w:r>
+        <w:t>Demons (Overview)</w:t>
+      </w:r>
+    </w:p>
+    <w:p>
+      <w:r>
+        <w:t>There are four ranks of demons: Mordrach, Bloodward, Scourge, and Gnash. They have horns on their forehead and feathery black wings. The number of horns and wings both indicate their rank — the higher the rank, the more horns and wings they have. They always have a demonic aura around them. A rank measures how much power a demon holds, not what they do for a living. Only some demons join the army; most are ordinary civilians — laborers, traders, craftsmen, and workers — who simply happen to hold their rank. Demons of any rank can leave the Demon Realm and live in the Human Realm as normal citizens, hiding their true nature behind Duskveil. Note: a rank can be passed down to an offspring, though not all the time, so they would have to work their way up the ranks.</w:t>
+      </w:r>
+    </w:p>
+    <w:p>
+      <w:pPr>
+        <w:pStyle w:val="Heading1"/>
+      </w:pPr>
+      <w:r>
+        <w:t>The Ren Organ</w:t>
+      </w:r>
+    </w:p>
+    <w:p>
+      <w:r>
+        <w:t>Angels and demons are born to Veyn — their aura, halo or miasma, and every innate skill run on it — and Ren, the inner energy drawn from a body’s own Vitality, does not come naturally to them. But it is not impossible. An angel or demon can unlock a Ren Organ: a channel within the body that lets them draw on their own Vitality and use Ren the way a human or swordsman does. The cost is absolute — while the Ren Organ is open, the user cannot touch any form of Veyn at all. The moment Veyn and Ren meet inside the same body, the incompatibility rule applies and can kill them. This means an angel or demon who walks the Ren path must fight without their aura, their halo or miasma, and every innate Veyn skill they were born with, until they close the organ and return to Veyn.</w:t>
+      </w:r>
+    </w:p>
+    <w:p>
+      <w:r>
+        <w:t>Unlock: An angel or demon can unlock a Ren Organ to channel Ren from their own Vitality.</w:t>
+      </w:r>
+    </w:p>
+    <w:p>
+      <w:r>
+        <w:t>Cost: While the organ is open, the user cannot touch any form of Veyn — not even their own aura or innate skills.</w:t>
+      </w:r>
+    </w:p>
+    <w:p>
+      <w:r>
+        <w:t>Rule: Mixing Veyn and Ren in one body applies the incompatibility rule and can kill.</w:t>
+      </w:r>
+    </w:p>
+    <w:p>
+      <w:pPr>
+        <w:pStyle w:val="Heading1"/>
+      </w:pPr>
+      <w:r>
+        <w:t>Clergy and the Healers</w:t>
+      </w:r>
+    </w:p>
+    <w:p>
+      <w:r>
+        <w:t>Trained in restoring injuries and health using Veyn. There are only seven Clergy class-holders in the world at any time — and those seven are the Healers of the Human Realm, chosen by the Seer through the Truthstone when one dies. To hold the Clergy class is to hold the title of Healer; there is no other way to become one.</w:t>
+      </w:r>
+    </w:p>
+    <w:p>
+      <w:r>
+        <w:t>There are only seven Healers in the Human Realm — and the seven Healers are the only seven holders of the Clergy class. When one of the seven dies, the Seer chooses the next Healer within two years, locating them through the Truthstone. To be a Healer is to hold the Clergy class; the two are one and the same.</w:t>
+      </w:r>
+    </w:p>
+    <w:p>
+      <w:pPr>
+        <w:pStyle w:val="Heading1"/>
+      </w:pPr>
+      <w:r>
+        <w:t>Silver Concord — Guild Ranks</w:t>
+      </w:r>
+    </w:p>
+    <w:p>
+      <w:r>
+        <w:t>Silver Concord ranks its members by the classic metal tiers of an adventurer guild, earned through completed quests, proven skill, and a reputation the guild is willing to stand behind. The metal on a member’s badge is their record made visible — it opens doors, sets the price on their head, and decides which jobs they are trusted with. Rank is skill, not power, and not class: a Broker and a Bladesinger rise and fall by the same metal.</w:t>
+      </w:r>
+    </w:p>
+    <w:p>
+      <w:r>
+        <w:t>Ranks: Copper → Bronze → Iron → Silver → Gold → Platinum → Mithril → Guildmaster</w:t>
+      </w:r>
+    </w:p>
+    <w:p>
+      <w:r>
+        <w:t>Copper: Untested newcomers on their first jobs. Supervised on simple quests — escort work, pest clearing, courier runs.</w:t>
+      </w:r>
+    </w:p>
+    <w:p>
+      <w:r>
+        <w:t>Bronze: Proven enough to take standard quests alone. Handles routine monster hunts, retrieval jobs, and low-risk Cross-realm work.</w:t>
+      </w:r>
+    </w:p>
+    <w:p>
+      <w:r>
+        <w:t>Iron: Reliable veterans trusted with dangerous jobs and small team leads. Mentors the lower ranks between contracts.</w:t>
+      </w:r>
+    </w:p>
+    <w:p>
+      <w:r>
+        <w:t>Silver: Seasoned mercenaries who lead teams and take on high-stakes quests. Their name alone is worth a deposit.</w:t>
+      </w:r>
+    </w:p>
+    <w:p>
+      <w:r>
+        <w:t>Gold: Elite members sent on the guild’s most dangerous commissions — ruins, high-rank monsters, and sensitive retrievals.</w:t>
+      </w:r>
+    </w:p>
+    <w:p>
+      <w:r>
+        <w:t>Platinum: Legendary mercenaries whose deeds are recorded in the Archive. Handled ruler-level jobs and represent the guild to crowns.</w:t>
+      </w:r>
+    </w:p>
+    <w:p>
+      <w:r>
+        <w:t>Mithril: The rarest rank — a handful of living legends. Only they may take the guild’s unlisted, highest-risk contracts.</w:t>
+      </w:r>
+    </w:p>
+    <w:p>
+      <w:r>
+        <w:t>Guildmaster: A single, unique rank held by Varen Ashtail. Leads the guild and has the final word on every job, price, and dispute.</w:t>
+      </w:r>
+    </w:p>
+    <w:p>
+      <w:pPr>
+        <w:pStyle w:val="Heading1"/>
+      </w:pPr>
+      <w:r>
+        <w:t>Grade System</w:t>
+      </w:r>
+    </w:p>
+    <w:p>
+      <w:pPr>
+        <w:pStyle w:val="Heading2"/>
+      </w:pPr>
+      <w:r>
+        <w:t>G Grade</w:t>
+      </w:r>
+    </w:p>
+    <w:p>
+      <w:r>
+        <w:t>Mortal Grade — Level 0-9</w:t>
+      </w:r>
+    </w:p>
+    <w:p>
+      <w:r>
+        <w:t>The starting grade assigned to beings who were never exposed to Veyn before gaining access to the System. This usually means those born in uninitiated worlds before integration. Any being born after System integration is assigned F Grade at minimum. G Grade beings have no sub-stages and cannot advance through normal means — they must first be exposed to Veyn.</w:t>
+      </w:r>
+    </w:p>
+    <w:p>
+      <w:r>
+        <w:t>Level Range: 0 - 9</w:t>
+      </w:r>
+    </w:p>
+    <w:p>
+      <w:r>
+        <w:t>Sub-stages: None</w:t>
+      </w:r>
+    </w:p>
+    <w:p>
+      <w:r>
+        <w:t>Lifespan: Normal human lifespan</w:t>
+      </w:r>
+    </w:p>
+    <w:p>
+      <w:pPr>
+        <w:pStyle w:val="Heading2"/>
+      </w:pPr>
+      <w:r>
+        <w:t>F Grade</w:t>
+      </w:r>
+    </w:p>
+    <w:p>
+      <w:r>
+        <w:t>First Grade — Level 10-19</w:t>
+      </w:r>
+    </w:p>
+    <w:p>
+      <w:r>
+        <w:t>The first true grade of the System. F Grade beings have been exposed to Veyn and can begin developing their abilities. This is the starting point for most awakened individuals. F Grade has no sub-stages — it is a transitional grade where the foundation is built before the real progression begins.</w:t>
+      </w:r>
+    </w:p>
+    <w:p>
+      <w:r>
+        <w:t>Level Range: 10 - 19</w:t>
+      </w:r>
+    </w:p>
+    <w:p>
+      <w:r>
+        <w:t>Sub-stages: None</w:t>
+      </w:r>
+    </w:p>
+    <w:p>
+      <w:r>
+        <w:t>Note: Foundation stage — no sub-stages</w:t>
+      </w:r>
+    </w:p>
+    <w:p>
+      <w:pPr>
+        <w:pStyle w:val="Heading2"/>
+      </w:pPr>
+      <w:r>
+        <w:t>E Grade</w:t>
+      </w:r>
+    </w:p>
+    <w:p>
+      <w:r>
+        <w:t>Evolution Grade — Level 20-29</w:t>
+      </w:r>
+    </w:p>
+    <w:p>
+      <w:r>
+        <w:t>The first major evolutionary step. E Grade represents a substantial increase in power, influence, and connection to the System. Beings at this grade can sense and manipulate Veyn or Ren with increasing skill. Advancing from E to D requires completing an Evolution Quest.</w:t>
+      </w:r>
+    </w:p>
+    <w:p>
+      <w:r>
+        <w:t>Level Range: 20 - 29</w:t>
+      </w:r>
+    </w:p>
+    <w:p>
+      <w:r>
+        <w:t>Early Stage: Levels 20-22</w:t>
+      </w:r>
+    </w:p>
+    <w:p>
+      <w:r>
+        <w:t>Mid Stage: Levels 23-25</w:t>
+      </w:r>
+    </w:p>
+    <w:p>
+      <w:r>
+        <w:t>Late Stage: Levels 26-28</w:t>
+      </w:r>
+    </w:p>
+    <w:p>
+      <w:r>
+        <w:t>Peak Stage: Levels 29</w:t>
+      </w:r>
+    </w:p>
+    <w:p>
+      <w:pPr>
+        <w:pStyle w:val="Heading2"/>
+      </w:pPr>
+      <w:r>
+        <w:t>D Grade</w:t>
+      </w:r>
+    </w:p>
+    <w:p>
+      <w:r>
+        <w:t>Dominion Grade — Level 30-44</w:t>
+      </w:r>
+    </w:p>
+    <w:p>
+      <w:r>
+        <w:t>A significant power jump. D Grade beings can influence their surroundings on a larger scale and are considered competent fighters. Most adventurers and class-holders operate at this grade. The average lifespan extends to roughly 1,000 years.</w:t>
+      </w:r>
+    </w:p>
+    <w:p>
+      <w:r>
+        <w:t>Level Range: 30 - 44</w:t>
+      </w:r>
+    </w:p>
+    <w:p>
+      <w:r>
+        <w:t>Early Stage: Levels 30-33</w:t>
+      </w:r>
+    </w:p>
+    <w:p>
+      <w:r>
+        <w:t>Mid Stage: Levels 34-37</w:t>
+      </w:r>
+    </w:p>
+    <w:p>
+      <w:r>
+        <w:t>Late Stage: Levels 38-41</w:t>
+      </w:r>
+    </w:p>
+    <w:p>
+      <w:r>
+        <w:t>Peak Stage: Levels 42-44</w:t>
+      </w:r>
+    </w:p>
+    <w:p>
+      <w:r>
+        <w:t>Average Lifespan: ~1,000 years</w:t>
+      </w:r>
+    </w:p>
+    <w:p>
+      <w:r>
+        <w:t>Max Lifespan: ~10,000 years</w:t>
+      </w:r>
+    </w:p>
+    <w:p>
+      <w:pPr>
+        <w:pStyle w:val="Heading2"/>
+      </w:pPr>
+      <w:r>
+        <w:t>C Grade</w:t>
+      </w:r>
+    </w:p>
+    <w:p>
+      <w:r>
+        <w:t>Conqueror Grade — Level 45-59</w:t>
+      </w:r>
+    </w:p>
+    <w:p>
+      <w:r>
+        <w:t>A grade of true power. C Grade beings can destroy small structures, command large groups, and are considered elite threats. Advancing to C Grade requires a special Evolution Quest for most races. Average lifespan extends to roughly 10,000 years.</w:t>
+      </w:r>
+    </w:p>
+    <w:p>
+      <w:r>
+        <w:t>Level Range: 45 - 59</w:t>
+      </w:r>
+    </w:p>
+    <w:p>
+      <w:r>
+        <w:t>Early Stage: Levels 45-48</w:t>
+      </w:r>
+    </w:p>
+    <w:p>
+      <w:r>
+        <w:t>Mid Stage: Levels 49-52</w:t>
+      </w:r>
+    </w:p>
+    <w:p>
+      <w:r>
+        <w:t>Late Stage: Levels 53-56</w:t>
+      </w:r>
+    </w:p>
+    <w:p>
+      <w:r>
+        <w:t>Peak Stage: Levels 57-59</w:t>
+      </w:r>
+    </w:p>
+    <w:p>
+      <w:r>
+        <w:t>Average Lifespan: ~10,000 years</w:t>
+      </w:r>
+    </w:p>
+    <w:p>
+      <w:r>
+        <w:t>Max Lifespan: ~100,000 years</w:t>
+      </w:r>
+    </w:p>
+    <w:p>
+      <w:pPr>
+        <w:pStyle w:val="Heading2"/>
+      </w:pPr>
+      <w:r>
+        <w:t>B Grade</w:t>
+      </w:r>
+    </w:p>
+    <w:p>
+      <w:r>
+        <w:t>Behemoth Grade — Level 60-74</w:t>
+      </w:r>
+    </w:p>
+    <w:p>
+      <w:r>
+        <w:t>A grade of immense power. B Grade beings can destroy cities, manipulate large-scale Veyn flows, and are considered apex threats in most regions. The difference between B and C is vast — a single B Grade can wipe out an army of C Grades.</w:t>
+      </w:r>
+    </w:p>
+    <w:p>
+      <w:r>
+        <w:t>Level Range: 60 - 74</w:t>
+      </w:r>
+    </w:p>
+    <w:p>
+      <w:r>
+        <w:t>Early Stage: Levels 60-63</w:t>
+      </w:r>
+    </w:p>
+    <w:p>
+      <w:r>
+        <w:t>Mid Stage: Levels 64-67</w:t>
+      </w:r>
+    </w:p>
+    <w:p>
+      <w:r>
+        <w:t>Late Stage: Levels 68-71</w:t>
+      </w:r>
+    </w:p>
+    <w:p>
+      <w:r>
+        <w:t>Peak Stage: Levels 72-74</w:t>
+      </w:r>
+    </w:p>
+    <w:p>
+      <w:r>
+        <w:t>Max Lifespan: 100,000+ years</w:t>
+      </w:r>
+    </w:p>
+    <w:p>
+      <w:pPr>
+        <w:pStyle w:val="Heading2"/>
+      </w:pPr>
+      <w:r>
+        <w:t>A Grade</w:t>
+      </w:r>
+    </w:p>
+    <w:p>
+      <w:r>
+        <w:t>Apex Grade — Level 75-89</w:t>
+      </w:r>
+    </w:p>
+    <w:p>
+      <w:r>
+        <w:t>The highest mortal grade. A Grade beings are forces of nature — they can reshape terrain, command armies, and rival the power of lesser divine beings. Few reach this grade; those who do are legends in their own time.</w:t>
+      </w:r>
+    </w:p>
+    <w:p>
+      <w:r>
+        <w:t>Level Range: 75 - 89</w:t>
+      </w:r>
+    </w:p>
+    <w:p>
+      <w:r>
+        <w:t>Early Stage: Levels 75-78</w:t>
+      </w:r>
+    </w:p>
+    <w:p>
+      <w:r>
+        <w:t>Mid Stage: Levels 79-82</w:t>
+      </w:r>
+    </w:p>
+    <w:p>
+      <w:r>
+        <w:t>Late Stage: Levels 83-86</w:t>
+      </w:r>
+    </w:p>
+    <w:p>
+      <w:r>
+        <w:t>Peak Stage: Levels 87-89</w:t>
+      </w:r>
+    </w:p>
+    <w:p>
+      <w:r>
+        <w:t>Max Lifespan: 1,000,000+ years</w:t>
+      </w:r>
+    </w:p>
+    <w:p>
+      <w:pPr>
+        <w:pStyle w:val="Heading2"/>
+      </w:pPr>
+      <w:r>
+        <w:t>S Grade</w:t>
+      </w:r>
+    </w:p>
+    <w:p>
+      <w:r>
+        <w:t>Sovereign Grade — Level 90-100</w:t>
+      </w:r>
+    </w:p>
+    <w:p>
+      <w:r>
+        <w:t>The pinnacle of mortal power. S Grade beings are demigods — nearing godhood itself. Peak S Grade individuals are known as Demigods. The difference between S and A is the difference between a mortal and something beyond mortal comprehension.</w:t>
+      </w:r>
+    </w:p>
+    <w:p>
+      <w:r>
+        <w:t>Level Range: 90 - 100</w:t>
+      </w:r>
+    </w:p>
+    <w:p>
+      <w:r>
+        <w:t>Early Stage: Levels 90-92</w:t>
+      </w:r>
+    </w:p>
+    <w:p>
+      <w:r>
+        <w:t>Mid Stage: Levels 93-95</w:t>
+      </w:r>
+    </w:p>
+    <w:p>
+      <w:r>
+        <w:t>Late Stage: Levels 96-98</w:t>
+      </w:r>
+    </w:p>
+    <w:p>
+      <w:r>
+        <w:t>Peak Stage: Levels 99-100</w:t>
+      </w:r>
+    </w:p>
+    <w:p>
+      <w:r>
+        <w:t>Note: Peak S Grade = Demigod</w:t>
+      </w:r>
+    </w:p>
+    <w:p>
+      <w:pPr>
+        <w:pStyle w:val="Heading2"/>
+      </w:pPr>
+      <w:r>
+        <w:t>The Wall</w:t>
+      </w:r>
+    </w:p>
+    <w:p>
+      <w:r>
+        <w:t>Natural Barrier to Advancement</w:t>
+      </w:r>
+    </w:p>
+    <w:p>
+      <w:r>
+        <w:t>Every being reaches a wall — a natural barrier to the path beyond that they must overcome by any means possible. Failure will result in the stagnation of progress. Many beings resign themselves to their fates when this happens; others accept it and move on with the hope that they can progress once more in the future. The Wall appears at the peak of each grade and must be broken through to advance.</w:t>
+      </w:r>
+    </w:p>
+    <w:p>
+      <w:r>
+        <w:t>Effect: Blocks advancement until overcome</w:t>
+      </w:r>
+    </w:p>
+    <w:p>
+      <w:r>
+        <w:t>Trigger: Appears at the peak of each grade</w:t>
+      </w:r>
+    </w:p>
+    <w:p>
+      <w:r>
+        <w:t>Failure: Permanent stagnation at current grade</w:t>
+      </w:r>
+    </w:p>
+    <w:p>
+      <w:pPr>
+        <w:pStyle w:val="Heading2"/>
+      </w:pPr>
+      <w:r>
+        <w:t>Evolution Quest</w:t>
+      </w:r>
+    </w:p>
+    <w:p>
+      <w:r>
+        <w:t>Advancement Challenge</w:t>
+      </w:r>
+    </w:p>
+    <w:p>
+      <w:r>
+        <w:t>Upon reaching the peak of a grade, a being must complete an Evolution Quest to transition into the new grade. These quests vary in difficulty and nature — some require killing specific targets, others demand reaching certain milestones. Failing or not completing this quest restricts advancement. The difficulty of the quest scales with the grade being attempted.</w:t>
+      </w:r>
+    </w:p>
+    <w:p>
+      <w:r>
+        <w:t>Trigger: Reaching peak of current grade</w:t>
+      </w:r>
+    </w:p>
+    <w:p>
+      <w:r>
+        <w:t>Effect: Unlocks next grade upon completion</w:t>
+      </w:r>
+    </w:p>
+    <w:p>
+      <w:r>
+        <w:t>Failure: Cannot advance until quest is completed</w:t>
+      </w:r>
+    </w:p>
+    <w:p>
+      <w:pPr>
+        <w:pStyle w:val="Heading1"/>
+      </w:pPr>
+      <w:r>
+        <w:t>Rune Star Circles</w:t>
+      </w:r>
+    </w:p>
+    <w:p>
+      <w:pPr>
+        <w:pStyle w:val="Heading2"/>
+      </w:pPr>
+      <w:r>
+        <w:t>1st Circle Rune Star</w:t>
+      </w:r>
+    </w:p>
+    <w:p>
+      <w:r>
+        <w:t>Mage Circle 1 — Initiate</w:t>
+      </w:r>
+    </w:p>
+    <w:p>
+      <w:r>
+        <w:t>Circle: 1st</w:t>
+      </w:r>
+    </w:p>
+    <w:p>
+      <w:r>
+        <w:t>Power Level: Initiate</w:t>
+      </w:r>
+    </w:p>
+    <w:p>
+      <w:r>
+        <w:t>Veyn Cost: Low</w:t>
+      </w:r>
+    </w:p>
+    <w:p>
+      <w:r>
+        <w:t>Description: Basic spells — bolts, shields, simple elemental effects</w:t>
+      </w:r>
+    </w:p>
+    <w:p>
+      <w:r>
+        <w:t>Unlock Requirement: Inscribe the first Rune Star sigil</w:t>
+      </w:r>
+    </w:p>
+    <w:p>
+      <w:pPr>
+        <w:pStyle w:val="Heading2"/>
+      </w:pPr>
+      <w:r>
+        <w:t>2nd Circle Rune Star</w:t>
+      </w:r>
+    </w:p>
+    <w:p>
+      <w:r>
+        <w:t>Mage Circle 2 — Adept</w:t>
+      </w:r>
+    </w:p>
+    <w:p>
+      <w:r>
+        <w:t>Circle: 2nd</w:t>
+      </w:r>
+    </w:p>
+    <w:p>
+      <w:r>
+        <w:t>Power Level: Adept</w:t>
+      </w:r>
+    </w:p>
+    <w:p>
+      <w:r>
+        <w:t>Veyn Cost: Low-Medium</w:t>
+      </w:r>
+    </w:p>
+    <w:p>
+      <w:r>
+        <w:t>Description: Enhanced spells — lances, reinforced barriers, dual-element effects</w:t>
+      </w:r>
+    </w:p>
+    <w:p>
+      <w:r>
+        <w:t>Unlock Requirement: Master all 10基础 spells and inscribe 2nd Rune Star</w:t>
+      </w:r>
+    </w:p>
+    <w:p>
+      <w:pPr>
+        <w:pStyle w:val="Heading2"/>
+      </w:pPr>
+      <w:r>
+        <w:t>3rd Circle Rune Star</w:t>
+      </w:r>
+    </w:p>
+    <w:p>
+      <w:r>
+        <w:t>Mage Circle 3 — Artificer</w:t>
+      </w:r>
+    </w:p>
+    <w:p>
+      <w:r>
+        <w:t>Circle: 3rd</w:t>
+      </w:r>
+    </w:p>
+    <w:p>
+      <w:r>
+        <w:t>Power Level: Artificer</w:t>
+      </w:r>
+    </w:p>
+    <w:p>
+      <w:r>
+        <w:t>Veyn Cost: Medium</w:t>
+      </w:r>
+    </w:p>
+    <w:p>
+      <w:r>
+        <w:t>Description: Sustained spells — storms, siege-breaking blasts, long-duration barriers</w:t>
+      </w:r>
+    </w:p>
+    <w:p>
+      <w:r>
+        <w:t>Unlock Requirement: Complete a Trial of Veyn and inscribe 3rd Rune Star</w:t>
+      </w:r>
+    </w:p>
+    <w:p>
+      <w:pPr>
+        <w:pStyle w:val="Heading2"/>
+      </w:pPr>
+      <w:r>
+        <w:t>4th Circle Rune Star</w:t>
+      </w:r>
+    </w:p>
+    <w:p>
+      <w:r>
+        <w:t>Mage Circle 4 — Warden</w:t>
+      </w:r>
+    </w:p>
+    <w:p>
+      <w:r>
+        <w:t>Circle: 4th</w:t>
+      </w:r>
+    </w:p>
+    <w:p>
+      <w:r>
+        <w:t>Power Level: Warden</w:t>
+      </w:r>
+    </w:p>
+    <w:p>
+      <w:r>
+        <w:t>Veyn Cost: Medium-High (self-sustaining)</w:t>
+      </w:r>
+    </w:p>
+    <w:p>
+      <w:r>
+        <w:t>Description: City-leveling spells — weather control, perfect illusions, area destruction</w:t>
+      </w:r>
+    </w:p>
+    <w:p>
+      <w:r>
+        <w:t>Unlock Requirement: Survive the Veyn Overload trial and inscribe 4th Rune Star</w:t>
+      </w:r>
+    </w:p>
+    <w:p>
+      <w:pPr>
+        <w:pStyle w:val="Heading2"/>
+      </w:pPr>
+      <w:r>
+        <w:t>5th Circle Rune Star</w:t>
+      </w:r>
+    </w:p>
+    <w:p>
+      <w:r>
+        <w:t>Mage Circle 5 — Archmage</w:t>
+      </w:r>
+    </w:p>
+    <w:p>
+      <w:r>
+        <w:t>Circle: 5th</w:t>
+      </w:r>
+    </w:p>
+    <w:p>
+      <w:r>
+        <w:t>Power Level: Archmage</w:t>
+      </w:r>
+    </w:p>
+    <w:p>
+      <w:r>
+        <w:t>Veyn Cost: High (world core connection)</w:t>
+      </w:r>
+    </w:p>
+    <w:p>
+      <w:r>
+        <w:t>Description: Terrain-shaping spells — pocket dimensions, disaster-level strikes, reality warping</w:t>
+      </w:r>
+    </w:p>
+    <w:p>
+      <w:r>
+        <w:t>Unlock Requirement: Commune with the world core and inscribe 5th Rune Star</w:t>
+      </w:r>
+    </w:p>
+    <w:p>
+      <w:pPr>
+        <w:pStyle w:val="Heading2"/>
+      </w:pPr>
+      <w:r>
+        <w:t>6th Circle Rune Star</w:t>
+      </w:r>
+    </w:p>
+    <w:p>
+      <w:r>
+        <w:t>Mage Circle 6 — Sovereign</w:t>
+      </w:r>
+    </w:p>
+    <w:p>
+      <w:r>
+        <w:t>Circle: 6th</w:t>
+      </w:r>
+    </w:p>
+    <w:p>
+      <w:r>
+        <w:t>Power Level: Sovereign</w:t>
+      </w:r>
+    </w:p>
+    <w:p>
+      <w:r>
+        <w:t>Veyn Cost: Soul-bound (unlimited)</w:t>
+      </w:r>
+    </w:p>
+    <w:p>
+      <w:r>
+        <w:t>Description: Apocalypse spells — city unmaking, physics rewriting, cross-realm scrying</w:t>
+      </w:r>
+    </w:p>
+    <w:p>
+      <w:r>
+        <w:t>Unlock Requirement: Fuse soul with Veyn matrix and inscribe 6th Rune Star</w:t>
+      </w:r>
+    </w:p>
+    <w:p>
+      <w:pPr>
+        <w:pStyle w:val="Heading2"/>
+      </w:pPr>
+      <w:r>
+        <w:t>7th Circle Rune Star</w:t>
+      </w:r>
+    </w:p>
+    <w:p>
+      <w:r>
+        <w:t>Mage Circle 7 — Transcendent</w:t>
+      </w:r>
+    </w:p>
+    <w:p>
+      <w:r>
+        <w:t>Circle: 7th</w:t>
+      </w:r>
+    </w:p>
+    <w:p>
+      <w:r>
+        <w:t>Power Level: Transcendent</w:t>
+      </w:r>
+    </w:p>
+    <w:p>
+      <w:r>
+        <w:t>Veyn Cost: Beyond measurement</w:t>
+      </w:r>
+    </w:p>
+    <w:p>
+      <w:r>
+        <w:t>Description: God-tier spells — reality rewriting, history alteration, creation and unmaking</w:t>
+      </w:r>
+    </w:p>
+    <w:p>
+      <w:r>
+        <w:t>Unlock Requirement: The 7th Rune Star cannot be inscribed — it must be given by the world core</w:t>
+      </w:r>
+    </w:p>
+    <w:p>
+      <w:r>
+        <w:t>Lore Note: Only one being in recorded history has reached this circle</w:t>
+      </w:r>
+    </w:p>
+    <w:p>
+      <w:pPr>
+        <w:pStyle w:val="Heading1"/>
+      </w:pPr>
+      <w:r>
+        <w:t>Rune Star Circles vs Grades</w:t>
+      </w:r>
+    </w:p>
+    <w:p>
+      <w:r>
+        <w:t>Mages do not use the Grade system — their power is measured by the Rune Star Circle inscribed into their heart. But the two scales can be compared directly by the power each tier represents. A Mage’s circle is roughly equal to a Grade as follows, starting at F because a Mage is by definition already awakened to Veyn (no Mage sits at G Grade, which means never exposed to Veyn).</w:t>
+      </w:r>
+    </w:p>
+    <w:p>
+      <w:r>
+        <w:t>1st Circle (Initiate): ≈ F Grade — the foundation stage; basic spells and control</w:t>
+      </w:r>
+    </w:p>
+    <w:p>
+      <w:r>
+        <w:t>2nd Circle (Adept): ≈ E Grade — the first real step of power; enhanced spells</w:t>
+      </w:r>
+    </w:p>
+    <w:p>
+      <w:r>
+        <w:t>3rd Circle (Artificer): ≈ D Grade — competent and self-sufficient; most adventurers</w:t>
+      </w:r>
+    </w:p>
+    <w:p>
+      <w:r>
+        <w:t>4th Circle (Warden): ≈ C Grade — can level structures and command real force</w:t>
+      </w:r>
+    </w:p>
+    <w:p>
+      <w:r>
+        <w:t>5th Circle (Archmage): ≈ B Grade — city-destroying power; terrain shaping</w:t>
+      </w:r>
+    </w:p>
+    <w:p>
+      <w:r>
+        <w:t>6th Circle (Sovereign): ≈ A Grade — apocalypse-scale; rivals lesser divine beings</w:t>
+      </w:r>
+    </w:p>
+    <w:p>
+      <w:r>
+        <w:t>7th Circle (Transcendent): ≈ S Grade — demigod; a tier beyond mortal power</w:t>
+      </w:r>
+    </w:p>
+    <w:p>
+      <w:pPr>
+        <w:pStyle w:val="Heading1"/>
+      </w:pPr>
+      <w:r>
+        <w:t>Class Progression</w:t>
+      </w:r>
+    </w:p>
+    <w:p>
+      <w:pPr>
+        <w:pStyle w:val="Heading2"/>
+      </w:pPr>
+      <w:r>
+        <w:t>Alchemist — Potion Mastery Ranks</w:t>
+      </w:r>
+    </w:p>
+    <w:p>
+      <w:r>
+        <w:t>Alchemists progress through ranks based on their brewing skill, ingredient knowledge, and ability to handle dangerous reactions. Each rank unlocks access to more complex recipes and rare ingredients. The ranks are: Distiller → Admixtor → Brewer → Compounder → Transmuter → Elixir Lord → Grand Alchemist. At Distiller, an Alchemist can make basic healing tonics. By Grand Alchemist, they can brew legendary potions like the Ethereal Potion and handle pixie dust without neutralizing it.</w:t>
+      </w:r>
+    </w:p>
+    <w:p>
+      <w:pPr>
+        <w:pStyle w:val="Heading2"/>
+      </w:pPr>
+      <w:r>
+        <w:t>Beastmaster — Bond Depth Stages</w:t>
+      </w:r>
+    </w:p>
+    <w:p>
+      <w:r>
+        <w:t>Beastmasters progress not by raw power but by the depth and quality of their bond with creatures. Each stage represents a deeper telepathic and spiritual connection. The stages are: Whisperer → Bonded → Twin-Soul → Pack Leader → Wild Sovereign → Beastlord → Alpha Eternal. At Whisperer, a Beastmaster can sense a creature's emotions. At Alpha Eternal, they can bond with multiple apex creatures simultaneously and share their senses as if they were their own body.</w:t>
+      </w:r>
+    </w:p>
+    <w:p>
+      <w:pPr>
+        <w:pStyle w:val="Heading2"/>
+      </w:pPr>
+      <w:r>
+        <w:t>Smithing — Forge Mastery Tiers</w:t>
+      </w:r>
+    </w:p>
+    <w:p>
+      <w:r>
+        <w:t>Smiths advance through tiers based on their ability to work increasingly rare and dangerous materials, and the complexity of enchantments they can forge. The tiers are: Apprentice Smith → Metalwright → Forgemaster → Bloodforger → Runesmith → Mythic Forger → Grand Forger. At Apprentice Smith, they shape basic steel. At Grand Forger, they can work Divine materials, create legendary weapons, and handle mixed angel-demon blood without dying.</w:t>
+      </w:r>
+    </w:p>
+    <w:p>
+      <w:pPr>
+        <w:pStyle w:val="Heading2"/>
+      </w:pPr>
+      <w:r>
+        <w:t>Enchanter — Rune Mastery Grades</w:t>
+      </w:r>
+    </w:p>
+    <w:p>
+      <w:r>
+        <w:t>Enchanters advance through grades based on their understanding of magical resonance and their ability to layer, fuse, and create enchantments. The grades are: Rune Reader → Ensorceler → Glyphwright → Wardweaver → Rune Lord → Rune Sage → Rune Transcendent. At Rune Reader, they can identify existing enchantments. At Rune Transcendent, they can create adaptive enchantments that evolve over time and develop entirely new forms of magic.</w:t>
+      </w:r>
+    </w:p>
+    <w:p>
+      <w:pPr>
+        <w:pStyle w:val="Heading2"/>
+      </w:pPr>
+      <w:r>
+        <w:t>Diviner — Sight Depth Levels</w:t>
+      </w:r>
+    </w:p>
+    <w:p>
+      <w:r>
+        <w:t>Diviners advance through levels of Sight Depth — how deeply they can perceive the threads of fate, truth, and Veyn. The levels are: Insight → Reader → Watcher → Seer → Oracle → Prophet → Fatesight. At Insight, they detect obvious lies. At Fatesight, they perceive the emotional and magical bonds connecting all living things and can temporarily combine all divination effects at once.</w:t>
+      </w:r>
+    </w:p>
+    <w:p>
+      <w:pPr>
+        <w:pStyle w:val="Heading2"/>
+      </w:pPr>
+      <w:r>
+        <w:t>Exorcist — Purification Stages</w:t>
+      </w:r>
+    </w:p>
+    <w:p>
+      <w:r>
+        <w:t>Exorcists advance through stages of purification mastery — how cleanly and powerfully they can cleanse corruption, bind fallen beings, and seal dangerous entities. The stages are: Cleaner → Warder → Binder → Purifier → Consecrator → Grand Exorcist → Eternal Seal-Bearer. At Cleaner, they remove surface miasma. At Eternal Seal-Bearer, they can place permanent suppressions on extreme corruption and banish powerful spirits.</w:t>
+      </w:r>
+    </w:p>
+    <w:p>
+      <w:pPr>
+        <w:pStyle w:val="Heading2"/>
+      </w:pPr>
+      <w:r>
+        <w:t>Broker — Contract Tier Ranks</w:t>
+      </w:r>
+    </w:p>
+    <w:p>
+      <w:r>
+        <w:t>Brokers advance through ranks based on the complexity and stakes of the contracts they can handle. The ranks are: Clerk → Scribe → Notary → Mediator → Arbiter → Grand Arbiter → Iron Sovereign. At Clerk, they draft basic trade agreements. At Iron Sovereign, they can create contracts so binding they are nearly impossible to break, enforce penalties across realms, and mediate between rulers.</w:t>
+      </w:r>
+    </w:p>
+    <w:p>
+      <w:pPr>
+        <w:pStyle w:val="Heading2"/>
+      </w:pPr>
+      <w:r>
+        <w:t>Saintess — Radiance Ascension</w:t>
+      </w:r>
+    </w:p>
+    <w:p>
+      <w:r>
+        <w:t>Saintesses advance through stages of Holy Energy mastery — how purely and powerfully they can channel divine light. The stages are: Dawnlight → Glow → Radiance → Brilliance → Blazing Light → Divine Radiance → Seraphic Aura. At Dawnlight, they emit a faint healing warmth. At Seraphic Aura, they become a beacon of golden light that can selectively heal or harm, purify without damaging, and create barriers that adapt to incoming threats.</w:t>
+      </w:r>
+    </w:p>
+    <w:p>
+      <w:pPr>
+        <w:pStyle w:val="Heading2"/>
+      </w:pPr>
+      <w:r>
+        <w:t>Clergy — Healing Mastery Ranks</w:t>
+      </w:r>
+    </w:p>
+    <w:p>
+      <w:r>
+        <w:t>Clergy advance through ranks based on their healing skill, from basic wound care to life-saving mastery. The ranks are: Acolyte → Mercyward → Restorer → Healer → High Healer → Saint Healer → Life Weaver. At Acolyte, they can bandage wounds and apply basic Veyn. At Life Weaver, they can restore lost limbs, pull someone back from the edge of death, and develop entirely new healing techniques.</w:t>
+      </w:r>
+    </w:p>
+    <w:p>
+      <w:pPr>
+        <w:pStyle w:val="Heading2"/>
+      </w:pPr>
+      <w:r>
+        <w:t>Archer — Shot Mastery Tiers</w:t>
+      </w:r>
+    </w:p>
+    <w:p>
+      <w:r>
+        <w:t>Archers advance through tiers based on their ability to enchant arrows and shoot with precision. The tiers are: Marksman → Sharpshooter → Enchanter Archer → Spell Archer → Storm Archer → Void Archer → Trueshot. At Marksman, they fire basic Veyn-enchanted arrows. At Trueshot, they create entirely new forms of magical ammunition and fire with perfect accuracy at impossible ranges.</w:t>
+      </w:r>
+    </w:p>
+    <w:p>
+      <w:pPr>
+        <w:pStyle w:val="Heading2"/>
+      </w:pPr>
+      <w:r>
+        <w:t>Paladin — Oath Ascension</w:t>
+      </w:r>
+    </w:p>
+    <w:p>
+      <w:r>
+        <w:t>Paladins advance through stages of Oath power — how deeply their Auric Ren is tied to their sacred vow. The stages are: Sworn → Oathbound → Blessed → Consecrated → Divine Champion → Seraphic Knight → Eternal Guardian. At Sworn, they can channel basic Auric Ren. At Eternal Guardian, they become a beacon of golden light that inspires allies and terrifies corrupted beings, with all abilities enhanced to their absolute peak.</w:t>
+      </w:r>
+    </w:p>
+    <w:p>
+      <w:pPr>
+        <w:pStyle w:val="Heading2"/>
+      </w:pPr>
+      <w:r>
+        <w:t>Grimtender — Death Mastery Ranks</w:t>
+      </w:r>
+    </w:p>
+    <w:p>
+      <w:r>
+        <w:t>Grimtenders advance through ranks based on their command over death and undeath. The ranks are: Bonewright → Gravekeeper → Bonewarden → Deathcaller → Necromancer → Grave Lord → Death Sovereign. At Bonewright, they can reanimate simple remains. At Death Sovereign, they command permanent high-quality undead, maintain large-scale simultaneous control, and can harvest souls for later use.</w:t>
+      </w:r>
+    </w:p>
+    <w:p>
+      <w:pPr>
+        <w:pStyle w:val="Heading2"/>
+      </w:pPr>
+      <w:r>
+        <w:t>Bladesinger — Blade Harmony Stages</w:t>
+      </w:r>
+    </w:p>
+    <w:p>
+      <w:r>
+        <w:t>Bladesingers advance through stages of blade-Ren harmony — how perfectly their body, blade, and Ren flow as one. The stages are: Novice Blade → Swift Blade → Crimson Blade → Storm Blade → Phantom Blade → Eternal Blade → Perfect Edge. At Novice Blade, they perform basic sword strikes. At Perfect Edge, every movement is optimal, every defense flawless, and the blade becomes an extension of their soul.</w:t>
+      </w:r>
+    </w:p>
+    <w:p>
+      <w:pPr>
+        <w:pStyle w:val="Heading2"/>
+      </w:pPr>
+      <w:r>
+        <w:t>Berserker — Rage Ascension</w:t>
+      </w:r>
+    </w:p>
+    <w:p>
+      <w:r>
+        <w:t>Berserkers advance through stages of rage mastery — how deeply they can tap into their Ren-fueled fury without losing themselves. The stages are: Rageborn → Bloodrager → Wrathbringer → Battlegraced → Berserk → Warlord → Avatar of War. At Rageborn, they enter controlled rage for strength boosts. At Avatar of War, their roar distorts the air, shatters structures, and empowers allies while crushing enemy morale.</w:t>
+      </w:r>
+    </w:p>
+    <w:p>
+      <w:pPr>
+        <w:pStyle w:val="Heading2"/>
+      </w:pPr>
+      <w:r>
+        <w:t>Sentinel — Guardian Oath Ranks</w:t>
+      </w:r>
+    </w:p>
+    <w:p>
+      <w:r>
+        <w:t>Sentinels advance through ranks based on their protective ability and endurance. The ranks are: Guard → Shield Bearer → Warden → Bulwark Knight → Citadel → Immortal Guardian → Eternal Sentinel. At Guard, they reinforce armor with Ren. At Eternal Sentinel, they become a wide-area defensive bastion, taking drastically reduced damage and protecting a large zone around them.</w:t>
+      </w:r>
+    </w:p>
+    <w:p>
+      <w:pPr>
+        <w:pStyle w:val="Heading2"/>
+      </w:pPr>
+      <w:r>
+        <w:t>Ren Archer — Bow Mastery Stages</w:t>
+      </w:r>
+    </w:p>
+    <w:p>
+      <w:r>
+        <w:t>Ren Archers advance through stages of Ren-bow synchronization — how perfectly they can channel Ren through their arrows. The stages are: Novice Archer → Ren Touched → Crimson Archer → Storm Bow → Phantom Archer → Bloodshot → Arrow Sovereign. At Novice Archer, they coat arrows in basic Ren. At Arrow Sovereign, they fire with perfect accuracy while moving, create hovering arrow constructs, and imbue multiple arrows with different Ren effects.</w:t>
+      </w:r>
+    </w:p>
+    <w:p>
+      <w:pPr>
+        <w:pStyle w:val="Heading2"/>
+      </w:pPr>
+      <w:r>
+        <w:t>Veilrunner — Shadow Mastery Tiers</w:t>
+      </w:r>
+    </w:p>
+    <w:p>
+      <w:r>
+        <w:t>Veilrunners advance through tiers of shadow mastery — how completely they can disappear into darkness and strike without being detected. The tiers are: Nightwalker → Phantom → Ghost → Wraith → Shadow Lord → Living Shadow. At Nightwalker, they suppress sound and move quietly. At Living Shadow, they become one with the shadows, moving silently and invisibly at full speed, leaving no trace.</w:t>
+      </w:r>
+    </w:p>
+    <w:p>
+      <w:pPr>
+        <w:pStyle w:val="Heading2"/>
+      </w:pPr>
+      <w:r>
+        <w:t>Shudonkeeper — Knowledge Depths</w:t>
+      </w:r>
+    </w:p>
+    <w:p>
+      <w:r>
+        <w:t>Shudonkeepers advance through depths of knowledge about the Shudon and the world core. The depths are: Student → Antiquarian → Lorekeeper → Archivist → Scholar → Sage → Core-Seer. At Student, they learn basic Shudon construction. At Core-Seer, they can sense residual world-core patterns inside Shudon remains and glimpse the true nature of the golems.</w:t>
+      </w:r>
+    </w:p>
+    <w:p>
+      <w:pPr>
+        <w:pStyle w:val="Heading1"/>
+      </w:pPr>
+      <w:r>
+        <w:t>Character Class Distribution</w:t>
+      </w:r>
+    </w:p>
+    <w:p>
+      <w:r>
+        <w:t>Jaiden Marlock — 3rd Circle Rune Star (Artificer)</w:t>
+      </w:r>
+    </w:p>
+    <w:p>
+      <w:r>
+        <w:t>Lisa — Berserker — A Grade Mid — [Ren Organ]</w:t>
+      </w:r>
+    </w:p>
+    <w:p>
+      <w:r>
+        <w:t>Ordium — Mage — 5th Circle Rune Star (Archmage)</w:t>
+      </w:r>
+    </w:p>
+    <w:p>
+      <w:r>
+        <w:t>Sofia Marlock — Exorcist — C Grade Peak</w:t>
+      </w:r>
+    </w:p>
+    <w:p>
+      <w:r>
+        <w:t>Licent Varak — Ren Archer — B Grade Late — [Ren Organ]</w:t>
+      </w:r>
+    </w:p>
+    <w:p>
+      <w:r>
+        <w:t>Ruby Divina — B Grade Peak</w:t>
+      </w:r>
+    </w:p>
+    <w:p>
+      <w:r>
+        <w:t>Tera Morage — Mage — 6th Circle Rune Star (Sovereign)</w:t>
+      </w:r>
+    </w:p>
+    <w:p>
+      <w:r>
+        <w:t>Clint Ashborn — Mage — 6th Circle Rune Star (Sovereign)</w:t>
+      </w:r>
+    </w:p>
+    <w:p>
+      <w:r>
+        <w:t>Kael von Ashen — Shudonkeeper — S Grade Peak</w:t>
+      </w:r>
+    </w:p>
+    <w:p>
+      <w:r>
+        <w:t>Carin — Beastmaster — C Grade Early — [Ren Organ]</w:t>
+      </w:r>
+    </w:p>
+    <w:p>
+      <w:r>
+        <w:t>Wener Leger — Bladesinger — A Grade Mid — [Ren Organ]</w:t>
+      </w:r>
+    </w:p>
+    <w:p>
+      <w:r>
+        <w:t>Laren Vornath — Veilrunner — B Grade Mid — [Ren Organ]</w:t>
+      </w:r>
+    </w:p>
+    <w:p>
+      <w:r>
+        <w:t>Sythra Kaelis — Grimtender — B Grade Mid</w:t>
+      </w:r>
+    </w:p>
+    <w:p>
+      <w:r>
+        <w:t>Nyra Thessan — Mage — 4th Circle Rune Star (Warden)</w:t>
+      </w:r>
+    </w:p>
+    <w:p>
+      <w:r>
+        <w:t>Isella Marrek — Broker — B Grade Late — [Ren Organ]</w:t>
+      </w:r>
+    </w:p>
+    <w:p>
+      <w:r>
+        <w:t>Cyrion — Archer — A Grade Late</w:t>
+      </w:r>
+    </w:p>
+    <w:p>
+      <w:r>
+        <w:t>Serathiel — Bladesinger — A Grade Late — [Ren Organ]</w:t>
+      </w:r>
+    </w:p>
+    <w:p>
+      <w:r>
+        <w:t>Liora Veyne — Mage — 4th Circle Rune Star (Warden)</w:t>
+      </w:r>
+    </w:p>
+    <w:p>
+      <w:r>
+        <w:t>Thalor Elwin — Paladin — A Grade Mid — [Ren Organ]</w:t>
+      </w:r>
+    </w:p>
+    <w:p>
+      <w:r>
+        <w:t>Aranweis — Sentinel — A Grade Early — [Ren Organ]</w:t>
+      </w:r>
+    </w:p>
+    <w:p>
+      <w:r>
+        <w:t>Varen Ashtail — Broker — B Grade Mid</w:t>
+      </w:r>
+    </w:p>
+    <w:p>
+      <w:r>
+        <w:t>Eva Aldermere Divina — Mage — 1st Circle Rune Star (Initiate)</w:t>
+      </w:r>
+    </w:p>
+    <w:p>
+      <w:r>
+        <w:t>Bella Rose — Archer — E Grade Peak</w:t>
+      </w:r>
+    </w:p>
+    <w:p>
+      <w:r>
+        <w:t>Mark Wesley — Alchemist — E Grade Late</w:t>
       </w:r>
     </w:p>
     <w:sectPr>

</xml_diff>

<commit_message>
Append all remaining missing content to reference docx (186 class skills, 9 notes, 4 plots, 5 forms, 2 titles, guild facilities)
</commit_message>
<xml_diff>
--- a/Half_made world ideas.docx
+++ b/Half_made world ideas.docx
@@ -35153,6 +35153,1663 @@
     <w:p>
       <w:r>
         <w:t>Mark Wesley — Alchemist — E Grade Late</w:t>
+      </w:r>
+    </w:p>
+    <w:p>
+      <w:pPr>
+        <w:pStyle w:val="Heading1"/>
+      </w:pPr>
+      <w:r>
+        <w:t>Class Skills</w:t>
+      </w:r>
+    </w:p>
+    <w:p>
+      <w:pPr>
+        <w:pStyle w:val="Heading2"/>
+      </w:pPr>
+      <w:r>
+        <w:t>Mage</w:t>
+      </w:r>
+    </w:p>
+    <w:p>
+      <w:r>
+        <w:t>Piercing Lance — Fires a concentrated spear of raw Veyn that explodes on impact. At its most basic, the lance is little more than a sharp bolt of silver-blue energy — fast, damaging, but easily blocked by even a basic Veyn barrier. The caster can release it quickly for lower damage or charge it longer for a stronger blast. Main mid-range attack for any practicing Mage. The lance leaves a faint trail of dissolved air in its wake, and the explosion on impact sends shards of residual Veyn scattering in a small radius.</w:t>
+      </w:r>
+    </w:p>
+    <w:p>
+      <w:r>
+        <w:t>Glass Bastion — Creates a translucent wall of condensed Veyn that blocks physical and magical attacks. At its most basic, the wall is thin and brittle — it can stop a sword swing or a low-level spell, but sustained fire or a heavy blow will shatter it. Strength and duration depend entirely on how much Veyn the caster pours into it. The wall shimmers with a faint silver-blue light, and cracks appear along its surface as it absorbs damage. Once it breaks, the Veyn dissipates into nothing.</w:t>
+      </w:r>
+    </w:p>
+    <w:p>
+      <w:r>
+        <w:t>Echo Sense — Heightens the user's sensitivity to Veyn, allowing them to detect living beings, hidden magic, and changes in ambient density. At its most basic, the sense is vague and imprecise — the caster can tell something is nearby but not exactly where or what. It feels like a faint hum at the back of the skull, growing louder as the source draws nearer. The range is short, perhaps fifty meters, and the sense can be overwhelmed by strong Veyn sources.</w:t>
+      </w:r>
+    </w:p>
+    <w:p>
+      <w:r>
+        <w:t>Elemental Brand — Converts raw Veyn into fire, ice, lightning, or wind and releases it as a focused attack. At its most basic, the conversion is crude — the element is unstable and loses potency quickly. Each element carries a secondary effect: fire burns, ice slows, lightning stuns, wind pushes. The caster must choose one element per casting and cannot switch mid-attack. The brand appears as a glowing sigil on the caster's palm before the element erupts outward.</w:t>
+      </w:r>
+    </w:p>
+    <w:p>
+      <w:r>
+        <w:t>Leechfield — Draws ambient Veyn from the surroundings to restore the user's reserves. At its most basic, the draw is slow and inefficient — the caster must stand still and focus, making them vulnerable. Works faster in high-density Veyn areas. Cannot be used while casting other spells. The field manifests as a faint vortex of silver particles spiraling into the caster's body, and the surrounding area dims slightly as Veyn is drained.</w:t>
+      </w:r>
+    </w:p>
+    <w:p>
+      <w:r>
+        <w:t>Skyvault — Forms a large protective dome of Veyn around the user and nearby allies. At its most basic, the dome is thin and temporary — it can absorb a few hits before failing. Blocks attacks from all directions as long as the user maintains the supply of Veyn. The dome appears as a translucent hemisphere of shimmering light, and the caster must remain stationary to maintain it. The larger the dome, the faster the Veyn drains.</w:t>
+      </w:r>
+    </w:p>
+    <w:p>
+      <w:r>
+        <w:t>Repulse — Releases a radial burst of raw Veyn that knocks enemies back and disrupts concentration. At its most basic, the burst is weak — it pushes enemies a few steps back and causes momentary disorientation. Used to create space in close combat. The shockwave radiates outward from the caster in a visible ripple of silver energy, and the ground beneath them cracks slightly from the force.</w:t>
+      </w:r>
+    </w:p>
+    <w:p>
+      <w:r>
+        <w:t>Bloodthread — Creates a visible Veyn thread linking the user to one or more allies. At its most basic, the thread is fragile — it can share small amounts of Veyn and basic spell support, but breaks if the distance becomes too great or if either party takes heavy damage. The thread glows faintly along its length, and both parties can feel a subtle tug when the other is in danger.</w:t>
+      </w:r>
+    </w:p>
+    <w:p>
+      <w:r>
+        <w:t>Shiftstate — Temporarily converts the user's Veyn between raw, elemental, and purified states. At its most basic, the conversion is unstable and brief — the caster can only maintain the shifted state for a few seconds before it reverts. Enables more flexible spell combinations but requires precise control. The Veyn visibly changes color during the shift: raw is silver-blue, elemental takes on the color of the element, purified glows white.</w:t>
+      </w:r>
+    </w:p>
+    <w:p>
+      <w:r>
+        <w:t>Absolute Flow — Grants advanced control over Veyn. Allows casting multiple spells at once, shaping Veyn with high precision, and reducing the cost of all other Mage abilities. At its most basic, the control is limited — the caster can maintain two spells simultaneously and reduce costs by a small margin. The Veyn flows visibly through the caster's body in intricate patterns, and their eyes glow with a steady silver light.</w:t>
+      </w:r>
+    </w:p>
+    <w:p>
+      <w:pPr>
+        <w:pStyle w:val="Heading2"/>
+      </w:pPr>
+      <w:r>
+        <w:t>Alchemist</w:t>
+      </w:r>
+    </w:p>
+    <w:p>
+      <w:r>
+        <w:t>Toniccraft — Combines Veyn and ingredients to create healing, restorative, or enhancement potions. At its most basic, the brews are simple — a basic healing potion that closes minor cuts, a restorative tonic that eases fatigue. Quality depends entirely on the materials and the alchemist's skill. The brewing process requires a mortar, heat source, and at least one Veyn-reactive ingredient. A failed batch results in a foul-smelling liquid that has no effect.</w:t>
+      </w:r>
+    </w:p>
+    <w:p>
+      <w:r>
+        <w:t>Nightbrew — Creates toxic concoctions that can paralyze, weaken, or cause lingering damage. At its most basic, the poisons are mild — they cause numbness in the affected area, brief dizziness, or minor irritation. Can be applied to weapons or delivered through food and drink. The brewer must wear protective gloves during mixing, as the toxins are as dangerous to the maker as the target if mishandled.</w:t>
+      </w:r>
+    </w:p>
+    <w:p>
+      <w:r>
+        <w:t>Shattervial — Brews volatile mixtures that explode on impact or command. At its most basic, the blast is small — enough to startle and burn, but not lethal. Blast size and force can be adjusted by changing ingredients and Veyn input. The vials are fragile and must be stored carefully, as accidental breakage can injure the alchemist. Each vial glows faintly with the color of its explosive compound.</w:t>
+      </w:r>
+    </w:p>
+    <w:p>
+      <w:r>
+        <w:t>Trueassay — Instantly identifies the magical properties, purity, and potential uses of any ingredient through touch or a light Veyn probe. At its most basic, the identification is surface-level — the alchemist can tell if an ingredient is toxic, magical, or mundane, but cannot determine exact potency. The probe feels like a warm pulse extending from the fingertips into the material.</w:t>
+      </w:r>
+    </w:p>
+    <w:p>
+      <w:r>
+        <w:t>Overcharge — Channels extra Veyn into a potion during brewing, greatly increasing its final strength. At its most basic, the overcharge adds a marginal boost — perhaps 10-15% stronger than a standard brew. Requires careful control to avoid ruining the brew, as too much Veyn destabilizes the mixture. The alchemist must maintain steady hand contact with the brewing vessel throughout the process.</w:t>
+      </w:r>
+    </w:p>
+    <w:p>
+      <w:r>
+        <w:t>Multiplier — Creates special substances that multiply or alter the effects of other potions when combined with them. At its most basic, the multiplier is a simple amplifier — it doubles the effect of a single potion. The substance appears as a fine, iridescent powder that must be added at the exact right moment in the brewing process.</w:t>
+      </w:r>
+    </w:p>
+    <w:p>
+      <w:r>
+        <w:t>Cleansebrew — Removes toxins, corruption, and impurities from ingredients or finished potions. At its most basic, the cleanse can remove minor contamination — a slightly spoiled herb, a potion that has turned murky. Can also cleanse small amounts of contaminated Veyn. The process involves submerging the ingredient in a purification solution and channeling Veyn through it.</w:t>
+      </w:r>
+    </w:p>
+    <w:p>
+      <w:r>
+        <w:t>Mattershift — Changes the physical state or basic composition of ingredients so they can be used in recipes they normally could not enter. At its most basic, the shift is minor — turning a solid powder into a liquid, or changing the color and texture of a herb. The shift is temporary and reverts after a few minutes unless stabilized.</w:t>
+      </w:r>
+    </w:p>
+    <w:p>
+      <w:r>
+        <w:t>Hastybrew — Allows rapid brewing of a functional potion during combat using whatever materials are on hand. At its most basic, the potion is rough — it works, but the effect is weaker and the taste is terrible. Results are rougher but still usable. The alchemist must identify suitable ingredients in seconds and mix them by hand, relying on instinct and experience.</w:t>
+      </w:r>
+    </w:p>
+    <w:p>
+      <w:r>
+        <w:t>Mythic Draught — Creates complex, multi-layered legendary potions with powerful and lasting effects. At its most basic, the draught requires rare ingredients and high control — the alchemist must maintain perfect Veyn channeling for hours while the potion brews. A single mistake wastes the entire batch. The finished product glows with an inner light and radiates a faint hum of power.</w:t>
+      </w:r>
+    </w:p>
+    <w:p>
+      <w:pPr>
+        <w:pStyle w:val="Heading2"/>
+      </w:pPr>
+      <w:r>
+        <w:t>Beastmaster</w:t>
+      </w:r>
+    </w:p>
+    <w:p>
+      <w:r>
+        <w:t>Heartbind — Forms a deep telepathic bond with a willing creature. At its most basic, the bond is one-directional — the beastmaster can sense the creature's emotions but cannot project their own thoughts. Once accepted, both can sense each other's emotions and general intentions. Cannot be forced. The bond manifests as a warm glow in the chest when the creature is nearby.</w:t>
+      </w:r>
+    </w:p>
+    <w:p>
+      <w:r>
+        <w:t>Thoughtlink — Deepens the bond so the user and creature can exchange more complex thoughts and feelings beyond basic intent. At its most basic, the exchange is limited to images and emotions — the beastmaster can share a picture of what they want the creature to do, but not detailed verbal commands. The link feels like a second set of senses overlaid on their own.</w:t>
+      </w:r>
+    </w:p>
+    <w:p>
+      <w:r>
+        <w:t>Pack Order — Issues clear, instantaneous combat orders to the bonded creature through the bond. At its most basic, the orders are simple — attack, defend, retreat. The creature responds as if the order were instinct. The bond carries emotional weight, so the creature feels the urgency behind each command.</w:t>
+      </w:r>
+    </w:p>
+    <w:p>
+      <w:r>
+        <w:t>Beast Eye — Allows the user to see, hear, and feel through the bonded creature's senses for a limited time. At its most basic, the shared senses last only a few seconds and cause disorientation when switching back. Range depends on bond strength. The beastmaster's eyes briefly take on the color of the creature's eyes during the transfer.</w:t>
+      </w:r>
+    </w:p>
+    <w:p>
+      <w:r>
+        <w:t>Feral Rush — Channels Ren into the bonded creature, temporarily increasing its speed, strength, and durability. At its most basic, the boost is moderate — the creature moves about 30% faster and hits harder for a short duration. Cost is shared between user and creature. The beast's fur or scales glow faintly with crimson energy during the rush.</w:t>
+      </w:r>
+    </w:p>
+    <w:p>
+      <w:r>
+        <w:t>Fleshguard — Commands the creature to intercept an attack aimed at the user, using its body as a barrier. At its most basic, the creature responds quickly but takes full damage from the attack. The bond ensures the creature acts without hesitation, even against threats far stronger than itself.</w:t>
+      </w:r>
+    </w:p>
+    <w:p>
+      <w:r>
+        <w:t>Twin Fang — Times the user's attack and the creature's attack to land on the same target at the same moment. At its most basic, the coordination requires visual contact and a brief telepathic countdown. The simultaneous strike deals more damage than either attack alone, as the target cannot defend against both directions at once.</w:t>
+      </w:r>
+    </w:p>
+    <w:p>
+      <w:r>
+        <w:t>Lifeshare — Allows Ren and vitality to flow through the bond, healing either the user or the creature. At its most basic, the healing is moderate — it can close wounds and ease pain, but cannot regenerate lost limbs. The flow of vitality feels like warmth traveling along the bond, and both parties feel a brief drain during the transfer.</w:t>
+      </w:r>
+    </w:p>
+    <w:p>
+      <w:r>
+        <w:t>Blood Ascension — Accelerates the growth and potential of a bonded creature through shared experience and Ren exposure. At its most basic, the ascension is slow — the creature's physical abilities improve marginally over weeks of training. The beastmaster must actively channel Ren into the creature during rest periods for the ascension to take effect.</w:t>
+      </w:r>
+    </w:p>
+    <w:p>
+      <w:r>
+        <w:t>Alpha Will — Allows the user to maintain bonds with multiple creatures and coordinate all of them with high precision. At its most basic, the alpha can manage two or three bonds simultaneously, issuing orders and sharing senses across all of them. The mental strain is significant, and the alpha must rest frequently to avoid exhaustion.</w:t>
+      </w:r>
+    </w:p>
+    <w:p>
+      <w:pPr>
+        <w:pStyle w:val="Heading2"/>
+      </w:pPr>
+      <w:r>
+        <w:t>Smithing</w:t>
+      </w:r>
+    </w:p>
+    <w:p>
+      <w:r>
+        <w:t>Hammerborn — Shapes metal into functional weapons and armor using a forge, hammer, and basic Veyn reinforcement. At its most basic, the smith can create simple blades and basic chainmail — functional but unremarkable. The Veyn reinforcement adds minor durability and sharpness. The hammer strikes resonate with a faint silver glow as Veyn is channeled into the metal.</w:t>
+      </w:r>
+    </w:p>
+    <w:p>
+      <w:r>
+        <w:t>Star Temper — Channels Veyn into metal during forging, giving the finished item minor magical properties such as increased sharpness or durability. At its most basic, the temper adds a single property — a blade that holds its edge longer, or armor that absorbs slightly more impact. The Veyn must be channeled continuously during the final hammer strikes.</w:t>
+      </w:r>
+    </w:p>
+    <w:p>
+      <w:r>
+        <w:t>Vital Edge — Channels the smith's own Ren into a weapon during forging, increasing its striking power. At its most basic, the Ren infusion adds raw physical damage — the weapon hits harder than its weight would suggest. Unlike Veyn infusion, this works through the user's own Vitality rather than ambient energy, and the smith feels drained after the process.</w:t>
+      </w:r>
+    </w:p>
+    <w:p>
+      <w:r>
+        <w:t>Crimson Forge — Uses angel or demon blood in the forge to create weapons capable of harming high-rank beings. At its most basic, the blood must be from a low-rank source — a Gnash or Lumen. Extremely dangerous if mishandled, as the blood is reactive to Veyn and a mistake can kill the smith. The blood sizzles and sparks when it touches the heated metal.</w:t>
+      </w:r>
+    </w:p>
+    <w:p>
+      <w:r>
+        <w:t>True Edge — Instantly judges a weapon's quality, construction, enchantments, and weaknesses through examination. At its most basic, the assessment is surface-level — the smith can tell if a blade is well-balanced and detect obvious flaws, but cannot identify hidden enchantments. The judgment feels like a pulse of Veyn extending from the hands into the weapon.</w:t>
+      </w:r>
+    </w:p>
+    <w:p>
+      <w:r>
+        <w:t>Aegis Craft — Specializes in creating armor that absorbs, deflects, or redistributes both physical and magical impacts. At its most basic, the armor can withstand a few strong blows before failing. The smith must layer multiple materials and channel Veyn between each layer to create the redistribution effect.</w:t>
+      </w:r>
+    </w:p>
+    <w:p>
+      <w:r>
+        <w:t>Soulseal — Fuses lasting magical effects directly into the metal during the final stage of forging. At its most basic, the seal adds a single enchantment — a blade that glows in the dark, or armor that resists fire. The enchantment is permanent as long as the metal remains intact. The seal appears as a faint runic pattern on the finished item.</w:t>
+      </w:r>
+    </w:p>
+    <w:p>
+      <w:r>
+        <w:t>Reforge — Fully repairs damaged weapons and armor, including broken blades and worn enchantments. At its most basic, the reforge can mend cracks, re-sharpen edges, and restore minor enchantments. The smith must heat the item to forging temperature and work the metal back into shape while channeling Veyn.</w:t>
+      </w:r>
+    </w:p>
+    <w:p>
+      <w:r>
+        <w:t>Mythforge — Creates multi-layered legendary weapons and armor using materials that lesser smiths cannot work with. At its most basic, the mythforge can handle rare materials like dragon bone or mithril, combining them with Veyn-infused alloys. The resulting items are far superior to standard equipment.</w:t>
+      </w:r>
+    </w:p>
+    <w:p>
+      <w:r>
+        <w:t>Bloodalloy — Advanced bloodforging that allows mixing blood from different ranks or even angel and demon blood. At its most basic, the alloy creates weapons that can wound or kill beings immune to normal weapons. Extremely powerful and extremely risky — the mixed blood is volatile and can explode if the temperature is wrong.</w:t>
+      </w:r>
+    </w:p>
+    <w:p>
+      <w:pPr>
+        <w:pStyle w:val="Heading2"/>
+      </w:pPr>
+      <w:r>
+        <w:t>Enchanter</w:t>
+      </w:r>
+    </w:p>
+    <w:p>
+      <w:r>
+        <w:t>Sparkbind — Gives ordinary items simple lasting magical properties (glow, sharpness, resistance, etc.). At its most basic, the enchantment is minor — a blade that stays sharp a little longer, a cloak that repels light rain. The process requires direct contact with the item and a focused Veyn pulse. The enchantment fades over months unless reinforced.</w:t>
+      </w:r>
+    </w:p>
+    <w:p>
+      <w:r>
+        <w:t>Deepbind — Channels Veyn into a finished item to create stronger and more complex magical effects. At its most basic, the bind creates a moderate enchantment — a shield that absorbs a single strong blow, a ring that enhances perception briefly. The Veyn must be precisely measured, as too much causes the item to crack.</w:t>
+      </w:r>
+    </w:p>
+    <w:p>
+      <w:r>
+        <w:t>Runeread — Fully reads and understands existing enchantments on an item — their function, strength, and stability. At its most basic, the read identifies the type and power of the enchantment, but cannot determine how to modify it. The reader's eyes glow faintly as they trace the runic patterns with their gaze.</w:t>
+      </w:r>
+    </w:p>
+    <w:p>
+      <w:r>
+        <w:t>Unweave — Cleanly removes an enchantment from an item without damaging it. At its most basic, the unweave works on simple enchantments only — complex or layered effects may resist or damage the item. Poor execution can destroy the item. The process involves channeling Veyn into the enchantment and carefully unraveling its structure.</w:t>
+      </w:r>
+    </w:p>
+    <w:p>
+      <w:r>
+        <w:t>Heighten — Strengthens and stabilizes an existing enchantment, making it more potent or longer-lasting. At its most basic, the heighten adds a marginal boost — perhaps 20% stronger or lasts twice as long. Requires a deep understanding of the original enchantment to avoid destabilizing it.</w:t>
+      </w:r>
+    </w:p>
+    <w:p>
+      <w:r>
+        <w:t>Overlay — Fuses two or more compatible enchantments onto a single item. At its most basic, the overlay can combine two simple effects — a blade that is both sharp and fire-resistant. Incompatible ones can cancel or destroy the item. The enchanter must identify compatible enchantments before attempting the fusion.</w:t>
+      </w:r>
+    </w:p>
+    <w:p>
+      <w:r>
+        <w:t>Guardseal — Creates defensive enchantments on shields, armor, or objects that absorb or deflect incoming attacks. At its most basic, the seal creates a barrier that can absorb a few hits before failing. The enchantment appears as a glowing runic circle on the item's surface.</w:t>
+      </w:r>
+    </w:p>
+    <w:p>
+      <w:r>
+        <w:t>Wrathseal — Places offensive trigger enchantments on weapons that activate on impact (fire, force, etc.). At its most basic, the seal adds a single elemental burst on hit — a burst of flame, a shock of lightning, or a blast of force. The enchantment triggers once per charge and must be replenished.</w:t>
+      </w:r>
+    </w:p>
+    <w:p>
+      <w:r>
+        <w:t>Living Rune — Creates complex, adaptive enchantments that can respond to threats or evolve over time. At its most basic, the living rune can detect incoming attacks and adjust its defense accordingly. The rune appears as a shifting, luminous pattern that moves across the item's surface.</w:t>
+      </w:r>
+    </w:p>
+    <w:p>
+      <w:r>
+        <w:t>Newscript — Allows the user to research and develop entirely new enchantment patterns and effects. At its most basic, the newscript can create minor variations on existing enchantments — a fire enchantment that burns colder, a shield that hardens on impact. The research requires extensive experimentation and documentation.</w:t>
+      </w:r>
+    </w:p>
+    <w:p>
+      <w:pPr>
+        <w:pStyle w:val="Heading2"/>
+      </w:pPr>
+      <w:r>
+        <w:t>Diviner</w:t>
+      </w:r>
+    </w:p>
+    <w:p>
+      <w:r>
+        <w:t>Clear Sight — Sees through lies, disguises, and magical concealment, including abilities like Duskveil and Wraithcloth. At its most basic, the sight is instinctive — the Diviner simply knows when something is false. The effect is always active and cannot be turned off, which can be overwhelming in crowded areas.</w:t>
+      </w:r>
+    </w:p>
+    <w:p>
+      <w:r>
+        <w:t>Far Sight — Glimpses fragmented possible futures as symbols, feelings, or brief flashes. At its most basic, the visions are vague and symbolic — a red door might mean danger, a broken chain might mean freedom. Further and clearer visions cost more Veyn and become less reliable the further ahead the Diviner tries to see.</w:t>
+      </w:r>
+    </w:p>
+    <w:p>
+      <w:r>
+        <w:t>Past Echo — Views residual past events tied to a specific location or person. At its most basic, the echoes are brief and distorted — like watching a scene through frosted glass. Clarity depends on the strength of the remaining Veyn traces. Strong emotional events leave clearer echoes than mundane ones.</w:t>
+      </w:r>
+    </w:p>
+    <w:p>
+      <w:r>
+        <w:t>Liebreak — Detects lies and deception in real time through changes in a target's Veyn flow and aura. At its most basic, the detection is subtle — the Diviner feels a slight distortion in the target's aura when they speak falsely. The sensation is brief and can be missed if the Diviner is not focused.</w:t>
+      </w:r>
+    </w:p>
+    <w:p>
+      <w:r>
+        <w:t>Flowsense — Senses the presence, density, and nature of Veyn in the surrounding area, including corrupted or holy variants. At its most basic, the sense covers a short radius — perhaps twenty meters. The Diviner can distinguish between raw, corrupted, and holy Veyn, but cannot determine the exact source without moving closer.</w:t>
+      </w:r>
+    </w:p>
+    <w:p>
+      <w:r>
+        <w:t>Soulgaze — Reads the auras of living beings to reveal emotional state, health, hidden abilities, and magical influence. At its most basic, the gaze shows surface emotions and obvious physical conditions. Deeper readings require sustained focus and may be resisted by strong-willed targets.</w:t>
+      </w:r>
+    </w:p>
+    <w:p>
+      <w:r>
+        <w:t>Deep Vision — A prepared ritual form of Far Sight that produces clearer and more detailed visions at the cost of time and materials. At its most basic, the ritual requires a quiet space, incense, and a focal object. The visions are clearer than raw Far Sight but still symbolic and open to interpretation.</w:t>
+      </w:r>
+    </w:p>
+    <w:p>
+      <w:r>
+        <w:t>Mindlock — Protects the user's mind and aura from being read or influenced by other Diviners or mental abilities. At its most basic, the lock blocks casual reading and minor psychic intrusions. Stronger effects may break through, but the lock alerts the Diviner to the attempt.</w:t>
+      </w:r>
+    </w:p>
+    <w:p>
+      <w:r>
+        <w:t>Bond Sight — Allows the user to perceive the emotional and magical bonds connecting people. At its most basic, the sight shows faint threads of connection — friendship, rivalry, love, hatred. The threads vary in color and thickness based on the strength and nature of the bond.</w:t>
+      </w:r>
+    </w:p>
+    <w:p>
+      <w:r>
+        <w:t>Allsight — Temporarily combines multiple divination effects, granting a brief period of heightened all-around awareness. At its most basic, the allsight lasts only a few seconds and causes severe mental fatigue afterward. During the effect, the Diviner perceives truth, past, future, and bonds simultaneously.</w:t>
+      </w:r>
+    </w:p>
+    <w:p>
+      <w:pPr>
+        <w:pStyle w:val="Heading2"/>
+      </w:pPr>
+      <w:r>
+        <w:t>Exorcist</w:t>
+      </w:r>
+    </w:p>
+    <w:p>
+      <w:r>
+        <w:t>Whitefire — Channels Veyn to cleanse corrupted or unstable Veyn from a person, object, or area. At its most basic, the whitefire removes surface corruption — miasma stains, minor curses, tainted objects. The fire appears as a pale, cold flame that burns away corruption without harming the living.</w:t>
+      </w:r>
+    </w:p>
+    <w:p>
+      <w:r>
+        <w:t>Fallen Bind — Specialized binding techniques used to suppress and contain the unstable power of Fallen Angels. At its most basic, the bind creates Veyn chains that restrain a Fallen Angel's physical form. The chains glow with purified Veyn and tighten if the target struggles.</w:t>
+      </w:r>
+    </w:p>
+    <w:p>
+      <w:r>
+        <w:t>Miasma Break — Extracts and neutralizes demonic miasma from living beings, places, or objects. At its most basic, the extraction is painful for the target — the miasma clings to the body and must be pulled out strand by strand. The process often causes the target to scream as the corruption is torn free.</w:t>
+      </w:r>
+    </w:p>
+    <w:p>
+      <w:r>
+        <w:t>Stillflow — Calms chaotic or fluctuating Veyn, preventing it from becoming corrupted or dangerously unstable. At its most basic, the stillflow stabilizes a small area — perhaps a room or a patch of ground. The effect is temporary and must be maintained with ongoing Veyn channeling.</w:t>
+      </w:r>
+    </w:p>
+    <w:p>
+      <w:r>
+        <w:t>Expulsion Rite — A formal ritual that forces out deep possession, curses, or heavy contamination. At its most basic, the rite requires a ritual circle, specific components, and several hours of focused chanting. The more entrenched the corruption, the longer and more dangerous the ritual becomes.</w:t>
+      </w:r>
+    </w:p>
+    <w:p>
+      <w:r>
+        <w:t>Holy Bastion — Creates a barrier of purified Veyn that is especially effective against demons, undead, and miasma. At its most basic, the bastion blocks physical attacks and weakens corrupted beings who touch it. The barrier appears as a wall of pale, cold light.</w:t>
+      </w:r>
+    </w:p>
+    <w:p>
+      <w:r>
+        <w:t>Purge Strike — Channels purified Veyn into a physical attack that deals heavy extra damage to corrupted beings. At its most basic, the strike is a single powerful blow that disrupts the target's corrupted Veyn on contact. The more corrupted the target, the more effective the strike becomes.</w:t>
+      </w:r>
+    </w:p>
+    <w:p>
+      <w:r>
+        <w:t>Mass Cleanse — Allows the purification of multiple targets or a wide area at once. At its most basic, the cleanse covers a small group — perhaps five or ten people. Requires significant Veyn and concentration, and the effect is weaker than individual purification.</w:t>
+      </w:r>
+    </w:p>
+    <w:p>
+      <w:r>
+        <w:t>Spirit Drive — Forces powerful residual spirits or wills to disperse or leave an area. At its most basic, the drive weakens the spirit's hold and forces it to retreat temporarily. The spirit may return if the underlying cause is not addressed.</w:t>
+      </w:r>
+    </w:p>
+    <w:p>
+      <w:r>
+        <w:t>Eternal Seal — Places a powerful, lasting suppression on extreme corruption or dangerous entities, locking their power away. At its most basic, the seal can contain moderate corruption for decades. The seal appears as a glowing runic circle that burns into the target's body or the surrounding area.</w:t>
+      </w:r>
+    </w:p>
+    <w:p>
+      <w:pPr>
+        <w:pStyle w:val="Heading2"/>
+      </w:pPr>
+      <w:r>
+        <w:t>Broker</w:t>
+      </w:r>
+    </w:p>
+    <w:p>
+      <w:r>
+        <w:t>Balance — Drafts, reads, and balances contracts so that terms are clear, enforceable, and as fair as possible. At its most basic, the Broker can create simple trade agreements with clear penalties for breach. The contract is magically binding once signed, but the terms must be reasonable.</w:t>
+      </w:r>
+    </w:p>
+    <w:p>
+      <w:r>
+        <w:t>Bindword — Magically triggers the penalties written into a signed contract when a party breaks the terms. At its most basic, the enforcement is automatic — the moment a breach is detected, the penalty activates. The Broker must be within range to witness the breach.</w:t>
+      </w:r>
+    </w:p>
+    <w:p>
+      <w:r>
+        <w:t>Loophole — Detects hidden clauses, loopholes, and magical bindings inside a contract. At its most basic, the detection identifies obvious traps and unfair terms. Hidden or magically concealed clauses require deeper examination.</w:t>
+      </w:r>
+    </w:p>
+    <w:p>
+      <w:r>
+        <w:t>Contract Break — Forcibly dissolves a signed contract. At its most basic, the break carries a high risk of backlash to both parties and the Broker. The backlash manifests as a surge of painful Veyn that can injure or incapacitate.</w:t>
+      </w:r>
+    </w:p>
+    <w:p>
+      <w:r>
+        <w:t>Silver Tongue — Expert persuasion and negotiation used to find acceptable terms between hostile or difficult parties. At its most basic, the Broker can calm tensions and find minor compromises. The skill relies on reading body language and Veyn fluctuations as much as words.</w:t>
+      </w:r>
+    </w:p>
+    <w:p>
+      <w:r>
+        <w:t>Falsesense — Senses dishonesty during negotiations through body language, voice, and small Veyn fluctuations. At its most basic, the sense detects obvious lies and evasions. Subtle deception or magically enhanced lying may slip through.</w:t>
+      </w:r>
+    </w:p>
+    <w:p>
+      <w:r>
+        <w:t>Backlash Guard — Creates a protective ward that guards the Broker against magical backlash from contracts and hostile parties. At its most basic, the ward absorbs a single instance of backlash before needing to be renewed. The ward appears as a faint glow around the Broker's hands.</w:t>
+      </w:r>
+    </w:p>
+    <w:p>
+      <w:r>
+        <w:t>Web — Maintains a web of contacts, informants, and fellow Brokers across different areas and realms. At its most basic, the web provides basic information and local contacts in major cities. Expanding the web requires time and trust-building.</w:t>
+      </w:r>
+    </w:p>
+    <w:p>
+      <w:r>
+        <w:t>Pressure — Turns small pieces of information or minor advantages into strong negotiating positions. At its most basic, the Broker can leverage a single piece of leverage into a favorable term. The skill requires quick thinking and intimate knowledge of the other party's fears.</w:t>
+      </w:r>
+    </w:p>
+    <w:p>
+      <w:r>
+        <w:t>Ironword — Creates high-stakes contracts that are extremely difficult to break and carry severe consequences. At its most basic, the ironword binds the signer to terms that cannot be escaped by any known means. The penalty for breaking an ironword is catastrophic — often death or permanent loss of power.</w:t>
+      </w:r>
+    </w:p>
+    <w:p>
+      <w:pPr>
+        <w:pStyle w:val="Heading2"/>
+      </w:pPr>
+      <w:r>
+        <w:t>Saintess</w:t>
+      </w:r>
+    </w:p>
+    <w:p>
+      <w:r>
+        <w:t>Light Mend — Channels Holy Energy to heal wounds and purge corruption-related ailments more effectively than ordinary healing. At its most basic, the mend closes minor wounds and eases pain. The light is warm and gentle, and the patient feels a soothing heat spread through the affected area.</w:t>
+      </w:r>
+    </w:p>
+    <w:p>
+      <w:r>
+        <w:t>Radiant Aegis — Creates a barrier of Holy Energy that is especially strong against demonic and corrupted attacks. At its most basic, the aegis blocks a single attack before fading. The barrier appears as a disc of golden light that burns corrupted beings on contact.</w:t>
+      </w:r>
+    </w:p>
+    <w:p>
+      <w:r>
+        <w:t>Holy Purge — Purifies curses, miasma, and corruption from a target or area with focused Holy Energy. At its most basic, the purge removes surface-level contamination — a cursed object, a miasma stain, a minor hex. The process causes the corruption to dissolve into golden sparks.</w:t>
+      </w:r>
+    </w:p>
+    <w:p>
+      <w:r>
+        <w:t>Burning Guard — Forms a radiant shield that blocks attacks and burns corrupted beings on contact. At its most basic, the guard absorbs a few hits and deals minor burn damage to undead or demons who touch it. The shield dims as it absorbs damage.</w:t>
+      </w:r>
+    </w:p>
+    <w:p>
+      <w:r>
+        <w:t>Judgment Blow — Infuses a melee attack with Holy Energy that deals heavy extra damage to undead and demons. At its most basic, the blow is a single powerful strike that disrupts the target's unholy essence. The attack leaves a lingering burn of purified light on the target.</w:t>
+      </w:r>
+    </w:p>
+    <w:p>
+      <w:r>
+        <w:t>Blessing — Temporarily boosts an ally's resistance to corruption and increases their Veyn recovery. At its most basic, the blessing lasts a few minutes and provides a marginal improvement. The blessed ally glows faintly with golden light for the duration.</w:t>
+      </w:r>
+    </w:p>
+    <w:p>
+      <w:r>
+        <w:t>Sacred Ground — Places a lasting holy zone that repels corrupted beings and slowly purifies the area. At its most basic, the zone covers a small area and lasts only a short time. Undead and demons who enter the zone take burn damage and are weakened.</w:t>
+      </w:r>
+    </w:p>
+    <w:p>
+      <w:r>
+        <w:t>Reveal Light — Emits cleansing light that reveals hidden beings, burns undead, and weakens demonic power. At its most basic, the light covers a moderate area and forces invisible or concealed beings to become visible. Undead and demons are slowed and weakened by the light.</w:t>
+      </w:r>
+    </w:p>
+    <w:p>
+      <w:r>
+        <w:t>Holy Precision — Allows precise and selective use of Holy Energy for complex healing and combat applications. At its most basic, the precision allows the Saintess to target specific wounds or corruption without affecting surrounding tissue. The control requires intense concentration.</w:t>
+      </w:r>
+    </w:p>
+    <w:p>
+      <w:r>
+        <w:t>Divine Act — Advanced holy techniques that can produce effects beyond normal limits of the class. At its most basic, the divine act can achieve seemingly impossible feats — curing incurable diseases, banishing powerful demons, or creating barriers that last for days. The cost is severe physical and spiritual exhaustion.</w:t>
+      </w:r>
+    </w:p>
+    <w:p>
+      <w:pPr>
+        <w:pStyle w:val="Heading2"/>
+      </w:pPr>
+      <w:r>
+        <w:t>Clergy</w:t>
+      </w:r>
+    </w:p>
+    <w:p>
+      <w:r>
+        <w:t>Soft Heal — Channels Veyn to heal minor wounds, cuts, bruises, and light burns. At its most basic, the healing is gentle and slow — the wound closes over several seconds, and the patient feels warmth spreading through the area. The Veyn消耗 is minimal.</w:t>
+      </w:r>
+    </w:p>
+    <w:p>
+      <w:r>
+        <w:t>Deep Heal — Heals serious injuries such as broken bones, deep cuts, and internal damage. Takes more time and Veyn than basic healing. At its most basic, the deep heal can mend a broken arm or close a deep laceration, but the process takes minutes and drains the healer significantly.</w:t>
+      </w:r>
+    </w:p>
+    <w:p>
+      <w:r>
+        <w:t>Recovery Rite — A prepared healing ritual used for wounds too severe for direct methods. Takes time but can save lives. At its most basic, the rite requires a quiet space, bandages, and focused Veyn channeling over several hours. The patient must remain still throughout.</w:t>
+      </w:r>
+    </w:p>
+    <w:p>
+      <w:r>
+        <w:t>Protect Field — Creates a barrier that absorbs damage directed at wounded allies, giving the healer time to work. At its most basic, the field absorbs a few hits before failing. The barrier appears as a translucent dome of pale light over the patient.</w:t>
+      </w:r>
+    </w:p>
+    <w:p>
+      <w:r>
+        <w:t>Lifebloom — Places a lasting effect on an ally that accelerates their natural healing over several hours. At its most basic, the lifebloom speeds recovery by a small margin — a wound that would take days heals in half the time. The effect persists through mild activity.</w:t>
+      </w:r>
+    </w:p>
+    <w:p>
+      <w:r>
+        <w:t>Healing Ground — Creates a zone that continuously heals anyone inside it. At its most basic, the zone covers a small area and provides slow, passive healing. Useful for field treatment areas where multiple wounded need attention.</w:t>
+      </w:r>
+    </w:p>
+    <w:p>
+      <w:r>
+        <w:t>Calm Light — Emits a gentle light that eases pain, calms the mind, and mildly speeds recovery in those nearby. At its most basic, the light covers a moderate radius and provides marginal relief. The effect is passive and does not require active concentration.</w:t>
+      </w:r>
+    </w:p>
+    <w:p>
+      <w:r>
+        <w:t>Life Restore — Advanced healing capable of restoring lost limbs (with rare components) and pulling someone back from the edge of death. At its most basic, the restore can mend even catastrophic injuries if the patient is not already dead. Requires rare reagents and hours of work.</w:t>
+      </w:r>
+    </w:p>
+    <w:p>
+      <w:r>
+        <w:t>Special Cure — Develops and applies specialized treatments for rare conditions and unique injuries. At its most basic, the cure can address conditions that standard healing cannot — magical diseases, cursed wounds, Veyn corruption. Each case requires research and custom formulation.</w:t>
+      </w:r>
+    </w:p>
+    <w:p>
+      <w:r>
+        <w:t>Healer's Hand — Allows the user to effectively train others in healing techniques, helping maintain the number of capable healers. At its most basic, the teacher can convey basic healing methods to students. The skill includes the ability to diagnose student errors and correct them.</w:t>
+      </w:r>
+    </w:p>
+    <w:p>
+      <w:pPr>
+        <w:pStyle w:val="Heading2"/>
+      </w:pPr>
+      <w:r>
+        <w:t>Archer</w:t>
+      </w:r>
+    </w:p>
+    <w:p>
+      <w:r>
+        <w:t>Spell Arrow — Enchants an arrow with Veyn before firing, adding elemental or force effects that activate on impact. At its most basic, the enchantment adds a single elemental burst — fire, ice, or force. The arrow carries the enchantment until impact, and the effect is modest.</w:t>
+      </w:r>
+    </w:p>
+    <w:p>
+      <w:r>
+        <w:t>Sunder Arrow — Focuses Veyn into the arrowhead so it can punch through armor, shields, and barriers. At its most basic, the sunder can penetrate light armor and wooden shields. Heavier protection may resist or slow the arrow.</w:t>
+      </w:r>
+    </w:p>
+    <w:p>
+      <w:r>
+        <w:t>Burst Arrow — Creates arrows that detonate on impact, damaging everything in a small radius. At its most basic, the burst is small — enough to wound nearby enemies but not lethal to anyone beyond the immediate blast zone. The explosion scatters residual Veyn.</w:t>
+      </w:r>
+    </w:p>
+    <w:p>
+      <w:r>
+        <w:t>Homing Bolt — Enchants an arrow so it actively adjusts its path mid-flight to follow a designated target. At its most basic, the homing is weak — the arrow curves gently toward the target and can be dodged by quick movement. The tracking lasts only a few seconds.</w:t>
+      </w:r>
+    </w:p>
+    <w:p>
+      <w:r>
+        <w:t>Skyfall — Launches a volley of enchanted arrows into the air to rain down over a wide area. At its most basic, the skyfall covers a moderate area and each arrow carries a basic enchantment. The arrows fall at steep angles, making them difficult to block.</w:t>
+      </w:r>
+    </w:p>
+    <w:p>
+      <w:r>
+        <w:t>Quiver Wall — Plants arrows in the ground to form a temporary Veyn barrier that blocks incoming attacks. At its most basic, the wall covers a short stretch and absorbs a few hits. The arrows glow with Veyn and serve as anchor points for the barrier.</w:t>
+      </w:r>
+    </w:p>
+    <w:p>
+      <w:r>
+        <w:t>Final Arrow — A single, fully charged arrow fired with extreme speed and penetrating power. At its most basic, the final arrow carries the full force of the archer's Veyn and can punch through heavy armor. The shot leaves the archer temporarily drained.</w:t>
+      </w:r>
+    </w:p>
+    <w:p>
+      <w:r>
+        <w:t>Grace Arrow — Enchants an arrow with healing Veyn, allowing the archer to restore allies from a distance. At its most basic, the grace arrow can close minor wounds on impact. The arrow must strike the target gently — firing too hard negates the healing effect.</w:t>
+      </w:r>
+    </w:p>
+    <w:p>
+      <w:r>
+        <w:t>Perfect Shot — Allows complex multi-effect enchantments on arrows and extreme-range precision shooting. At its most basic, the perfect shot combines two effects on a single arrow — fire and piercing, or ice and homing. The precision allows hits at ranges beyond normal sight.</w:t>
+      </w:r>
+    </w:p>
+    <w:p>
+      <w:r>
+        <w:t>Arrowcraft — Develops entirely new forms of magical ammunition and arrow techniques. At its most basic, the arrowcraft can create arrows with unique properties — arrows that split into multiple projectiles, arrows that create barriers on impact, or arrows that drain Veyn from targets.</w:t>
+      </w:r>
+    </w:p>
+    <w:p>
+      <w:pPr>
+        <w:pStyle w:val="Heading2"/>
+      </w:pPr>
+      <w:r>
+        <w:t>Paladin</w:t>
+      </w:r>
+    </w:p>
+    <w:p>
+      <w:r>
+        <w:t>Golden Strike — Channels golden Ren into a powerful melee attack that burns corrupted beings and heals nearby allies. At its most basic, the strike is a single radiant blow that deals moderate damage to corruption and minor healing to allies. The golden energy flares briefly on impact.</w:t>
+      </w:r>
+    </w:p>
+    <w:p>
+      <w:r>
+        <w:t>Dawn Shield — Creates a radiant barrier that blocks attacks and burns corrupted beings on contact. At its most basic, the shield absorbs a few hits and deals minor burn damage to undead or demons. The barrier appears as a disc of golden light.</w:t>
+      </w:r>
+    </w:p>
+    <w:p>
+      <w:r>
+        <w:t>Auric Mend — Heals allies with golden Ren while purifying corruption inside the wounds. At its most basic, the mend closes wounds and removes minor corruption. The golden energy spreads through the patient's body like warm light.</w:t>
+      </w:r>
+    </w:p>
+    <w:p>
+      <w:r>
+        <w:t>Courage Aura — Strengthens nearby allies against fear, charm, and morale-breaking effects. At its most basic, the aura provides a marginal boost to mental resistance. Allies near the Paladin feel a surge of confidence and determination.</w:t>
+      </w:r>
+    </w:p>
+    <w:p>
+      <w:r>
+        <w:t>Final Judgment — A massive single-target strike of pure golden Ren that deals heavy damage to corrupted and undead beings. At its most basic, the judgment is a single devastating blow that can incapacitate a low-rank corrupted being. The golden energy explodes on impact.</w:t>
+      </w:r>
+    </w:p>
+    <w:p>
+      <w:r>
+        <w:t>Sacred Touch — Direct-contact healing that restores injuries and purifies corruption at the same time. At its most basic, the touch can mend moderate wounds and remove surface corruption. The healer must maintain physical contact throughout the process.</w:t>
+      </w:r>
+    </w:p>
+    <w:p>
+      <w:r>
+        <w:t>Holy Ground — Blesses an area so that it heals allies and damages corrupted beings standing on it. At its most basic, the ground covers a small area and provides passive healing to allies while burning undead. The effect lasts as long as the Paladin maintains concentration.</w:t>
+      </w:r>
+    </w:p>
+    <w:p>
+      <w:r>
+        <w:t>Guardian Seal — Places an automatic protective ward on an ally that activates when they are attacked. At its most basic, the seal absorbs a single hit and then shatters. The ward appears as a faint golden glow on the ally's shoulder.</w:t>
+      </w:r>
+    </w:p>
+    <w:p>
+      <w:r>
+        <w:t>Oath Power — Temporarily increases the Paladin's power when their allies are in serious danger. At its most basic, the power boost is moderate — increased strength, speed, and Ren output for a short duration. The boost fades once the danger passes.</w:t>
+      </w:r>
+    </w:p>
+    <w:p>
+      <w:r>
+        <w:t>Radiant Champion — A full temporary empowerment that turns the Paladin into a beacon of golden light, greatly enhancing all abilities. At its most basic, the champion form lasts only a minute and leaves the Paladin exhausted afterward. During the form, all paladin abilities are doubled in power.</w:t>
+      </w:r>
+    </w:p>
+    <w:p>
+      <w:pPr>
+        <w:pStyle w:val="Heading2"/>
+      </w:pPr>
+      <w:r>
+        <w:t>Grimtender</w:t>
+      </w:r>
+    </w:p>
+    <w:p>
+      <w:r>
+        <w:t>Awaken — Channels Veyn into the remains of a fallen creature, reanimating it as an undead servant under the user's control. At its most basic, the awakened creature retains basic physical abilities but moves stiffly and slowly. The Veyn cost is moderate.</w:t>
+      </w:r>
+    </w:p>
+    <w:p>
+      <w:r>
+        <w:t>Dead Order — Issues precise combat orders to one or more reanimated servants. At its most basic, the orders are simple — attack, defend, move to position. The undead respond slowly but obey without question.</w:t>
+      </w:r>
+    </w:p>
+    <w:p>
+      <w:r>
+        <w:t>Bone Guard — Commands reanimated bodies to intercept attacks, using them as disposable shields. At its most basic, the guard takes full damage from the attack and may be destroyed. The Grimtender can reassemble destroyed undead later.</w:t>
+      </w:r>
+    </w:p>
+    <w:p>
+      <w:r>
+        <w:t>Grave Drain — Siphons residual Veyn from nearby corpses and remains to restore the user's own reserves. At its most basic, the drain extracts a small amount of Veyn from each corpse. The more powerful the remains, the more Veyn is gained.</w:t>
+      </w:r>
+    </w:p>
+    <w:p>
+      <w:r>
+        <w:t>Death Pulse — Releases a wave of necrotic energy that weakens living targets and strengthens undead ones. At its most basic, the pulse covers a small area and causes minor weakness in living targets while slightly boosting undead movement speed.</w:t>
+      </w:r>
+    </w:p>
+    <w:p>
+      <w:r>
+        <w:t>Bone Legion — Reanimates a large number of remains at once, creating a group of undead servants. At its most basic, the legion can raise a dozen weak skeletons simultaneously. The more remains available, the larger the legion.</w:t>
+      </w:r>
+    </w:p>
+    <w:p>
+      <w:r>
+        <w:t>Bone Spear — Shapes bone into a projectile and launches it, carrying necrotic Veyn that damages on impact. At its most basic, the spear is a single bone shard that can wound a target. The necrotic Veyn causes lingering damage.</w:t>
+      </w:r>
+    </w:p>
+    <w:p>
+      <w:r>
+        <w:t>Soul Bind — Binds residual spirit more tightly to remains, creating stronger and more intelligent undead. At its most basic, the bind creates an undead that retains some of its former knowledge and can follow complex commands.</w:t>
+      </w:r>
+    </w:p>
+    <w:p>
+      <w:r>
+        <w:t>Grave Lord — Allows permanent high-quality undead and large-scale simultaneous control. At its most basic, the lord can maintain a dozen powerful undead indefinitely and coordinate them in battle. The mental strain is significant.</w:t>
+      </w:r>
+    </w:p>
+    <w:p>
+      <w:r>
+        <w:t>Soul Take — Extracts and stores residual essence from the newly dead for later use in powerful reanimation. At its most basic, the take preserves the spirit's essence for weeks, allowing the Grimtender to create elite undead later.</w:t>
+      </w:r>
+    </w:p>
+    <w:p>
+      <w:pPr>
+        <w:pStyle w:val="Heading2"/>
+      </w:pPr>
+      <w:r>
+        <w:t>Bladesinger</w:t>
+      </w:r>
+    </w:p>
+    <w:p>
+      <w:r>
+        <w:t>Wide Cut — A rapid sweeping sword strike that can hit multiple targets in one motion. At its most basic, the cleave can strike two or three enemies in a line. The blade moves so fast it leaves a faint crimson trail in the air.</w:t>
+      </w:r>
+    </w:p>
+    <w:p>
+      <w:r>
+        <w:t>Blood Edge — Coats the blade in concentrated Ren, greatly increasing its cutting power. At its most basic, the Ren edge lasts only a few strikes before fading. The coated blade can cut through materials that would normally resist steel.</w:t>
+      </w:r>
+    </w:p>
+    <w:p>
+      <w:r>
+        <w:t>Blade Dance — Uses rapid, precise blade movements to deflect incoming attacks with minimal effort. At its most basic, the dance can redirect one or two attacks before the user must reset. The movements are fluid and instinctive.</w:t>
+      </w:r>
+    </w:p>
+    <w:p>
+      <w:r>
+        <w:t>Return Cut — Responds to an incoming attack with an immediate and precise counter-strike. At its most basic, the counter is a single reactive slash that exploits the attacker's opening. The more committed the attack, the more devastating the return.</w:t>
+      </w:r>
+    </w:p>
+    <w:p>
+      <w:r>
+        <w:t>Wind Step — Uses Ren to propel the user forward in a burst of speed, closing distance instantly. At its most basic, the step covers a short distance and creates a small gust of wind. The movement is nearly instantaneous.</w:t>
+      </w:r>
+    </w:p>
+    <w:p>
+      <w:r>
+        <w:t>Ghost Cut — Strikes from an unexpected angle by masking the blade's movement with Ren. At its most basic, the cut obscures the blade's approach for a split second, making it difficult to defend. The strike seems to come from nowhere.</w:t>
+      </w:r>
+    </w:p>
+    <w:p>
+      <w:r>
+        <w:t>Storm of Blades — Unleashes a rapid series of Ren-enhanced slashes that create a whirlwind of attacks. At its most basic, the storm delivers three or four slashes in rapid succession. Each slash carries Ren and the combined force shreds through defenses.</w:t>
+      </w:r>
+    </w:p>
+    <w:p>
+      <w:r>
+        <w:t>Perfect Form — Passively enhances balance, coordination, and reaction speed, allowing the user to maintain form even while wounded. At its most basic, the form provides a moderate boost to agility and reaction time. The effect is always active.</w:t>
+      </w:r>
+    </w:p>
+    <w:p>
+      <w:r>
+        <w:t>Sword Song — Enters a focused state where Ren flows rhythmically through the body, enhancing all physical and blade techniques. At its most basic, the song boosts all physical abilities by a significant margin. The Ren flows in visible crimson patterns along the body.</w:t>
+      </w:r>
+    </w:p>
+    <w:p>
+      <w:r>
+        <w:t>Flawless Edge — The user executes every movement with optimal efficiency and zero wasted motion. At its most basic, the edge provides a major boost to all combat abilities — perfect strikes, perfect defense, perfect timing. The blade becomes an extension of the soul.</w:t>
+      </w:r>
+    </w:p>
+    <w:p>
+      <w:pPr>
+        <w:pStyle w:val="Heading2"/>
+      </w:pPr>
+      <w:r>
+        <w:t>Berserker</w:t>
+      </w:r>
+    </w:p>
+    <w:p>
+      <w:r>
+        <w:t>Blood Rage — Enters a controlled rage that greatly increases physical strength and pain tolerance while reducing precision. At its most basic, the rage boosts strength by about 50% and numbs pain. The user's eyes glow red and their muscles visibly tense.</w:t>
+      </w:r>
+    </w:p>
+    <w:p>
+      <w:r>
+        <w:t>Battle Roar — Releases a Ren-infused shout that staggers nearby enemies and weakens their resolve. At its most basic, the roar causes momentary disorientation and fear in weaker opponents. The sound carries a visible shockwave of crimson energy.</w:t>
+      </w:r>
+    </w:p>
+    <w:p>
+      <w:r>
+        <w:t>Killing Blow — Channels a massive burst of Ren into a single attack for extreme damage, leaving the user temporarily drained. At its most basic, the blow deals devastating damage to a single target but leaves the user vulnerable afterward.</w:t>
+      </w:r>
+    </w:p>
+    <w:p>
+      <w:r>
+        <w:t>All-In — Abandons defense for one devastating attack that leaves the user completely open afterward. At its most basic, the attack deals catastrophic damage to a single target but removes all defensive capability for a short time.</w:t>
+      </w:r>
+    </w:p>
+    <w:p>
+      <w:r>
+        <w:t>Never Fall — When health falls critically low, Ren automatically surges to keep the user fighting through wounds that would stop others. At its most basic, the surge provides a brief window of enhanced fighting ability before the exhaustion hits.</w:t>
+      </w:r>
+    </w:p>
+    <w:p>
+      <w:r>
+        <w:t>Mad Rampage — Fully unleashes rage, massively increasing strength and speed but removing the ability to distinguish friend from foe. At its most basic, the rampage doubles all physical abilities but the user attacks anything nearby.</w:t>
+      </w:r>
+    </w:p>
+    <w:p>
+      <w:r>
+        <w:t>Rage Burst — Explodes all accumulated Ren outward, damaging and knocking back everything nearby. At its most basic, the burst covers a small radius and deals moderate damage. The force can break grapples and shatter barriers.</w:t>
+      </w:r>
+    </w:p>
+    <w:p>
+      <w:r>
+        <w:t>Bone Break — A targeted strike meant to disable a specific body part, such as shattering a bone or tearing a tendon. At its most basic, the strike can break a single bone or tear a single muscle group. The damage is permanent without healing.</w:t>
+      </w:r>
+    </w:p>
+    <w:p>
+      <w:r>
+        <w:t>Final Rage — A final, suicidal burst of power used when death is certain, dealing catastrophic damage to everything nearby including the user. At its most basic, the rage creates a massive explosion of Ren that destroys everything in the immediate area.</w:t>
+      </w:r>
+    </w:p>
+    <w:p>
+      <w:r>
+        <w:t>War Cry — A roar so powerful it distorts the air, shatters weak structures, and empowers nearby allies while crushing enemy morale. At its most basic, the cry boosts allied fighting ability and staggers enemies. The sound is felt as much as heard.</w:t>
+      </w:r>
+    </w:p>
+    <w:p>
+      <w:pPr>
+        <w:pStyle w:val="Heading2"/>
+      </w:pPr>
+      <w:r>
+        <w:t>Sentinel</w:t>
+      </w:r>
+    </w:p>
+    <w:p>
+      <w:r>
+        <w:t>Iron Skin — Coats armor and shield in concentrated Ren, greatly increasing their durability. At its most basic, the Ren reinforcement adds a moderate boost to armor value. The armor glows faintly with crimson energy when struck.</w:t>
+      </w:r>
+    </w:p>
+    <w:p>
+      <w:r>
+        <w:t>Stone Wall — Creates a solid barrier of Ren in a chosen direction to block incoming attacks. At its most basic, the wall covers a short stretch and absorbs a few hits. The barrier appears as a translucent crimson wall.</w:t>
+      </w:r>
+    </w:p>
+    <w:p>
+      <w:r>
+        <w:t>Rooted Stance — The user plants their feet and becomes nearly immovable, taking reduced damage and resisting knockback. At its most basic, the stance provides a moderate damage reduction and prevents being pushed back. The user's feet seem to meld with the ground.</w:t>
+      </w:r>
+    </w:p>
+    <w:p>
+      <w:r>
+        <w:t>Challenge — Projects a challenge that forces enemies to focus their attacks on the Sentinel instead of allies. At its most basic, the challenge works on weaker-willed opponents and lasts only a few seconds. The Sentinel glows with a faint crimson aura.</w:t>
+      </w:r>
+    </w:p>
+    <w:p>
+      <w:r>
+        <w:t>Stand Firm — Allows the user to continue functioning even under severe injury by reinforcing the body with Ren. At its most basic, the Ren reinforcement numbs pain and keeps the body moving despite wounds. The effect is passive and always active.</w:t>
+      </w:r>
+    </w:p>
+    <w:p>
+      <w:r>
+        <w:t>Shield Crash — Slams the shield into an opponent with Ren-enhanced force, dealing damage and potentially stunning them. At its most basic, the crash deals moderate bludgeoning damage and may daze the target for a moment.</w:t>
+      </w:r>
+    </w:p>
+    <w:p>
+      <w:r>
+        <w:t>Shared Guard — Extends the Sentinel's protective effect to nearby allies, reducing the damage they take. At its most basic, the guard absorbs a portion of damage that would otherwise hit allies. The effect covers a small radius.</w:t>
+      </w:r>
+    </w:p>
+    <w:p>
+      <w:r>
+        <w:t>Protect Ally — Designates an ally to protect. The Sentinel automatically intercepts attacks aimed at that ally. At its most basic, the Sentinel reacts quickly to intercept but takes full damage from the attack.</w:t>
+      </w:r>
+    </w:p>
+    <w:p>
+      <w:r>
+        <w:t>Final Stand — Once per battle, when the user would fall, a reserve of Ren keeps them alive at 1 health for a short time. At its most basic, the stand lasts only a few seconds — enough to deliver one final attack or retreat.</w:t>
+      </w:r>
+    </w:p>
+    <w:p>
+      <w:r>
+        <w:t>Unbreakable — The user becomes a wide-area defensive bastion, taking drastically reduced damage and protecting a large zone around them. At its most basic, the bastion reduces incoming damage by a massive margin and covers a significant area.</w:t>
+      </w:r>
+    </w:p>
+    <w:p>
+      <w:pPr>
+        <w:pStyle w:val="Heading2"/>
+      </w:pPr>
+      <w:r>
+        <w:t>Ren Archer</w:t>
+      </w:r>
+    </w:p>
+    <w:p>
+      <w:r>
+        <w:t>Power Bolt — Coats an arrow in Ren before firing, increasing its force and penetration. At its most basic, the Ren coating adds moderate damage and allows the arrow to pierce light armor. The arrow glows faintly crimson in flight.</w:t>
+      </w:r>
+    </w:p>
+    <w:p>
+      <w:r>
+        <w:t>Heavy Draw — Charges an arrow with maximum Ren and fires it at extreme speed and power. At its most basic, the heavy draw deals devastating damage to a single target but drains significant Ren. The arrow leaves a crimson trail.</w:t>
+      </w:r>
+    </w:p>
+    <w:p>
+      <w:r>
+        <w:t>Quick Volley — Fires a quick succession of Ren-enhanced arrows without pausing between shots. At its most basic, the volley fires three or four arrows in rapid succession. Each arrow carries enough Ren to wound.</w:t>
+      </w:r>
+    </w:p>
+    <w:p>
+      <w:r>
+        <w:t>Armor Break — Concentrates Ren into the arrowhead so it can punch through heavy armor and shields. At its most basic, the break can penetrate medium armor and wooden shields. Heavier protection may resist.</w:t>
+      </w:r>
+    </w:p>
+    <w:p>
+      <w:r>
+        <w:t>Gale Step — Uses Ren to move quickly and silently, allowing rapid repositioning between shots. At its most basic, the step covers a short distance and is nearly silent. The movement leaves no trace.</w:t>
+      </w:r>
+    </w:p>
+    <w:p>
+      <w:r>
+        <w:t>Far Shot — Takes careful aim and fires a single arrow with perfect precision at extreme range. At its most basic, the far shot can hit targets beyond normal sight range. The Ren coating ensures the arrow maintains its trajectory.</w:t>
+      </w:r>
+    </w:p>
+    <w:p>
+      <w:r>
+        <w:t>Arrow Storm — Fires a dense cloud of Ren-coated arrows that blankets an area. At its most basic, the storm covers a moderate area and each arrow carries enough force to wound. The sheer volume makes it difficult to dodge.</w:t>
+      </w:r>
+    </w:p>
+    <w:p>
+      <w:r>
+        <w:t>Sidestep — A Ren-enhanced dodge that allows the user to avoid attacks while staying ready to fire. At its most basic, the sidestep provides a quick lateral movement that can evade a single attack. The user remains in firing stance.</w:t>
+      </w:r>
+    </w:p>
+    <w:p>
+      <w:r>
+        <w:t>Sharp Eye — Passively enhances vision, target tracking, and distance judgment. At its most basic, the eye provides a moderate boost to visual acuity and target acquisition. The effect is always active.</w:t>
+      </w:r>
+    </w:p>
+    <w:p>
+      <w:r>
+        <w:t>Arrow Master — Allows perfect accuracy while moving and the creation of hovering arrow constructs that can fire on command. At its most basic, the master can create two or three hovering arrows that fire independently. The accuracy is flawless.</w:t>
+      </w:r>
+    </w:p>
+    <w:p>
+      <w:pPr>
+        <w:pStyle w:val="Heading2"/>
+      </w:pPr>
+      <w:r>
+        <w:t>Veilrunner</w:t>
+      </w:r>
+    </w:p>
+    <w:p>
+      <w:r>
+        <w:t>Shadow Move — Uses Ren to move silently and quickly through dim light and shadows, becoming hard to track. At its most basic, the move reduces sound and allows passage through shadows without detection. The user appears as a fleeting dark shape.</w:t>
+      </w:r>
+    </w:p>
+    <w:p>
+      <w:r>
+        <w:t>No Sound — Completely suppresses all sound from the user's movements, including footsteps and clothing. At its most basic, the silence is absolute — the user makes no noise whatsoever. The effect is passive and always active.</w:t>
+      </w:r>
+    </w:p>
+    <w:p>
+      <w:r>
+        <w:t>Death from Behind — A high-damage precision strike delivered from behind, targeting vital points. At its most basic, the backstab deals massive damage and may be lethal on a clean hit. The strike targets the spine, neck, or kidneys.</w:t>
+      </w:r>
+    </w:p>
+    <w:p>
+      <w:r>
+        <w:t>Smoke Screen — Creates a cloud of smoke or dust that breaks line of sight and allows repositioning or escape. At its most basic, the screen covers a small area and lasts a few seconds. The smoke is thick and obscuring.</w:t>
+      </w:r>
+    </w:p>
+    <w:p>
+      <w:r>
+        <w:t>Phantom Dodge — Enhances reflexes and body control, allowing the user to dodge attacks with minimal movement. At its most basic, the dodge provides a moderate boost to evasion. The user's movements become fluid and unpredictable.</w:t>
+      </w:r>
+    </w:p>
+    <w:p>
+      <w:r>
+        <w:t>Poison Blade — Coats a blade in Ren-enhanced poison that slows, weakens, or paralyzes on contact. At its most basic, the poison causes minor weakness and slows the target briefly. The blade glows faintly with a sickly green light.</w:t>
+      </w:r>
+    </w:p>
+    <w:p>
+      <w:r>
+        <w:t>Lock Touch — Uses Ren to sense and manipulate the internal mechanisms of locks without physical tools. At its most basic, the touch can pick simple mechanical locks. Complex magical locks require deeper concentration.</w:t>
+      </w:r>
+    </w:p>
+    <w:p>
+      <w:r>
+        <w:t>Face Shift — Subtly alters posture, gait, and mannerisms to blend into crowds or imitate another person. At its most basic, the shift provides a general resemblance — not a perfect copy. The user can fool casual observation.</w:t>
+      </w:r>
+    </w:p>
+    <w:p>
+      <w:r>
+        <w:t>Disappear — Fully suppresses presence for a short time, becoming effectively invisible. At its most basic, the vanish lasts only a few seconds and movement is limited. The user's Veyn signature fades to nothing.</w:t>
+      </w:r>
+    </w:p>
+    <w:p>
+      <w:r>
+        <w:t>Living Shadow — Allows near-perfect stealth even at full speed, leaving almost no trace of the user's presence. At its most basic, the shadow provides near-invisible movement at walking speed. Faster movement may leave brief visual disturbances.</w:t>
+      </w:r>
+    </w:p>
+    <w:p>
+      <w:pPr>
+        <w:pStyle w:val="Heading2"/>
+      </w:pPr>
+      <w:r>
+        <w:t>Shudonkeeper</w:t>
+      </w:r>
+    </w:p>
+    <w:p>
+      <w:r>
+        <w:t>Stone Study — Deep analysis of Shudon construction, materials, design, and age through examination. At its most basic, the study can identify the age and general origin of a Shudon fragment. The analysis requires physical contact and focused Veyn probing.</w:t>
+      </w:r>
+    </w:p>
+    <w:p>
+      <w:r>
+        <w:t>Stone Keep — Repairs and maintains inactive Shudon, slowing further deterioration even if reactivation is impossible. At its most basic, the keep can patch cracks, clean surfaces, and reinforce fragile sections. The work is slow and meticulous.</w:t>
+      </w:r>
+    </w:p>
+    <w:p>
+      <w:r>
+        <w:t>Golem Lore — Theoretical knowledge of how the Shudon were originally created and what role the world core played. At its most basic, the lore covers the basic history and construction methods. The knowledge is mostly academic.</w:t>
+      </w:r>
+    </w:p>
+    <w:p>
+      <w:r>
+        <w:t>Ancient Read — Reads and interprets the ancient inscriptions found on Shudon and related relics. At its most basic, the read can decipher simple inscriptions and identify common symbols. Complex texts require extensive study.</w:t>
+      </w:r>
+    </w:p>
+    <w:p>
+      <w:r>
+        <w:t>Stone Whisper — Attempts to sense residual will or traces of the world core inside dormant Shudon through physical contact. At its most basic, the whisper provides faint impressions — emotions, images, or sounds. The contact must be sustained.</w:t>
+      </w:r>
+    </w:p>
+    <w:p>
+      <w:r>
+        <w:t>World Record — Comprehensive knowledge of the Shudon's historical role in the division of the realms. At its most basic, the record covers the major events and their significance. The knowledge is essential for understanding reactivation.</w:t>
+      </w:r>
+    </w:p>
+    <w:p>
+      <w:r>
+        <w:t>Awaken Theory — Develops and refines theoretical methods that might one day allow reactivation of the Shudon. At its most basic, the theory is speculative — logical but unproven. Each theory requires extensive research and documentation.</w:t>
+      </w:r>
+    </w:p>
+    <w:p>
+      <w:r>
+        <w:t>Keepers Archive — Organizes and preserves the collective research, observations, and theories of all previous Shudonkeepers. At its most basic, the archive can catalog and retrieve information efficiently. The archive grows with each generation.</w:t>
+      </w:r>
+    </w:p>
+    <w:p>
+      <w:r>
+        <w:t>Relic Sense — Detects and identifies Shudon-related relics and materials even when heavily damaged or buried. At its most basic, the sense covers a moderate radius and can distinguish Shudon materials from ordinary stone. The sense feels like a faint vibration.</w:t>
+      </w:r>
+    </w:p>
+    <w:p>
+      <w:r>
+        <w:t>Core Glimpse — Allows brief, incomplete glimpses of residual world-core patterns still present inside Shudon remains. At its most basic, the glimpse provides a flash of insight — a single image or feeling. The glimpse is disorienting and cannot be controlled.</w:t>
+      </w:r>
+    </w:p>
+    <w:p>
+      <w:pPr>
+        <w:pStyle w:val="Heading1"/>
+      </w:pPr>
+      <w:r>
+        <w:t>Additional Rules &amp; Notes</w:t>
+      </w:r>
+    </w:p>
+    <w:p>
+      <w:pPr>
+        <w:pStyle w:val="Heading2"/>
+      </w:pPr>
+      <w:r>
+        <w:t>Affinity &amp; Awakening</w:t>
+      </w:r>
+    </w:p>
+    <w:p>
+      <w:r>
+        <w:t>How Veyn affinity is revealed and chosen</w:t>
+      </w:r>
+    </w:p>
+    <w:p>
+      <w:r>
+        <w:t>At 15, every person is brought to the Sundering Altar where their latent connection to Veyn is unlocked — no one can consciously access magic before this. The altar doesn't teach them to use it; it simply opens the channel. The moment Veyn awakens, it manifests visibly in a way that reveals their affinity (combat-magic, healing, elemental control, beast-bonding, etc.) and their class — the specific discipline they are best suited for. The altar also determines their starting grade (how much latent Veyn they possess), which sets the foundation for their future growth. This is not a conscious choice in the moment; it is revealed based on what's already latent inside them. Path-choosing comes after: once someone knows their affinity and class, they choose how to pursue it (which order, mentor, discipline, or role to commit to).</w:t>
+        <w:br/>
+        <w:br/>
+        <w:t>Why the Academy matters: Awaken magic naturally is extremely difficult — even angels, who swear Veyn Vows to force their connection open, struggle with the process. Most humans and demons cannot awaken without help. The Sundering Altar was created by Kael von Ashen, the Headmaster of Elyndor Academy, using knowledge passed down from the Aelthar. The altar dramatically lowers the barrier to awakening, making it possible for ordinary people to access their Veyn. Because the altar is under the Academy's care, all children of every race — human, angel, demon, and beyond — are brought to Elyndor Academy at age 15 to undergo their awakening. The Academy provides the only reliable way for the world's people to develop magical abilities, which is why it holds such a central and respected position across all three realms.</w:t>
+      </w:r>
+    </w:p>
+    <w:p>
+      <w:pPr>
+        <w:pStyle w:val="Heading2"/>
+      </w:pPr>
+      <w:r>
+        <w:t>Class Skill Limits</w:t>
+      </w:r>
+    </w:p>
+    <w:p>
+      <w:r>
+        <w:t>Humans can master a class fully; other races are capped</w:t>
+      </w:r>
+    </w:p>
+    <w:p>
+      <w:r>
+        <w:t>All races can use skills of their chosen class, but since the Angel and Demon realms have innate skills already, the max skills they can learn from their class is 5, while humans can learn all the skills of that class.</w:t>
+      </w:r>
+    </w:p>
+    <w:p>
+      <w:pPr>
+        <w:pStyle w:val="Heading2"/>
+      </w:pPr>
+      <w:r>
+        <w:t>Veyn &amp; Ren Incompatibility</w:t>
+      </w:r>
+    </w:p>
+    <w:p>
+      <w:r>
+        <w:t>You can never hold both</w:t>
+      </w:r>
+    </w:p>
+    <w:p>
+      <w:r>
+        <w:t>Joining magic and Bladesinger is not possible since Veyn and Ren are not compatible; you can’t have Ren and Veyn together in your body since it can kill you due to their extreme incompatibility. The one exception is Smithing — a Smith may draw on both during the forge, but can never learn any skill outside Smithing and the forging of weapons. Angels and demons can unlock a Ren Organ to channel Ren, but the same rule applies: while the organ is open they cannot touch any Veyn, or the incompatibility kills them.</w:t>
+      </w:r>
+    </w:p>
+    <w:p>
+      <w:pPr>
+        <w:pStyle w:val="Heading2"/>
+      </w:pPr>
+      <w:r>
+        <w:t>Growing Your Veyn Capacity</w:t>
+      </w:r>
+    </w:p>
+    <w:p>
+      <w:r>
+        <w:t>How to increase your pool</w:t>
+      </w:r>
+    </w:p>
+    <w:p>
+      <w:r>
+        <w:t>The amount of Veyn someone can use from birth is already set. If you want to increase it, finish it (use it all up) and keep replenishing your Veyn for it to increase.</w:t>
+      </w:r>
+    </w:p>
+    <w:p>
+      <w:pPr>
+        <w:pStyle w:val="Heading2"/>
+      </w:pPr>
+      <w:r>
+        <w:t>Inheritance of Ranks &amp; Abilities</w:t>
+      </w:r>
+    </w:p>
+    <w:p>
+      <w:r>
+        <w:t>Not always passed down</w:t>
+      </w:r>
+    </w:p>
+    <w:p>
+      <w:r>
+        <w:t>A rank can be passed down to an offspring, though not all the time — otherwise they would have to work their way up the ranks. Abilities learnt can also be passed down to your offspring, though not all the time.</w:t>
+      </w:r>
+    </w:p>
+    <w:p>
+      <w:pPr>
+        <w:pStyle w:val="Heading2"/>
+      </w:pPr>
+      <w:r>
+        <w:t>The Hidden Realm Portal</w:t>
+      </w:r>
+    </w:p>
+    <w:p>
+      <w:r>
+        <w:t>Moves every leap year</w:t>
+      </w:r>
+    </w:p>
+    <w:p>
+      <w:r>
+        <w:t>The portal to the Hidden Realm changes its location every leap year. It forms by drawing in all the Veyn from its surroundings until the area is fully drained, then uses what it absorbed to relocate itself somewhere new that’s rich in Veyn. The amount of time it takes for enough Veyn to concentrate in a new location happens to be roughly a leap year, which is why the portal only reappears that often. Since it’s drawn to wherever Veyn is rich rather than moving randomly, someone with a strong enough sense of Veyn density could theoretically predict roughly where it might appear next.</w:t>
+      </w:r>
+    </w:p>
+    <w:p>
+      <w:pPr>
+        <w:pStyle w:val="Heading2"/>
+      </w:pPr>
+      <w:r>
+        <w:t>The Two Sundering Altars</w:t>
+      </w:r>
+    </w:p>
+    <w:p>
+      <w:r>
+        <w:t>Common Altar and Academy Altar</w:t>
+      </w:r>
+    </w:p>
+    <w:p>
+      <w:r>
+        <w:t>There are two Sundering Altars in the world, each serving a different purpose. The Common Altar is located in a neutral temple between the three realms and is where most ordinary people go for their awakening at age 15. The Academy Altar is located within Elyndor Academy and is reserved for students accepted into the Academy. The Academy Altar is significantly more powerful — it provides a clearer reading of a person's class affinity and starting grade, and can handle a wider range of race types including angels and demons. Both altars were built by Kael von Ashen using Aelthar knowledge, but the Academy Altar was constructed with additional materials recovered from the Hidden Realm, making it far more precise.</w:t>
+        <w:br/>
+        <w:br/>
+        <w:t>The Common Altar can only reveal a person's general affinity (combat, healing, support, etc.) and a rough estimate of their grade. The Academy Altar can pinpoint the exact class a person is suited for (Mage, Alchemist, Paladin, etc.), determine their precise starting grade, and even detect innate abilities or unusual Veyn signatures. This is why the Academy accepts students from all three realms — even angels and demons send their children to Elyndor for the awakening, despite the political tensions between the realms. The Academy's neutrality in this matter is one of the reasons it has survived for so long.</w:t>
+      </w:r>
+    </w:p>
+    <w:p>
+      <w:r>
+        <w:t>Common Altar: Located in a neutral temple between the three realms. Reveals general affinity and rough grade estimate. Used by most ordinary people.</w:t>
+      </w:r>
+    </w:p>
+    <w:p>
+      <w:r>
+        <w:t>Academy Altar: Located within Elyndor Academy. Reveals exact class, precise starting grade, and innate abilities. Reserved for Academy students.</w:t>
+      </w:r>
+    </w:p>
+    <w:p>
+      <w:r>
+        <w:t>Builder: Both altars were built by Kael von Ashen using Aelthar knowledge</w:t>
+      </w:r>
+    </w:p>
+    <w:p>
+      <w:r>
+        <w:t>Awakening Age: Every person undergoes awakening at age 15</w:t>
+      </w:r>
+    </w:p>
+    <w:p>
+      <w:r>
+        <w:t>Why the Academy matters: The Academy is the gatekeeper to magical ability for the entire world — it holds the only reliable way to awaken magic</w:t>
+      </w:r>
+    </w:p>
+    <w:p>
+      <w:pPr>
+        <w:pStyle w:val="Heading2"/>
+      </w:pPr>
+      <w:r>
+        <w:t>The Rune Star System</w:t>
+      </w:r>
+    </w:p>
+    <w:p>
+      <w:r>
+        <w:t>How Mages inscribe and upgrade their Rune Stars</w:t>
+      </w:r>
+    </w:p>
+    <w:p>
+      <w:r>
+        <w:t>The Rune Star is the foundation of all Mage power. Unlike other classes that develop their abilities through training and experience, Mages must physically inscribe Rune Star sigils into their heart. Each circle is a new sigil burned directly into the cardiac tissue by Veyn — the most sensitive organ in the body. The inscription process is excruciatingly painful, as the Veyn must be channeled into living flesh without killing the Mage. This is why Mages are rare and their progression is slow: the pain is so severe that many abandon the path after their first circle, and those who continue must have extraordinary willpower and pain tolerance.</w:t>
+        <w:br/>
+        <w:br/>
+        <w:t>The rules of the Rune Star system are absolute: each circle must be fully completed before the next can be attempted. A half-inscribed Rune Star will destabilize and kill the Mage. Skipping circles is instant death — the backlash from an incomplete inscription tears through the heart and destroys it. There are no shortcuts, no exceptions. A Mage who attempts to jump from 2nd Circle to 4th Circle, for example, will die before the 4th sigil is even begun. This is why Mages must progress step by step, one circle at a time, enduring the agony of each inscription.</w:t>
+        <w:br/>
+        <w:br/>
+        <w:t>The 7th Circle Rune Star cannot be inscribed by the Mage themselves — it must be given by the world core. Only one being in recorded history has received this gift, and the world was forever changed by it.</w:t>
+      </w:r>
+    </w:p>
+    <w:p>
+      <w:r>
+        <w:t>Location: Carved directly into the heart</w:t>
+      </w:r>
+    </w:p>
+    <w:p>
+      <w:r>
+        <w:t>Process: Each circle is a sigil burned into cardiac tissue by Veyn</w:t>
+      </w:r>
+    </w:p>
+    <w:p>
+      <w:r>
+        <w:t>Pain Level: Excruciating — the most painful magical process in the world</w:t>
+      </w:r>
+    </w:p>
+    <w:p>
+      <w:r>
+        <w:t>Rule 1: Each circle must be fully completed before the next can be attempted</w:t>
+      </w:r>
+    </w:p>
+    <w:p>
+      <w:r>
+        <w:t>Rule 2: Half-inscribed Rune Stars destabilize and kill the Mage</w:t>
+      </w:r>
+    </w:p>
+    <w:p>
+      <w:r>
+        <w:t>Rule 3: Skipping circles causes instant death from backlash</w:t>
+      </w:r>
+    </w:p>
+    <w:p>
+      <w:r>
+        <w:t>Rule 4: 7th Circle cannot be self-inscribed — must be given by the world core</w:t>
+      </w:r>
+    </w:p>
+    <w:p>
+      <w:r>
+        <w:t>Why Mages are rare: The pain and danger of inscription means few have the will to progress</w:t>
+      </w:r>
+    </w:p>
+    <w:p>
+      <w:pPr>
+        <w:pStyle w:val="Heading2"/>
+      </w:pPr>
+      <w:r>
+        <w:t>Hybrid Fusion</w:t>
+      </w:r>
+    </w:p>
+    <w:p>
+      <w:r>
+        <w:t>The mutated skills of the True Hybrid Form</w:t>
+      </w:r>
+    </w:p>
+    <w:p>
+      <w:r>
+        <w:t>When Jaiden Marlock enters his True Hybrid Form, the skills of his two bloodlines stop being separate sets. Each skill of the Aetherblade Lord Angel rank and each skill of the Bloodward demon rank mutate and fuse together, one with another, becoming a single hybrid skill that neither race could wield alone. The fused skills draw on Holy Energy and Corrupted Veyn at once, and exist only while the hybrid form is held.</w:t>
+      </w:r>
+    </w:p>
+    <w:p>
+      <w:pPr>
+        <w:pStyle w:val="Heading1"/>
+      </w:pPr>
+      <w:r>
+        <w:t>Plots</w:t>
+      </w:r>
+    </w:p>
+    <w:p>
+      <w:pPr>
+        <w:pStyle w:val="Heading2"/>
+      </w:pPr>
+      <w:r>
+        <w:t>Lisa’s Plot</w:t>
+      </w:r>
+    </w:p>
+    <w:p>
+      <w:r>
+        <w:t>A forbidden love, a hidden child, and a death sentence</w:t>
+      </w:r>
+    </w:p>
+    <w:p>
+      <w:r>
+        <w:t>Lisa (Bloodward demon) and Ordium (Aetherblade Lord Angel) fell in love despite their ranks and positions. Unable to stay together, they were separated to their various realms. After realizing she was pregnant with Jaiden and that his aura carried both an angelic and demonic aura, she knew he would be killed, so she gave the child to her personal maid Sofia, along with the Auralis Ruby pendant to seal all his auras so he looks human. Jaiden then lives in the Human Realm with Sofia.</w:t>
+      </w:r>
+    </w:p>
+    <w:p>
+      <w:r>
+        <w:t>Plot twist: As she returned and Sofia left to the Human Realm, Lisa was called to the chamber of the ruler’s throne room of the Demon Realm. Next to Tera Morage (on the throne) was her second right-hand man, Licent Varak, who reported to the ruler that Lisa had intercourse with an angel, which enraged Tera. Lisa was demoted to a Gnash rank and was later killed off by Licent’s men, since he had always hated Lisa.</w:t>
+      </w:r>
+    </w:p>
+    <w:p>
+      <w:pPr>
+        <w:pStyle w:val="Heading2"/>
+      </w:pPr>
+      <w:r>
+        <w:t>Licent Varak’s Plot</w:t>
+      </w:r>
+    </w:p>
+    <w:p>
+      <w:r>
+        <w:t>Jealousy that cost Lisa her life</w:t>
+      </w:r>
+    </w:p>
+    <w:p>
+      <w:r>
+        <w:t>Licent Varak, second right-hand man to Tera Morage, had always hated Lisa for being stronger than him and holding the top Bloodward position. He was constantly looking for a way to take her power and rank away. He saw Sofia heading to an unknown location, tried to follow her but lost track of her. He then saw Lisa meet with an angel, discovered they had intercourse and that she had become pregnant. He used this information to report her to Tera Morage, which enraged the ruler. As a result, Lisa was demoted to Gnash rank and later killed by his men, which he ordered them to do.</w:t>
+      </w:r>
+    </w:p>
+    <w:p>
+      <w:r>
+        <w:t>Rank: Bloodward</w:t>
+      </w:r>
+    </w:p>
+    <w:p>
+      <w:pPr>
+        <w:pStyle w:val="Heading2"/>
+      </w:pPr>
+      <w:r>
+        <w:t>Ordium’s Plot</w:t>
+      </w:r>
+    </w:p>
+    <w:p>
+      <w:r>
+        <w:t>Love at first sight — left unfinished</w:t>
+      </w:r>
+    </w:p>
+    <w:p>
+      <w:r>
+        <w:t>Ordium, an Aetherblade Lord Rank Angel, fell in love with Lisa at first sight. He left his post and spent the next 9 months with Lisa in a secret place in the Human Realm, since it is large and it would take time for them to be found. They were expecting a child, but unexpectedly they were called back by their rulers… (the document cuts off here — “but as…”)</w:t>
+      </w:r>
+    </w:p>
+    <w:p>
+      <w:pPr>
+        <w:pStyle w:val="Heading2"/>
+      </w:pPr>
+      <w:r>
+        <w:t>Jaiden Marlock Plot</w:t>
+      </w:r>
+    </w:p>
+    <w:p>
+      <w:r>
+        <w:t>Plot for Mc</w:t>
+      </w:r>
+    </w:p>
+    <w:p>
+      <w:r>
+        <w:t>His class is Mage. he has a much higher amount of Veyn than other Angels and Demons. He stays in a small house with Sofia who takes care of him and protects him. Later Sofia took him meet with Carin who then train him to be better at his demonic power. Sofia also trained Jaiden on how to use his angelic powers. Sofia also gave him the Auralis Ruby from his mother which would seal his true appearance, he can release the seal though for a limited time</w:t>
+      </w:r>
+    </w:p>
+    <w:p>
+      <w:pPr>
+        <w:pStyle w:val="Heading1"/>
+      </w:pPr>
+      <w:r>
+        <w:t>Character Forms</w:t>
+      </w:r>
+    </w:p>
+    <w:p>
+      <w:pPr>
+        <w:pStyle w:val="Heading2"/>
+      </w:pPr>
+      <w:r>
+        <w:t>Jaiden Marlock — Normal</w:t>
+      </w:r>
+    </w:p>
+    <w:p>
+      <w:r>
+        <w:t>First Form of 5 — Jaiden Marlock</w:t>
+      </w:r>
+    </w:p>
+    <w:p>
+      <w:r>
+        <w:t>Looks fully human. No visible wings, horns, or halo.</w:t>
+      </w:r>
+    </w:p>
+    <w:p>
+      <w:pPr>
+        <w:pStyle w:val="Heading2"/>
+      </w:pPr>
+      <w:r>
+        <w:t>Jaiden Marlock — Halo &amp; Horns</w:t>
+      </w:r>
+    </w:p>
+    <w:p>
+      <w:r>
+        <w:t>Second Form of 5 — Jaiden Marlock</w:t>
+      </w:r>
+    </w:p>
+    <w:p>
+      <w:r>
+        <w:t>A halo appears above his head and two horns emerge from his forehead, using partial abilities of both an angel and a demon.</w:t>
+      </w:r>
+    </w:p>
+    <w:p>
+      <w:pPr>
+        <w:pStyle w:val="Heading2"/>
+      </w:pPr>
+      <w:r>
+        <w:t>Jaiden Marlock — Full Angel Form</w:t>
+      </w:r>
+    </w:p>
+    <w:p>
+      <w:r>
+        <w:t>Third Form of 5 — Jaiden Marlock</w:t>
+      </w:r>
+    </w:p>
+    <w:p>
+      <w:r>
+        <w:t>6 pure feathery white wings and a halo that glows brightly on top of his head, along with the angelic aura all angels carry.</w:t>
+      </w:r>
+    </w:p>
+    <w:p>
+      <w:pPr>
+        <w:pStyle w:val="Heading2"/>
+      </w:pPr>
+      <w:r>
+        <w:t>Jaiden Marlock — Full Demon Form</w:t>
+      </w:r>
+    </w:p>
+    <w:p>
+      <w:r>
+        <w:t>Fourth Form of 5 — Jaiden Marlock</w:t>
+      </w:r>
+    </w:p>
+    <w:p>
+      <w:r>
+        <w:t>6 horns and 6 dark purple feathery wings, along with the demonic aura all demons carry.</w:t>
+      </w:r>
+    </w:p>
+    <w:p>
+      <w:pPr>
+        <w:pStyle w:val="Heading2"/>
+      </w:pPr>
+      <w:r>
+        <w:t>Jaiden Marlock — True Hybrid Form</w:t>
+      </w:r>
+    </w:p>
+    <w:p>
+      <w:r>
+        <w:t>Fifth Form of 5 — Jaiden Marlock</w:t>
+      </w:r>
+    </w:p>
+    <w:p>
+      <w:r>
+        <w:t>3 pure white feathery wings on one half of his body and 3 black feathery wings on the other, 6 horns, and a halo split in half floating above his head. Both the angelic and demonic auras surround him at the same time.</w:t>
+      </w:r>
+    </w:p>
+    <w:p>
+      <w:pPr>
+        <w:pStyle w:val="Heading1"/>
+      </w:pPr>
+      <w:r>
+        <w:t>Additional Titles</w:t>
+      </w:r>
+    </w:p>
+    <w:p>
+      <w:pPr>
+        <w:pStyle w:val="Heading2"/>
+      </w:pPr>
+      <w:r>
+        <w:t>Crown-less</w:t>
+      </w:r>
+    </w:p>
+    <w:p>
+      <w:r>
+        <w:t>A title for Lisa, the top Bloodward who never wore the crown</w:t>
+      </w:r>
+    </w:p>
+    <w:p>
+      <w:r>
+        <w:t>A title borne by Lisa: she held the highest Bloodward seat, the strongest demon in the Demon Realm after the Mordrach, yet never wore the Mordrach’s crown herself. “Crown-less” names the one who stands just beneath the throne — powerful enough to be feared, but denied the crown, and who ultimately chose her son over the rank.</w:t>
+      </w:r>
+    </w:p>
+    <w:p>
+      <w:r>
+        <w:t>Held by: Lisa</w:t>
+      </w:r>
+    </w:p>
+    <w:p>
+      <w:r>
+        <w:t>Meaning: The one beneath the Mordrach’s crown — second only to the ruler, yet never crowned.</w:t>
+      </w:r>
+    </w:p>
+    <w:p>
+      <w:pPr>
+        <w:pStyle w:val="Heading2"/>
+      </w:pPr>
+      <w:r>
+        <w:t>Demon of Abundance</w:t>
+      </w:r>
+    </w:p>
+    <w:p>
+      <w:r>
+        <w:t>The overfull one</w:t>
+      </w:r>
+    </w:p>
+    <w:p>
+      <w:r>
+        <w:t>A title borne by Lisa — the strongest demon in the Demon Realm after the Mordrach, whose power overflows beyond a single body.</w:t>
+      </w:r>
+    </w:p>
+    <w:p>
+      <w:r>
+        <w:t>Held by: Lisa</w:t>
+      </w:r>
+    </w:p>
+    <w:p>
+      <w:pPr>
+        <w:pStyle w:val="Heading1"/>
+      </w:pPr>
+      <w:r>
+        <w:t>Silver Concord — Guild Facilities</w:t>
+      </w:r>
+    </w:p>
+    <w:p>
+      <w:r>
+        <w:t>Guild amenities and resources</w:t>
+      </w:r>
+    </w:p>
+    <w:p>
+      <w:r>
+        <w:t>The Silver Concord main branch in Aldermere is a fortified manor that serves as both headquarters and meeting place. It contains all the facilities a guild needs to operate across the Human Realm.</w:t>
+      </w:r>
+    </w:p>
+    <w:p>
+      <w:r>
+        <w:t>Contract Hall: Central meeting room where contracts are drafted, reviewed, and sealed with the guild's magical imprint</w:t>
+      </w:r>
+    </w:p>
+    <w:p>
+      <w:r>
+        <w:t>Training Grounds: Indoor and outdoor areas for members to practice combat, negotiation, and contract enforcement</w:t>
+      </w:r>
+    </w:p>
+    <w:p>
+      <w:r>
+        <w:t>Archive: Vast library of completed contracts, legal precedents, and Cross-realm trade regulations</w:t>
+      </w:r>
+    </w:p>
+    <w:p>
+      <w:r>
+        <w:t>Armory: Weapons and armor available for members, including blood-forged weapons for high-rank missions</w:t>
+      </w:r>
+    </w:p>
+    <w:p>
+      <w:r>
+        <w:t>Healing Ward: Staffed by Clergy members, provides treatment for injured members</w:t>
+      </w:r>
+    </w:p>
+    <w:p>
+      <w:r>
+        <w:t>Teleportation Circle: Rare magical circle that allows fast travel to branch offices in other cities</w:t>
+      </w:r>
+    </w:p>
+    <w:p>
+      <w:r>
+        <w:t>Guild Vault: Secure storage for valuable contract items, rare ingredients, and guild funds</w:t>
       </w:r>
     </w:p>
     <w:sectPr>

</xml_diff>

<commit_message>
Swap Jaiden's 2nd and 3rd forms (Full Angel Form is now 2nd, Halo & Horns is now 3rd)
</commit_message>
<xml_diff>
--- a/Half_made world ideas.docx
+++ b/Half_made world ideas.docx
@@ -3955,7 +3955,7 @@
     </w:p>
     <w:p>
       <w:r>
-        <w:t>Forms a rune collar around the person’s neck. The bearer is unavoidably hunted by the Shudon when spotted and will be killed.</w:t>
+        <w:t>Forms a rune collar around the person’s neck. The bearer is unavoidably hunted by the Shudon when spotted and will be killed. The curse was first laid by the world core upon the Aelthar, as punishment for tearing open the Hidden Realm and nearly destroying the world — a mark the will of the world placed on an entire race for the crime of nearly unmaking it.</w:t>
       </w:r>
     </w:p>
     <w:p>
@@ -3975,6 +3975,11 @@
     </w:p>
     <w:p>
       <w:r>
+        <w:t>Origin: First laid on the Aelthar by the world core, for tearing open the Hidden Realm.</w:t>
+      </w:r>
+    </w:p>
+    <w:p>
+      <w:r>
         <w:t>Tags: world core, shudon, curse, aelthar</w:t>
       </w:r>
     </w:p>
@@ -12085,7 +12090,7 @@
     </w:p>
     <w:p>
       <w:r>
-        <w:t>Forms: 1st — Normal: looks fully human, no wings, horns, or halo. 2nd — A halo appears above his head and two horns emerge from his forehead, using partial abilities of both an angel and a demon. 3rd — Full angel form: 6 pure feathery white wings and a brightly glowing halo, with the angelic aura. 4th — Full demon form: 6 horns and 6 dark purple feathery wings, with the demonic aura. 5th — True hybrid form: 3 pure white feathery wings on one half and 3 black feathery wings on the other, 6 horns, and a halo split in half floating above his head. Both the angelic and demonic auras surround him at the same time.</w:t>
+        <w:t>Forms: 1st — Normal: looks fully human, no wings, horns, or halo. 2nd — Full angel form: 6 pure feathery white wings and a brightly glowing halo, with the angelic aura. 3rd — A halo appears above his head and two horns emerge from his forehead, using partial abilities of both an angel and a demon. 4th — Full demon form: 6 horns and 6 dark purple feathery wings, with the demonic aura. 5th — True hybrid form: 3 pure white feathery wings on one half and 3 black feathery wings on the other, 6 horns, and a halo split in half floating above his head. Both the angelic and demonic auras surround him at the same time.</w:t>
       </w:r>
     </w:p>
     <w:p>
@@ -13494,6 +13499,49 @@
     </w:p>
     <w:p>
       <w:pPr>
+        <w:pStyle w:val="Heading2"/>
+      </w:pPr>
+      <w:r>
+        <w:t>Aldric Malgrave</w:t>
+      </w:r>
+    </w:p>
+    <w:p>
+      <w:r>
+        <w:t>The Former King of the Human Realm</w:t>
+      </w:r>
+    </w:p>
+    <w:p>
+      <w:r>
+        <w:t>Aldric Malgrave was the ruler of the Human Realm before the Divina line, and the man whose fear ended a race. He looked on the Aelthar — the ancient realm-makers who could shape and tear reality itself — and saw not a people but a threat to his crown, and he hunted them to extinction. His persecution drove the survivors to tear open the Hidden Realm as a refuge, an act so violent it nearly unmade the world and forced the world core’s will to raise the barrier that split the realms apart. He caught every one of them but one — Kael von Ashen, the sole survivor who would become Headmaster of Elyndor Academy — and that single failure is the thread the whole story hangs from.</w:t>
+      </w:r>
+    </w:p>
+    <w:p>
+      <w:r>
+        <w:t>Race: Human</w:t>
+      </w:r>
+    </w:p>
+    <w:p>
+      <w:r>
+        <w:t>Title: Former King of the Human Realm (predecessor to the Divina line)</w:t>
+      </w:r>
+    </w:p>
+    <w:p>
+      <w:r>
+        <w:t>Fate: Deposed — no longer on the throne; the Divina line rules now.</w:t>
+      </w:r>
+    </w:p>
+    <w:p>
+      <w:r>
+        <w:t>Crime: Exterminated the Aelthar race; set in motion the near-destruction of the world.</w:t>
+      </w:r>
+    </w:p>
+    <w:p>
+      <w:r>
+        <w:t>Tags: character, human, king, former ruler, human realm, aelthar, genocide, villain</w:t>
+      </w:r>
+    </w:p>
+    <w:p>
+      <w:pPr>
         <w:pStyle w:val="Heading1"/>
       </w:pPr>
       <w:r>
@@ -13533,34 +13581,34 @@
     </w:p>
     <w:p>
       <w:r>
+        <w:t>Third Form of 5 — Jaiden Marlock</w:t>
+      </w:r>
+    </w:p>
+    <w:p>
+      <w:r>
+        <w:t>A halo appears above his head and two horns emerge from his forehead, using partial abilities of both an angel and a demon.</w:t>
+      </w:r>
+    </w:p>
+    <w:p>
+      <w:r>
+        <w:t>Tags: jaiden, form, halo &amp; horns</w:t>
+      </w:r>
+    </w:p>
+    <w:p>
+      <w:pPr>
+        <w:pStyle w:val="Heading2"/>
+      </w:pPr>
+      <w:r>
+        <w:t>Jaiden Marlock — Full Angel Form</w:t>
+      </w:r>
+    </w:p>
+    <w:p>
+      <w:r>
         <w:t>Second Form of 5 — Jaiden Marlock</w:t>
       </w:r>
     </w:p>
     <w:p>
       <w:r>
-        <w:t>A halo appears above his head and two horns emerge from his forehead, using partial abilities of both an angel and a demon.</w:t>
-      </w:r>
-    </w:p>
-    <w:p>
-      <w:r>
-        <w:t>Tags: jaiden, form, halo &amp; horns</w:t>
-      </w:r>
-    </w:p>
-    <w:p>
-      <w:pPr>
-        <w:pStyle w:val="Heading2"/>
-      </w:pPr>
-      <w:r>
-        <w:t>Jaiden Marlock — Full Angel Form</w:t>
-      </w:r>
-    </w:p>
-    <w:p>
-      <w:r>
-        <w:t>Third Form of 5 — Jaiden Marlock</w:t>
-      </w:r>
-    </w:p>
-    <w:p>
-      <w:r>
         <w:t>6 pure feathery white wings and a halo that glows brightly on top of his head, along with the angelic aura all angels carry.</w:t>
       </w:r>
     </w:p>
@@ -14767,6 +14815,11 @@
     <w:p>
       <w:r>
         <w:t>Innate Ability: Potent Blood</w:t>
+      </w:r>
+    </w:p>
+    <w:p>
+      <w:r>
+        <w:t>Curse: Cursed by the world core for tearing open the Hidden Realm — every Aelthar bore the rune collar.</w:t>
       </w:r>
     </w:p>
     <w:p>

</xml_diff>

<commit_message>
Swap Jaiden's 3rd and 4th forms (Full Demon Form now 3rd, Halo & Horns now 4th)
</commit_message>
<xml_diff>
--- a/Half_made world ideas.docx
+++ b/Half_made world ideas.docx
@@ -12090,7 +12090,7 @@
     </w:p>
     <w:p>
       <w:r>
-        <w:t>Forms: 1st — Normal: looks fully human, no wings, horns, or halo. 2nd — Full angel form: 6 pure feathery white wings and a brightly glowing halo, with the angelic aura. 3rd — A halo appears above his head and two horns emerge from his forehead, using partial abilities of both an angel and a demon. 4th — Full demon form: 6 horns and 6 dark purple feathery wings, with the demonic aura. 5th — True hybrid form: 3 pure white feathery wings on one half and 3 black feathery wings on the other, 6 horns, and a halo split in half floating above his head. Both the angelic and demonic auras surround him at the same time.</w:t>
+        <w:t>Forms: 1st — Normal: looks fully human, no wings, horns, or halo. 2nd — Full angel form: 6 pure feathery white wings and a brightly glowing halo, with the angelic aura. 3rd — Full demon form: 6 horns and 6 dark purple feathery wings, with the demonic aura. 4th — A halo appears above his head and two horns emerge from his forehead, using partial abilities of both an angel and a demon. 5th — True hybrid form: 3 pure white feathery wings on one half and 3 black feathery wings on the other, 6 horns, and a halo split in half floating above his head. Both the angelic and demonic auras surround him at the same time.</w:t>
       </w:r>
     </w:p>
     <w:p>
@@ -13581,53 +13581,53 @@
     </w:p>
     <w:p>
       <w:r>
+        <w:t>Fourth Form of 5 — Jaiden Marlock</w:t>
+      </w:r>
+    </w:p>
+    <w:p>
+      <w:r>
+        <w:t>A halo appears above his head and two horns emerge from his forehead, using partial abilities of both an angel and a demon.</w:t>
+      </w:r>
+    </w:p>
+    <w:p>
+      <w:r>
+        <w:t>Tags: jaiden, form, halo &amp; horns</w:t>
+      </w:r>
+    </w:p>
+    <w:p>
+      <w:pPr>
+        <w:pStyle w:val="Heading2"/>
+      </w:pPr>
+      <w:r>
+        <w:t>Jaiden Marlock — Full Angel Form</w:t>
+      </w:r>
+    </w:p>
+    <w:p>
+      <w:r>
+        <w:t>Second Form of 5 — Jaiden Marlock</w:t>
+      </w:r>
+    </w:p>
+    <w:p>
+      <w:r>
+        <w:t>6 pure feathery white wings and a halo that glows brightly on top of his head, along with the angelic aura all angels carry.</w:t>
+      </w:r>
+    </w:p>
+    <w:p>
+      <w:r>
+        <w:t>Tags: jaiden, form, full angel form</w:t>
+      </w:r>
+    </w:p>
+    <w:p>
+      <w:pPr>
+        <w:pStyle w:val="Heading2"/>
+      </w:pPr>
+      <w:r>
+        <w:t>Jaiden Marlock — Full Demon Form</w:t>
+      </w:r>
+    </w:p>
+    <w:p>
+      <w:r>
         <w:t>Third Form of 5 — Jaiden Marlock</w:t>
-      </w:r>
-    </w:p>
-    <w:p>
-      <w:r>
-        <w:t>A halo appears above his head and two horns emerge from his forehead, using partial abilities of both an angel and a demon.</w:t>
-      </w:r>
-    </w:p>
-    <w:p>
-      <w:r>
-        <w:t>Tags: jaiden, form, halo &amp; horns</w:t>
-      </w:r>
-    </w:p>
-    <w:p>
-      <w:pPr>
-        <w:pStyle w:val="Heading2"/>
-      </w:pPr>
-      <w:r>
-        <w:t>Jaiden Marlock — Full Angel Form</w:t>
-      </w:r>
-    </w:p>
-    <w:p>
-      <w:r>
-        <w:t>Second Form of 5 — Jaiden Marlock</w:t>
-      </w:r>
-    </w:p>
-    <w:p>
-      <w:r>
-        <w:t>6 pure feathery white wings and a halo that glows brightly on top of his head, along with the angelic aura all angels carry.</w:t>
-      </w:r>
-    </w:p>
-    <w:p>
-      <w:r>
-        <w:t>Tags: jaiden, form, full angel form</w:t>
-      </w:r>
-    </w:p>
-    <w:p>
-      <w:pPr>
-        <w:pStyle w:val="Heading2"/>
-      </w:pPr>
-      <w:r>
-        <w:t>Jaiden Marlock — Full Demon Form</w:t>
-      </w:r>
-    </w:p>
-    <w:p>
-      <w:r>
-        <w:t>Fourth Form of 5 — Jaiden Marlock</w:t>
       </w:r>
     </w:p>
     <w:p>

</xml_diff>

<commit_message>
Auralis Ruby: seals crack, recover over time but stay permanently weakened
</commit_message>
<xml_diff>
--- a/Half_made world ideas.docx
+++ b/Half_made world ideas.docx
@@ -11962,7 +11962,7 @@
     </w:p>
     <w:p>
       <w:r>
-        <w:t>A pendant crafted by the MC’s mom (Lisa), who then gave it to Sofia. The pendant has 5 seals to seal the MC’s 5 forms. It seals both of his auras (angelic and demonic), which makes him look human.</w:t>
+        <w:t>A pendant crafted by the MC’s mom (Lisa), who then gave it to Sofia. The pendant has 5 seals to seal the MC’s 5 forms. It seals both of his auras (angelic and demonic), which makes him look human. If a seal is strained or cracked, it will gradually recover and mend itself over time — but never back to full strength. A seal that has cracked once is permanently weakened, and will crack more easily the next time it is tested.</w:t>
       </w:r>
     </w:p>
     <w:p>
@@ -11973,6 +11973,11 @@
     <w:p>
       <w:r>
         <w:t>Keeper: Sofia</w:t>
+      </w:r>
+    </w:p>
+    <w:p>
+      <w:r>
+        <w:t>Seal Recovery: A cracked seal mends over time, but stays permanently weakened and cracks more easily afterward.</w:t>
       </w:r>
     </w:p>
     <w:p>

</xml_diff>

<commit_message>
Auralis Ruby: seals escalate in strength (1st weakest, 5th strongest); breaking one passes strain to the next
</commit_message>
<xml_diff>
--- a/Half_made world ideas.docx
+++ b/Half_made world ideas.docx
@@ -11962,7 +11962,7 @@
     </w:p>
     <w:p>
       <w:r>
-        <w:t>A pendant crafted by the MC’s mom (Lisa), who then gave it to Sofia. The pendant has 5 seals to seal the MC’s 5 forms. It seals both of his auras (angelic and demonic), which makes him look human. If a seal is strained or cracked, it will gradually recover and mend itself over time — but never back to full strength. A seal that has cracked once is permanently weakened, and will crack more easily the next time it is tested.</w:t>
+        <w:t>A pendant crafted by the MC’s mom (Lisa), who then gave it to Sofia. The pendant has 5 seals to seal the MC’s 5 forms, and the seals are not equal — each seal is stronger than the one before it, so the 1st seal is the weakest and the 5th is the strongest. It seals both of his auras (angelic and demonic), which makes him look human. When a seal breaks, the strain it was holding does not vanish — it passes to the next seal. If that next seal is pushed past its own limit, it will break or weaken in turn. A broken seal can mend over time, but never back to full strength, and a weakened seal cracks more easily the next time it is tested.</w:t>
       </w:r>
     </w:p>
     <w:p>
@@ -11977,7 +11977,17 @@
     </w:p>
     <w:p>
       <w:r>
-        <w:t>Seal Recovery: A cracked seal mends over time, but stays permanently weakened and cracks more easily afterward.</w:t>
+        <w:t>Seal Strength: The 5 seals escalate in strength — 1st is weakest, 5th is strongest. Each is stronger than the one before it.</w:t>
+      </w:r>
+    </w:p>
+    <w:p>
+      <w:r>
+        <w:t>Break Chain: When a seal breaks, its strain passes to the next seal; if that seal is pushed past its limit, it breaks or weakens too.</w:t>
+      </w:r>
+    </w:p>
+    <w:p>
+      <w:r>
+        <w:t>Recovery: A broken seal mends over time, but never to full strength — and a weakened seal breaks more easily afterward.</w:t>
       </w:r>
     </w:p>
     <w:p>

</xml_diff>

<commit_message>
Add hybrid Vow impossibility: Jaiden cannot take the Veyn Vow (C then B: Angel Realm would demand it, he escapes)
</commit_message>
<xml_diff>
--- a/Half_made world ideas.docx
+++ b/Half_made world ideas.docx
@@ -3748,7 +3748,12 @@
     </w:p>
     <w:p>
       <w:r>
-        <w:t>A hybrid is an angel and a demon born of a single body — a union the world considers impossible, since Veyn and Ren cannot coexist and the two realms’ natures are opposed. Jaiden Marlock is the first, born of Ordium (an Aetherblade Lord Angel) and Lisa (a Bloodward), and his aura carries both an angelic and a demonic aura at once. Hybrids inherit both parents’ race types — in Jaiden’s case the Imp demon half and the Malakhim angel half — and can draw on the abilities of both. Because such a being has never existed before, there are no rules for it, only what Jaiden himself becomes.</w:t>
+        <w:t>A hybrid is an angel and a demon born of a single body — a union the world considers impossible, since Veyn and Ren cannot coexist and the two realms’ natures are opposed. Jaiden Marlock is the first, born of Ordium (an Aetherblade Lord Angel) and Lisa (a Bloodward), and his aura carries both an angelic and a demonic aura at once. Hybrids inherit both parents’ race types — in Jaiden’s case the Imp demon half and the Malakhim angel half — and can draw on the abilities of both. Because such a being has never existed before, there are no rules for it, only what Jaiden himself becomes. A hybrid cannot take the Veyn Vow: the vow regulates Veyn through obedience, but a demon’s Veyn is unregulated by nature, and a body holding Holy Energy and Corrupted Veyn in balance cannot bind one half to a vow without strangling the other. The vow was simply never made for a being like him.</w:t>
+      </w:r>
+    </w:p>
+    <w:p>
+      <w:r>
+        <w:t>The Vow: A hybrid cannot take the Veyn Vow — binding his angelic half would strangle the demonic half. The Angel Realm would still demand it, and would reject him when he cannot give it.</w:t>
       </w:r>
     </w:p>
     <w:p>
@@ -12151,6 +12156,11 @@
     <w:p>
       <w:r>
         <w:t>Power Level: Artificer</w:t>
+      </w:r>
+    </w:p>
+    <w:p>
+      <w:r>
+        <w:t>Veyn Vow: Cannot take the Veyn Vow — his hybrid nature cannot bind one half without strangling the other.</w:t>
       </w:r>
     </w:p>
     <w:p>

</xml_diff>

<commit_message>
Rework Veyn Vow into a personal promise/ritual (with incantation, Guardian, altar); remove obedience-to-hierarchy framing
</commit_message>
<xml_diff>
--- a/Half_made world ideas.docx
+++ b/Half_made world ideas.docx
@@ -58,7 +58,7 @@
     </w:p>
     <w:p>
       <w:r>
-        <w:t>The home of the angels. The Lumen, the lowest-ranking angels, are its citizens and almost never leave it. Lethmoor, a fallen kingdom recorded in this realm, was later replicated inside the Hidden Realm. Ruled by Clint Ashborn, a Serapharch. Its population is small — only in the tens of thousands, a single city’s worth — because angels barely die and do not breed the way humans do; that smallness is what lets the Veyn Vow and the rank hierarchy hold the whole realm in perfect order, and why the loss of even one of the Six Pillars stung so deeply.</w:t>
+        <w:t>The home of the angels. The Lumen, the lowest-ranking angels, are its citizens and almost never leave it. Lethmoor, a fallen kingdom recorded in this realm, was later replicated inside the Hidden Realm. Ruled by Clint Ashborn, a Serapharch. Its population is small — only in the tens of thousands, a single city’s worth — because angels barely die and do not breed the way humans do; that smallness is what lets the angels live by promise and trust, each bound by their own sworn word rather than by chains — and why the loss of even one of the Six Pillars stung so deeply.</w:t>
       </w:r>
     </w:p>
     <w:p>
@@ -2368,6 +2368,44 @@
     </w:p>
     <w:p>
       <w:pPr>
+        <w:pStyle w:val="Heading2"/>
+      </w:pPr>
+      <w:r>
+        <w:t>The Guardian</w:t>
+      </w:r>
+    </w:p>
+    <w:p>
+      <w:r>
+        <w:t>The rare keeper of the Veyn Vow ritual</w:t>
+      </w:r>
+    </w:p>
+    <w:p>
+      <w:r>
+        <w:t>A rare and ancient being who appears at the Sundering Altar to officiate the Veyn Vow — the ritual by which every angel’s halo is formed. It is not commonly seen; most angels glimpse it only once, on the day of their awakening, and never again. No one knows what it is, where it came from, or how many of them exist. It simply appears when a halo is to be made, speaks the vow with the young angel, and is gone. Its presence is what lets the promise take hold: without it, an angel’s halo cannot form, and their Veyn cannot be stabilized.</w:t>
+      </w:r>
+    </w:p>
+    <w:p>
+      <w:r>
+        <w:t>Nature: Unknown — a rare being, not commonly seen, that officiates the Veyn Vow ritual.</w:t>
+      </w:r>
+    </w:p>
+    <w:p>
+      <w:r>
+        <w:t>Role: Helps every angel form their halo and speak their vow at the Sundering Altar.</w:t>
+      </w:r>
+    </w:p>
+    <w:p>
+      <w:r>
+        <w:t>Rarity: Most angels see it only once, at their awakening, and never again.</w:t>
+      </w:r>
+    </w:p>
+    <w:p>
+      <w:r>
+        <w:t>Tags: guardian, vow, halo, altar, being</w:t>
+      </w:r>
+    </w:p>
+    <w:p>
+      <w:pPr>
         <w:pStyle w:val="Heading1"/>
       </w:pPr>
       <w:r>
@@ -2671,7 +2709,7 @@
     </w:p>
     <w:p>
       <w:r>
-        <w:t>Cause: Breaking the Angel Veyn Vow (disobeying someone above their rank, or pulling more Veyn than the vow allows to act against an order).</w:t>
+        <w:t>Cause: Breaking the Angel Veyn Vow (betraying their own sworn promise).</w:t>
       </w:r>
     </w:p>
     <w:p>
@@ -2699,17 +2737,37 @@
     </w:p>
     <w:p>
       <w:r>
-        <w:t>The magical bond that regulates angelic Veyn</w:t>
-      </w:r>
-    </w:p>
-    <w:p>
-      <w:r>
-        <w:t>Every angel takes a Veyn Vow when their halo first forms. It binds their access to Veyn to their obedience to the angelic hierarchy. It is not just spoken, it is a magical bond — the halo is the physical seal of it. If the vow holds, an angel can freely use Veyn within their rank’s limit, and the halo regulates it so it doesn’t overwhelm them. The vow is the reason angels can hold as much power as they do; without it their body can’t safely filter raw Veyn on its own. Rank affects the vow too — a higher rank means a stronger vow and halo, so they can channel more Veyn without breaking. The vow breaks when an angel disobeys someone above their rank or pulls more Veyn than their vow allows to act against an order. Once it breaks, the halo can’t hold the channel steady and shatters, becoming the broken halo Fallen Angels are known for. The wings get affected too — the uncontrolled Veyn surging through them leaves permanent black spotting on the feathers.</w:t>
-      </w:r>
-    </w:p>
-    <w:p>
-      <w:r>
-        <w:t>Halo: An angel’s halo forms at age 15, when the vow is taken at the altar.</w:t>
+        <w:t>A promise, spoken at the altar</w:t>
+      </w:r>
+    </w:p>
+    <w:p>
+      <w:r>
+        <w:t>Every angel takes the Veyn Vow when their halo first forms, at the Sundering Altar, at the age of fifteen. It is not an oath of obedience and not a chain — it is a promise, spoken freely, and the words of it are a ritual. Each angel’s vow is their own: a promise of what they will uphold, the truth they choose to carry, sworn into their own halo with the help of the Guardian. The halo is the physical seal of that promise, and it is what lets an angel’s Veyn flow steady and pure — because it is their own word, kept, that stabilizes them, not any master’s command. The vow is why angels can hold as much power as they do; without it their body cannot safely filter raw Veyn on its own. The stronger and truer the promise, the brighter the halo. It breaks only when an angel betrays their own sworn word.</w:t>
+      </w:r>
+    </w:p>
+    <w:p>
+      <w:r>
+        <w:t>Incantation: With this light I make my promise. By the Veyn that made me and the will that holds the world, I swear to keep the word I speak, and to carry my own truth until my light goes out. This halo is my seal — my promise made visible. May it hold while my word is true, and may it shatter the day I betray it.</w:t>
+      </w:r>
+    </w:p>
+    <w:p>
+      <w:r>
+        <w:t>Halo: The halo forms at age 15, at the Sundering Altar, when the vow is spoken with the Guardian’s help.</w:t>
+      </w:r>
+    </w:p>
+    <w:p>
+      <w:r>
+        <w:t>Nature: A personal promise, not an oath of obedience — each angel swears their own truth.</w:t>
+      </w:r>
+    </w:p>
+    <w:p>
+      <w:r>
+        <w:t>Seal: The halo is the seal of the angel’s own word; keeping the promise keeps the Veyn steady.</w:t>
+      </w:r>
+    </w:p>
+    <w:p>
+      <w:r>
+        <w:t>Breaking: The vow breaks when an angel betrays their own promise — not by disobeying a superior, but by breaking their own word.</w:t>
       </w:r>
     </w:p>
     <w:p>
@@ -2732,12 +2790,12 @@
     </w:p>
     <w:p>
       <w:r>
-        <w:t>The vow breaks when an angel disobeys someone above their rank, or pulls more Veyn than their vow allows to act against an order. Once it breaks, the halo can’t hold the channel steady and shatters, becoming the broken halo Fallen Angels are known for. The wings get affected too — the uncontrolled Veyn surging through them at that moment leaves permanent black spotting on the feathers: some end up with plain black spots, others with black cherry spotting, depending on how much Veyn surged through when it broke.</w:t>
-      </w:r>
-    </w:p>
-    <w:p>
-      <w:r>
-        <w:t>Trigger: Disobeying someone above their rank, or pulling more Veyn than the vow allows to act against an order.</w:t>
+        <w:t>The vow breaks when an angel betrays their own promise — when they do the one thing they swore to themselves they would never do. It is not a punishment handed down by a superior, but the consequence of their own broken word: the promise that held their Veyn steady lets go, and the halo can no longer hold the channel. It shatters, becoming the broken halo Fallen Angels are known for. The uncontrolled Veyn surging through them at that moment leaves permanent black spotting on the feathers — plain black spots or black cherry spotting, depending on how much Veyn surged through when the promise broke.</w:t>
+      </w:r>
+    </w:p>
+    <w:p>
+      <w:r>
+        <w:t>Trigger: Betraying their own sworn promise — breaking their own word, not an order from above.</w:t>
       </w:r>
     </w:p>
     <w:p>
@@ -3748,12 +3806,12 @@
     </w:p>
     <w:p>
       <w:r>
-        <w:t>A hybrid is an angel and a demon born of a single body — a union the world considers impossible, since Veyn and Ren cannot coexist and the two realms’ natures are opposed. Jaiden Marlock is the first, born of Ordium (an Aetherblade Lord Angel) and Lisa (a Bloodward), and his aura carries both an angelic and a demonic aura at once. Hybrids inherit both parents’ race types — in Jaiden’s case the Imp demon half and the Malakhim angel half — and can draw on the abilities of both. Because such a being has never existed before, there are no rules for it, only what Jaiden himself becomes. A hybrid cannot take the Veyn Vow: the vow regulates Veyn through obedience, but a demon’s Veyn is unregulated by nature, and a body holding Holy Energy and Corrupted Veyn in balance cannot bind one half to a vow without strangling the other. The vow was simply never made for a being like him.</w:t>
-      </w:r>
-    </w:p>
-    <w:p>
-      <w:r>
-        <w:t>The Vow: A hybrid cannot take the Veyn Vow — binding his angelic half would strangle the demonic half. The Angel Realm would still demand it, and would reject him when he cannot give it.</w:t>
+        <w:t>A hybrid is an angel and a demon born of a single body — a union the world considers impossible, since Veyn and Ren cannot coexist and the two realms’ natures are opposed. Jaiden Marlock is the first, born of Ordium (an Aetherblade Lord Angel) and Lisa (a Bloodward), and his aura carries both an angelic and a demonic aura at once. Hybrids inherit both parents’ race types — in Jaiden’s case the Imp demon half and the Malakhim angel half — and can draw on the abilities of both. Because such a being has never existed before, there are no rules for it, only what Jaiden himself becomes. A hybrid cannot take the Veyn Vow: the vow is a single promise sworn into one halo, but a hybrid holds two natures in one body — an angel’s light and a demon’s dark — and no single promise can bind both at once. The vow was simply never made for a being like him.</w:t>
+      </w:r>
+    </w:p>
+    <w:p>
+      <w:r>
+        <w:t>The Vow: A hybrid cannot take the Veyn Vow — no single promise can bind two natures. The Angel Realm would still demand it, and would reject him when he cannot give it.</w:t>
       </w:r>
     </w:p>
     <w:p>
@@ -3914,7 +3972,7 @@
     </w:p>
     <w:p>
       <w:r>
-        <w:t>Both holy energy and corrupted Veyn are made from the same raw Veyn, but by opposite processes. Holy energy is formed through purification: a holy being burns away Veyn’s impurity — an angel through the discipline of their halo and Veyn Vow, a saint or diviner through their own holy channeling — brightening the Veyn from silver-blue into gold. Corrupted Veyn is formed through corruption: a demon turns its own Veyn inward and decomposes it into miasma, darkening and poisoning it until it stains a deep purple or black. One Veyn pulled in two directions — which is exactly why they cannot coexist and cancel each other out when they meet.</w:t>
+        <w:t>Both holy energy and corrupted Veyn are made from the same raw Veyn, but by opposite processes. Holy energy is formed through purification: a holy being burns away Veyn’s impurity — an angel through the promise of their halo and Veyn Vow, a saint or diviner through their own holy channeling — brightening the Veyn from silver-blue into gold. Corrupted Veyn is formed through corruption: a demon turns its own Veyn inward and decomposes it into miasma, darkening and poisoning it until it stains a deep purple or black. One Veyn pulled in two directions — which is exactly why they cannot coexist and cancel each other out when they meet.</w:t>
       </w:r>
     </w:p>
     <w:p>
@@ -12160,7 +12218,7 @@
     </w:p>
     <w:p>
       <w:r>
-        <w:t>Veyn Vow: Cannot take the Veyn Vow — his hybrid nature cannot bind one half without strangling the other.</w:t>
+        <w:t>Veyn Vow: Cannot take the Veyn Vow — no single promise can bind his two natures.</w:t>
       </w:r>
     </w:p>
     <w:p>
@@ -13179,7 +13237,7 @@
     </w:p>
     <w:p>
       <w:r>
-        <w:t>The Fifth Pillar — the guardian of the Sundering Altar, where every person in the world is brought at fifteen to have their latent connection to Veyn unlocked for the first time. Angels swear their Veyn Vow there, and it is where each halo first forms. Thalor records every vow sworn at the altar and watches for the first sign that one is fraying. He saw the signs in Ordium long before he left: a vow pulled thin by something it was never meant to contain. He said nothing then, and has spent every day since wondering whether a single word from him could have stopped all of it.</w:t>
+        <w:t>The Fifth Pillar — the guardian of the Sundering Altar, where every person in the world is brought at fifteen to have their latent connection to Veyn unlocked for the first time. Angels speak their Veyn Vow there with the Guardian’s help, and it is where each halo first forms. Thalor keeps the altar and records every vow spoken there, watching for the first sign that a promise is fraying. He saw the signs in Ordium long before he left: a vow pulled thin by something it was never meant to contain. He said nothing then, and has spent every day since wondering whether a single word from him could have stopped all of it.</w:t>
       </w:r>
     </w:p>
     <w:p>
@@ -14657,7 +14715,7 @@
     </w:p>
     <w:p>
       <w:r>
-        <w:t>The type of angel who broke the Veyn Vow and was cast out of the Angel Realm. They keep their wings and power but can never take another vow, leaving their connection to Veyn unstable and unregulated.</w:t>
+        <w:t>The type of angel who broke their own Veyn Vow and lost their halo to it. They keep their wings and power but can never take another vow, leaving their connection to Veyn unstable and unregulated.</w:t>
       </w:r>
     </w:p>
     <w:p>

</xml_diff>

<commit_message>
The Guardian is the Fifth Pillar Thalor Elwin (altar-keeper who officiates the Veyn Vow); remove standalone Guardian being
</commit_message>
<xml_diff>
--- a/Half_made world ideas.docx
+++ b/Half_made world ideas.docx
@@ -2368,44 +2368,6 @@
     </w:p>
     <w:p>
       <w:pPr>
-        <w:pStyle w:val="Heading2"/>
-      </w:pPr>
-      <w:r>
-        <w:t>The Guardian</w:t>
-      </w:r>
-    </w:p>
-    <w:p>
-      <w:r>
-        <w:t>The rare keeper of the Veyn Vow ritual</w:t>
-      </w:r>
-    </w:p>
-    <w:p>
-      <w:r>
-        <w:t>A rare and ancient being who appears at the Sundering Altar to officiate the Veyn Vow — the ritual by which every angel’s halo is formed. It is not commonly seen; most angels glimpse it only once, on the day of their awakening, and never again. No one knows what it is, where it came from, or how many of them exist. It simply appears when a halo is to be made, speaks the vow with the young angel, and is gone. Its presence is what lets the promise take hold: without it, an angel’s halo cannot form, and their Veyn cannot be stabilized.</w:t>
-      </w:r>
-    </w:p>
-    <w:p>
-      <w:r>
-        <w:t>Nature: Unknown — a rare being, not commonly seen, that officiates the Veyn Vow ritual.</w:t>
-      </w:r>
-    </w:p>
-    <w:p>
-      <w:r>
-        <w:t>Role: Helps every angel form their halo and speak their vow at the Sundering Altar.</w:t>
-      </w:r>
-    </w:p>
-    <w:p>
-      <w:r>
-        <w:t>Rarity: Most angels see it only once, at their awakening, and never again.</w:t>
-      </w:r>
-    </w:p>
-    <w:p>
-      <w:r>
-        <w:t>Tags: guardian, vow, halo, altar, being</w:t>
-      </w:r>
-    </w:p>
-    <w:p>
-      <w:pPr>
         <w:pStyle w:val="Heading1"/>
       </w:pPr>
       <w:r>
@@ -2742,7 +2704,7 @@
     </w:p>
     <w:p>
       <w:r>
-        <w:t>Every angel takes the Veyn Vow when their halo first forms, at the Sundering Altar, at the age of fifteen. It is not an oath of obedience and not a chain — it is a promise, spoken freely, and the words of it are a ritual. Each angel’s vow is their own: a promise of what they will uphold, the truth they choose to carry, sworn into their own halo with the help of the Guardian. The halo is the physical seal of that promise, and it is what lets an angel’s Veyn flow steady and pure — because it is their own word, kept, that stabilizes them, not any master’s command. The vow is why angels can hold as much power as they do; without it their body cannot safely filter raw Veyn on its own. The stronger and truer the promise, the brighter the halo. It breaks only when an angel betrays their own sworn word.</w:t>
+        <w:t>Every angel takes the Veyn Vow when their halo first forms, at the Sundering Altar, at the age of fifteen. It is not an oath of obedience and not a chain — it is a promise, spoken freely, and the words of it are a ritual. Each angel’s vow is their own: a promise of what they will uphold, the truth they choose to carry, sworn into their own halo with the help of the Guardian — Thalor Elwin, the Fifth Pillar, who keeps the Sundering Altar. The halo is the physical seal of that promise, and it is what lets an angel’s Veyn flow steady and pure — because it is their own word, kept, that stabilizes them, not any master’s command. The vow is why angels can hold as much power as they do; without it their body cannot safely filter raw Veyn on its own. The stronger and truer the promise, the brighter the halo. It breaks only when an angel betrays their own sworn word.</w:t>
       </w:r>
     </w:p>
     <w:p>
@@ -2752,7 +2714,7 @@
     </w:p>
     <w:p>
       <w:r>
-        <w:t>Halo: The halo forms at age 15, at the Sundering Altar, when the vow is spoken with the Guardian’s help.</w:t>
+        <w:t>Halo: The halo forms at age 15, at the Sundering Altar, when the vow is spoken with the Guardian’s help — Thalor Elwin, the Fifth Pillar.</w:t>
       </w:r>
     </w:p>
     <w:p>
@@ -13232,12 +13194,12 @@
     </w:p>
     <w:p>
       <w:r>
-        <w:t>Angel general of the Angel army</w:t>
-      </w:r>
-    </w:p>
-    <w:p>
-      <w:r>
-        <w:t>The Fifth Pillar — the guardian of the Sundering Altar, where every person in the world is brought at fifteen to have their latent connection to Veyn unlocked for the first time. Angels speak their Veyn Vow there with the Guardian’s help, and it is where each halo first forms. Thalor keeps the altar and records every vow spoken there, watching for the first sign that a promise is fraying. He saw the signs in Ordium long before he left: a vow pulled thin by something it was never meant to contain. He said nothing then, and has spent every day since wondering whether a single word from him could have stopped all of it.</w:t>
+        <w:t>The Fifth Pillar — Guardian of the Sundering Altar</w:t>
+      </w:r>
+    </w:p>
+    <w:p>
+      <w:r>
+        <w:t>The Fifth Pillar, and the Guardian of the Sundering Altar — the angel who officiates the Veyn Vow and helps every young angel form their halo. When an angel turns fifteen, it is Thalor who appears at the altar to speak the vow with them, though to most angels he is a rare and half-remembered figure, glimpsed once on the day of their awakening and never again. He keeps the altar and records every vow spoken there, watching for the first sign that a promise is fraying. He saw the signs in Ordium long before he left: a vow pulled thin by something it was never meant to contain. He said nothing then, and has spent every day since wondering whether a single word from him could have stopped all of it.</w:t>
       </w:r>
     </w:p>
     <w:p>
@@ -13283,6 +13245,11 @@
     <w:p>
       <w:r>
         <w:t>Sub-stage: Mid</w:t>
+      </w:r>
+    </w:p>
+    <w:p>
+      <w:r>
+        <w:t>Role: Guardian of the Sundering Altar — officiates the Veyn Vow and helps form each halo.</w:t>
       </w:r>
     </w:p>
     <w:p>

</xml_diff>

<commit_message>
Add note: The Rarity of Generals (Pillars/generals are rare to see, like glimpsing a head of state)
</commit_message>
<xml_diff>
--- a/Half_made world ideas.docx
+++ b/Half_made world ideas.docx
@@ -4125,6 +4125,44 @@
     <w:p>
       <w:r>
         <w:t>Tags: rune star, grade, circle, mage, comparison</w:t>
+      </w:r>
+    </w:p>
+    <w:p>
+      <w:pPr>
+        <w:pStyle w:val="Heading2"/>
+      </w:pPr>
+      <w:r>
+        <w:t>The Rarity of Generals</w:t>
+      </w:r>
+    </w:p>
+    <w:p>
+      <w:r>
+        <w:t>Why a general is a rare sight</w:t>
+      </w:r>
+    </w:p>
+    <w:p>
+      <w:r>
+        <w:t>The generals of the Angel and Demon Realms — the Six Pillars of Angels and the demon generals of the Demon army — are so few, and so elevated, that most people go their whole lives without ever seeing one. To the ordinary angel or demon, catching sight of a general is like a common citizen glimpsing the ruler of a country: a moment of awe, of stillness, of wanting to be near the power without ever daring to be in its way. It is not merely rank that sets them apart, but distance — they are the apex of realms whose populations number in the tens or hundreds of thousands, and they are seen only in war, in council, or in legend. When one appears, the crowd remembers it for the rest of their lives.</w:t>
+      </w:r>
+    </w:p>
+    <w:p>
+      <w:r>
+        <w:t>Angel generals: The Six Pillars of Angels — Ordium, Cyrion, Serathiel, Liora Veyne, Thalor Elwin, Aranweis.</w:t>
+      </w:r>
+    </w:p>
+    <w:p>
+      <w:r>
+        <w:t>Demon generals: The demon generals — Lisa (formerly), Licent Varak, Laren Vornath, Sythra Kaelis, Nyra Thessan, Isella Marrek.</w:t>
+      </w:r>
+    </w:p>
+    <w:p>
+      <w:r>
+        <w:t>Effect: Seeing one is like glimpsing a head of state — a rare, awe-struck moment most people never experience.</w:t>
+      </w:r>
+    </w:p>
+    <w:p>
+      <w:r>
+        <w:t>Tags: general, pillar, rare, awe, rank</w:t>
       </w:r>
     </w:p>
     <w:p>

</xml_diff>

<commit_message>
Generals: add nuance that a few take occasional quiet strolls among the people
</commit_message>
<xml_diff>
--- a/Half_made world ideas.docx
+++ b/Half_made world ideas.docx
@@ -4142,7 +4142,7 @@
     </w:p>
     <w:p>
       <w:r>
-        <w:t>The generals of the Angel and Demon Realms — the Six Pillars of Angels and the demon generals of the Demon army — are so few, and so elevated, that most people go their whole lives without ever seeing one. To the ordinary angel or demon, catching sight of a general is like a common citizen glimpsing the ruler of a country: a moment of awe, of stillness, of wanting to be near the power without ever daring to be in its way. It is not merely rank that sets them apart, but distance — they are the apex of realms whose populations number in the tens or hundreds of thousands, and they are seen only in war, in council, or in legend. When one appears, the crowd remembers it for the rest of their lives.</w:t>
+        <w:t>The generals of the Angel and Demon Realms — the Six Pillars of Angels and the demon generals of the Demon army — are so few, and so elevated, that most people go their whole lives without ever seeing one. To the ordinary angel or demon, catching sight of a general is like a common citizen glimpsing the ruler of a country: a moment of awe, of stillness, of wanting to be near the power without ever daring to be in its way. It is not merely rank that sets them apart, but distance — they are the apex of realms whose populations number in the tens or hundreds of thousands, and they are seen only in war, in council, or in legend. When one appears, the crowd remembers it for the rest of their lives. Yet not every general is a hermit. A few of them — never most, and never often — take little strolls through their realm, walking among the people who would never otherwise see them. Those walks are quiet, unannounced, and rare; the people who glimpse them remember it for the rest of their lives too.</w:t>
       </w:r>
     </w:p>
     <w:p>
@@ -4158,6 +4158,11 @@
     <w:p>
       <w:r>
         <w:t>Effect: Seeing one is like glimpsing a head of state — a rare, awe-struck moment most people never experience.</w:t>
+      </w:r>
+    </w:p>
+    <w:p>
+      <w:r>
+        <w:t>Strolls: A few generals — never most, never often — take quiet, unannounced strolls through their realm.</w:t>
       </w:r>
     </w:p>
     <w:p>

</xml_diff>

<commit_message>
Character update: align Clint Ashborn (char + plot) and Aurelion with promise-based vow (no more vow-as-hierarchy framing)
</commit_message>
<xml_diff>
--- a/Half_made world ideas.docx
+++ b/Half_made world ideas.docx
@@ -445,7 +445,7 @@
     </w:p>
     <w:p>
       <w:r>
-        <w:t>The ruling kingdom of the Angel Realm, seat of the Serapharch Clint Ashborn. Built around the throne, it is home to the angelic hierarchy at its purest — the Six Pillars, the Veyn Vow, and the ranks held in order. Its population numbers only in the tens of thousands, small enough to be governed perfectly.</w:t>
+        <w:t>The ruling kingdom of the Angel Realm, seat of the Serapharch Clint Ashborn. Built around the throne, it is home to the angels’ promises at their purest — the Six Pillars, the Veyn Vows, and the ranks kept by sworn word. Its population numbers only in the tens of thousands, small enough to be governed perfectly.</w:t>
       </w:r>
     </w:p>
     <w:p>
@@ -12589,7 +12589,7 @@
     </w:p>
     <w:p>
       <w:r>
-        <w:t>Clint Ashborn has ruled the Angel Realm so long the realm has forgotten there was ever another way. He ordered his own right-hand man, Ordium, executed for loving a demon and fathering the hybrid child — and to Clint that was not cruelty but necessity, the one clean cut that kept chaos from the door. He believes the Veyn Vow and the hierarchy are the only things standing between order and the collapse of everything, and he administers that belief with the serenity of a man who has never once doubted he was saving the world. He knows the buried truth of the world core’s will, and it frightens him more than any demon, because a will greater than the angelic order would mean the order he has upheld his whole existence is not the highest thing there is. Every impossible thing Jaiden Marlock is, is a refutation of Clint’s entire life — which is what makes him so dangerous an enemy: he is not wrong that the hybrid threatens the world’s balance, only wrong about what to do with it.</w:t>
+        <w:t>Clint Ashborn has ruled the Angel Realm so long the realm has forgotten there was ever another way. He ordered his own right-hand man, Ordium, executed for loving a demon and fathering the hybrid child — and to Clint that was not cruelty but necessity, the one clean cut that kept chaos from the door. He believes the angels’ promises — the Veyn Vows each of them swore — and the order those promises uphold are the only things standing between peace and the collapse of everything, and he administers that belief with the serenity of a man who has never once doubted he was saving the world. He knows the buried truth of the world core’s will, and it frightens him more than any demon, because a will greater than the angelic order would mean the order he has upheld his whole existence is not the highest thing there is. Every impossible thing Jaiden Marlock is, is a refutation of Clint’s entire life — which is what makes him so dangerous an enemy: he is not wrong that the hybrid threatens the world’s balance, only wrong about what to do with it.</w:t>
       </w:r>
     </w:p>
     <w:p>
@@ -13904,7 +13904,7 @@
     </w:p>
     <w:p>
       <w:r>
-        <w:t>Clint Ashborn has ruled the Angel Realm so long the realm has forgotten there was ever another way. He ordered his own right-hand man, Ordium, executed for loving a demon and fathering the hybrid child, and he calls it mercy — the one clean cut that kept chaos from the door. He believes the Veyn Vow and the hierarchy are the only things standing between order and the collapse of everything. But every impossible thing Jaiden Marlock is, is a refutation of Clint’s entire life, and as the hybrid grows, Clint is set on a collision course with the child he tried to prevent — an enemy he cannot dismiss, because he is not wrong that the hybrid threatens the world’s balance, only wrong about what to do with it.</w:t>
+        <w:t>Clint Ashborn has ruled the Angel Realm so long the realm has forgotten there was ever another way. He ordered his own right-hand man, Ordium, executed for loving a demon and fathering the hybrid child, and he calls it mercy — the one clean cut that kept chaos from the door. He believes the angels’ promises — the Veyn Vows each of them swore — and the order those promises uphold are the only things standing between peace and the collapse of everything. But every impossible thing Jaiden Marlock is, is a refutation of Clint’s entire life, and as the hybrid grows, Clint is set on a collision course with the child he tried to prevent — an enemy he cannot dismiss, because he is not wrong that the hybrid threatens the world’s balance, only wrong about what to do with it.</w:t>
       </w:r>
     </w:p>
     <w:p>

</xml_diff>

<commit_message>
Add cross-class skill difficulty: humans stick to what the altar gave them (Class Skill Limits + new note)
</commit_message>
<xml_diff>
--- a/Half_made world ideas.docx
+++ b/Half_made world ideas.docx
@@ -3372,7 +3372,12 @@
     </w:p>
     <w:p>
       <w:r>
-        <w:t>All races can use skills of their chosen class, but since the Angel and Demon realms have innate skills already, the max skills they can learn from their class is 5, while humans can learn all the skills of that class.</w:t>
+        <w:t>All races can use skills of their chosen class, but since the Angel and Demon realms have innate skills already, the max skills they can learn from their class is 5, while humans can learn all the skills of that class. Learning a skill from a class other than your own, however, is another matter: it is extremely difficult for humans to do, so hard that most never manage it, and they stick to what the altar gave them.</w:t>
+      </w:r>
+    </w:p>
+    <w:p>
+      <w:r>
+        <w:t>Cross-class: Learning skills from a class other than your own is extremely difficult for humans — most never manage it and stick to what the altar gave them.</w:t>
       </w:r>
     </w:p>
     <w:p>
@@ -4168,6 +4173,39 @@
     <w:p>
       <w:r>
         <w:t>Tags: general, pillar, rare, awe, rank</w:t>
+      </w:r>
+    </w:p>
+    <w:p>
+      <w:pPr>
+        <w:pStyle w:val="Heading2"/>
+      </w:pPr>
+      <w:r>
+        <w:t>Cross-Class Skills</w:t>
+      </w:r>
+    </w:p>
+    <w:p>
+      <w:r>
+        <w:t>Why most people stick to what the altar gave them</w:t>
+      </w:r>
+    </w:p>
+    <w:p>
+      <w:r>
+        <w:t>Every awakened person is assigned one class at the Sundering Altar, and that class is where their path begins. Humans, unlike angels and demons, can in theory learn the skills of any class — but in the world as it is, learning a skill outside your own class is extremely difficult. The body’s Veyn is shaped to its class at awakening, and forcing it to learn a foreign discipline is slow, painful, and usually fails. Most humans who try give up. So in this era of the world, people stick to what the altar gave them — not because they are forbidden to reach for more, but because the effort is rarely worth it.</w:t>
+      </w:r>
+    </w:p>
+    <w:p>
+      <w:r>
+        <w:t>The fact: Humans find it difficult to learn skills from classes other than their own, so they stick to the class the altar assigned them.</w:t>
+      </w:r>
+    </w:p>
+    <w:p>
+      <w:r>
+        <w:t>Why: The body’s Veyn is shaped to its class at awakening; forcing a foreign discipline is slow, painful, and usually fails.</w:t>
+      </w:r>
+    </w:p>
+    <w:p>
+      <w:r>
+        <w:t>Tags: class, skills, altar, human, cross-class</w:t>
       </w:r>
     </w:p>
     <w:p>

</xml_diff>